<commit_message>
Fill Chapter 2 company profile from BRI's official website and 2025 sustainability report.
Co-authored-by: Cursor <cursoragent@cursor.com>
</commit_message>
<xml_diff>
--- a/DRAFT Internship Report.docx
+++ b/DRAFT Internship Report.docx
@@ -447,21 +447,3847 @@
     </w:p>
     <w:p>
       <w:pPr>
-        <w:spacing w:line="360" w:lineRule="auto"/>
-        <w:rPr>
-          <w:b w:val="1"/>
-          <w:sz w:val="24"/>
-          <w:szCs w:val="24"/>
-        </w:rPr>
-      </w:pPr>
-      <w:r>
-        <w:rPr>
-          <w:b w:val="1"/>
-          <w:sz w:val="24"/>
-          <w:szCs w:val="24"/>
-          <w:rtl w:val="0"/>
-        </w:rPr>
-        <w:t xml:space="preserve">[Including type of business, company vision and mission, company history, organizational structure, and other related information]</w:t>
+        <w:spacing w:before="0" w:after="120" w:line="360" w:lineRule="auto"/>
+        <w:jc w:val="both"/>
+      </w:pPr>
+      <w:r>
+        <w:rPr>
+          <w:sz w:val="24"/>
+          <w:szCs w:val="24"/>
+        </w:rPr>
+        <w:t xml:space="preserve">This chapter describes PT Bank Rakyat Indonesia (Persero) Tbk (BRI), the company where the internship took place. It covers the company's business, vision and values, history, organizational structure, and the regional office where the internship was carried out. The information is taken from BRI's official website (bri.co.id) and from the BRI 2025 Sustainability Report published there.</w:t>
+      </w:r>
+    </w:p>
+    <w:p>
+      <w:pPr>
+        <w:keepNext w:val="1"/>
+        <w:spacing w:before="240" w:after="120" w:line="360" w:lineRule="auto"/>
+        <w:jc w:val="left"/>
+      </w:pPr>
+      <w:r>
+        <w:rPr>
+          <w:b w:val="1"/>
+          <w:sz w:val="24"/>
+          <w:szCs w:val="24"/>
+        </w:rPr>
+        <w:t xml:space="preserve">2.1 Company Overview</w:t>
+      </w:r>
+    </w:p>
+    <w:p>
+      <w:pPr>
+        <w:spacing w:before="0" w:after="120" w:line="360" w:lineRule="auto"/>
+        <w:jc w:val="both"/>
+      </w:pPr>
+      <w:r>
+        <w:rPr>
+          <w:sz w:val="24"/>
+          <w:szCs w:val="24"/>
+        </w:rPr>
+        <w:t xml:space="preserve">Bank Rakyat Indonesia (BRI) is a state-owned bank and one of the largest banks in Indonesia. It was established on 16 December 1895 in Purwokerto, Central Java, by Raden Bei Aria Wirjaatmadja, and has served customers for more than 130 years. BRI is registered with and supervised by the Financial Services Authority (Otoritas Jasa Keuangan, OJK) and is a participant in the Indonesia Deposit Insurance Corporation (Lembaga Penjamin Simpanan, LPS) guarantee scheme. Its corporate tagline is "Melayani Dengan Setulus Hati" (serving with sincerity). Table 2.1 summarises the company's general information.</w:t>
+      </w:r>
+    </w:p>
+    <w:p>
+      <w:pPr>
+        <w:keepNext w:val="1"/>
+        <w:spacing w:before="120" w:after="60" w:line="240" w:lineRule="auto"/>
+        <w:jc w:val="center"/>
+      </w:pPr>
+      <w:r>
+        <w:rPr>
+          <w:b w:val="1"/>
+          <w:sz w:val="20"/>
+          <w:szCs w:val="20"/>
+        </w:rPr>
+        <w:t xml:space="preserve">Table 2.1 General information of BRI</w:t>
+      </w:r>
+    </w:p>
+    <w:tbl>
+      <w:tblPr>
+        <w:tblW w:w="9026" w:type="dxa"/>
+        <w:tblBorders>
+          <w:top w:val="single" w:sz="4" w:space="0" w:color="808080"/>
+          <w:left w:val="single" w:sz="4" w:space="0" w:color="808080"/>
+          <w:bottom w:val="single" w:sz="4" w:space="0" w:color="808080"/>
+          <w:right w:val="single" w:sz="4" w:space="0" w:color="808080"/>
+          <w:insideH w:val="single" w:sz="4" w:space="0" w:color="808080"/>
+          <w:insideV w:val="single" w:sz="4" w:space="0" w:color="808080"/>
+        </w:tblBorders>
+        <w:tblLayout w:type="fixed"/>
+        <w:tblCellMar>
+          <w:top w:w="40" w:type="dxa"/>
+          <w:left w:w="100" w:type="dxa"/>
+          <w:bottom w:w="40" w:type="dxa"/>
+          <w:right w:w="100" w:type="dxa"/>
+        </w:tblCellMar>
+      </w:tblPr>
+      <w:tblGrid>
+        <w:gridCol w:w="2400"/>
+        <w:gridCol w:w="6626"/>
+      </w:tblGrid>
+      <w:tr>
+        <w:trPr>
+          <w:tblHeader w:val="1"/>
+        </w:trPr>
+        <w:tc>
+          <w:tcPr>
+            <w:tcW w:w="2400" w:type="dxa"/>
+            <w:shd w:val="clear" w:color="auto" w:fill="D9D9D9"/>
+            <w:vAlign w:val="top"/>
+          </w:tcPr>
+          <w:p>
+            <w:pPr>
+              <w:spacing w:before="0" w:after="0" w:line="240" w:lineRule="auto"/>
+              <w:jc w:val="left"/>
+            </w:pPr>
+            <w:r>
+              <w:rPr>
+                <w:b w:val="1"/>
+                <w:sz w:val="20"/>
+                <w:szCs w:val="20"/>
+              </w:rPr>
+              <w:t xml:space="preserve">Item</w:t>
+            </w:r>
+          </w:p>
+        </w:tc>
+        <w:tc>
+          <w:tcPr>
+            <w:tcW w:w="6626" w:type="dxa"/>
+            <w:shd w:val="clear" w:color="auto" w:fill="D9D9D9"/>
+            <w:vAlign w:val="top"/>
+          </w:tcPr>
+          <w:p>
+            <w:pPr>
+              <w:spacing w:before="0" w:after="0" w:line="240" w:lineRule="auto"/>
+              <w:jc w:val="left"/>
+            </w:pPr>
+            <w:r>
+              <w:rPr>
+                <w:b w:val="1"/>
+                <w:sz w:val="20"/>
+                <w:szCs w:val="20"/>
+              </w:rPr>
+              <w:t xml:space="preserve">Description</w:t>
+            </w:r>
+          </w:p>
+        </w:tc>
+      </w:tr>
+      <w:tr>
+        <w:tc>
+          <w:tcPr>
+            <w:tcW w:w="2400" w:type="dxa"/>
+            <w:vAlign w:val="top"/>
+          </w:tcPr>
+          <w:p>
+            <w:pPr>
+              <w:spacing w:before="0" w:after="0" w:line="240" w:lineRule="auto"/>
+              <w:jc w:val="left"/>
+            </w:pPr>
+            <w:r>
+              <w:rPr>
+                <w:sz w:val="20"/>
+                <w:szCs w:val="20"/>
+              </w:rPr>
+              <w:t xml:space="preserve">Company name</w:t>
+            </w:r>
+          </w:p>
+        </w:tc>
+        <w:tc>
+          <w:tcPr>
+            <w:tcW w:w="6626" w:type="dxa"/>
+            <w:vAlign w:val="top"/>
+          </w:tcPr>
+          <w:p>
+            <w:pPr>
+              <w:spacing w:before="0" w:after="0" w:line="240" w:lineRule="auto"/>
+              <w:jc w:val="left"/>
+            </w:pPr>
+            <w:r>
+              <w:rPr>
+                <w:sz w:val="20"/>
+                <w:szCs w:val="20"/>
+              </w:rPr>
+              <w:t xml:space="preserve">PT Bank Rakyat Indonesia (Persero) Tbk</w:t>
+            </w:r>
+          </w:p>
+        </w:tc>
+      </w:tr>
+      <w:tr>
+        <w:tc>
+          <w:tcPr>
+            <w:tcW w:w="2400" w:type="dxa"/>
+            <w:vAlign w:val="top"/>
+          </w:tcPr>
+          <w:p>
+            <w:pPr>
+              <w:spacing w:before="0" w:after="0" w:line="240" w:lineRule="auto"/>
+              <w:jc w:val="left"/>
+            </w:pPr>
+            <w:r>
+              <w:rPr>
+                <w:sz w:val="20"/>
+                <w:szCs w:val="20"/>
+              </w:rPr>
+              <w:t xml:space="preserve">Legal entity</w:t>
+            </w:r>
+          </w:p>
+        </w:tc>
+        <w:tc>
+          <w:tcPr>
+            <w:tcW w:w="6626" w:type="dxa"/>
+            <w:vAlign w:val="top"/>
+          </w:tcPr>
+          <w:p>
+            <w:pPr>
+              <w:spacing w:before="0" w:after="0" w:line="240" w:lineRule="auto"/>
+              <w:jc w:val="left"/>
+            </w:pPr>
+            <w:r>
+              <w:rPr>
+                <w:sz w:val="20"/>
+                <w:szCs w:val="20"/>
+              </w:rPr>
+              <w:t xml:space="preserve">Limited liability company, publicly listed</w:t>
+            </w:r>
+          </w:p>
+        </w:tc>
+      </w:tr>
+      <w:tr>
+        <w:tc>
+          <w:tcPr>
+            <w:tcW w:w="2400" w:type="dxa"/>
+            <w:vAlign w:val="top"/>
+          </w:tcPr>
+          <w:p>
+            <w:pPr>
+              <w:spacing w:before="0" w:after="0" w:line="240" w:lineRule="auto"/>
+              <w:jc w:val="left"/>
+            </w:pPr>
+            <w:r>
+              <w:rPr>
+                <w:sz w:val="20"/>
+                <w:szCs w:val="20"/>
+              </w:rPr>
+              <w:t xml:space="preserve">Founded</w:t>
+            </w:r>
+          </w:p>
+        </w:tc>
+        <w:tc>
+          <w:tcPr>
+            <w:tcW w:w="6626" w:type="dxa"/>
+            <w:vAlign w:val="top"/>
+          </w:tcPr>
+          <w:p>
+            <w:pPr>
+              <w:spacing w:before="0" w:after="0" w:line="240" w:lineRule="auto"/>
+              <w:jc w:val="left"/>
+            </w:pPr>
+            <w:r>
+              <w:rPr>
+                <w:sz w:val="20"/>
+                <w:szCs w:val="20"/>
+              </w:rPr>
+              <w:t xml:space="preserve">16 December 1895, Purwokerto, Central Java</w:t>
+            </w:r>
+          </w:p>
+        </w:tc>
+      </w:tr>
+      <w:tr>
+        <w:tc>
+          <w:tcPr>
+            <w:tcW w:w="2400" w:type="dxa"/>
+            <w:vAlign w:val="top"/>
+          </w:tcPr>
+          <w:p>
+            <w:pPr>
+              <w:spacing w:before="0" w:after="0" w:line="240" w:lineRule="auto"/>
+              <w:jc w:val="left"/>
+            </w:pPr>
+            <w:r>
+              <w:rPr>
+                <w:sz w:val="20"/>
+                <w:szCs w:val="20"/>
+              </w:rPr>
+              <w:t xml:space="preserve">Head office</w:t>
+            </w:r>
+          </w:p>
+        </w:tc>
+        <w:tc>
+          <w:tcPr>
+            <w:tcW w:w="6626" w:type="dxa"/>
+            <w:vAlign w:val="top"/>
+          </w:tcPr>
+          <w:p>
+            <w:pPr>
+              <w:spacing w:before="0" w:after="0" w:line="240" w:lineRule="auto"/>
+              <w:jc w:val="left"/>
+            </w:pPr>
+            <w:r>
+              <w:rPr>
+                <w:sz w:val="20"/>
+                <w:szCs w:val="20"/>
+              </w:rPr>
+              <w:t xml:space="preserve">BRI Building I, Jl. Jenderal Sudirman Kav. 44-46, Jakarta 10210</w:t>
+            </w:r>
+          </w:p>
+        </w:tc>
+      </w:tr>
+      <w:tr>
+        <w:tc>
+          <w:tcPr>
+            <w:tcW w:w="2400" w:type="dxa"/>
+            <w:vAlign w:val="top"/>
+          </w:tcPr>
+          <w:p>
+            <w:pPr>
+              <w:spacing w:before="0" w:after="0" w:line="240" w:lineRule="auto"/>
+              <w:jc w:val="left"/>
+            </w:pPr>
+            <w:r>
+              <w:rPr>
+                <w:sz w:val="20"/>
+                <w:szCs w:val="20"/>
+              </w:rPr>
+              <w:t xml:space="preserve">Employees</w:t>
+            </w:r>
+          </w:p>
+        </w:tc>
+        <w:tc>
+          <w:tcPr>
+            <w:tcW w:w="6626" w:type="dxa"/>
+            <w:vAlign w:val="top"/>
+          </w:tcPr>
+          <w:p>
+            <w:pPr>
+              <w:spacing w:before="0" w:after="0" w:line="240" w:lineRule="auto"/>
+              <w:jc w:val="left"/>
+            </w:pPr>
+            <w:r>
+              <w:rPr>
+                <w:sz w:val="20"/>
+                <w:szCs w:val="20"/>
+              </w:rPr>
+              <w:t xml:space="preserve">84,949 (end of 2025)</w:t>
+            </w:r>
+          </w:p>
+        </w:tc>
+      </w:tr>
+      <w:tr>
+        <w:tc>
+          <w:tcPr>
+            <w:tcW w:w="2400" w:type="dxa"/>
+            <w:vAlign w:val="top"/>
+          </w:tcPr>
+          <w:p>
+            <w:pPr>
+              <w:spacing w:before="0" w:after="0" w:line="240" w:lineRule="auto"/>
+              <w:jc w:val="left"/>
+            </w:pPr>
+            <w:r>
+              <w:rPr>
+                <w:sz w:val="20"/>
+                <w:szCs w:val="20"/>
+              </w:rPr>
+              <w:t xml:space="preserve">Total assets</w:t>
+            </w:r>
+          </w:p>
+        </w:tc>
+        <w:tc>
+          <w:tcPr>
+            <w:tcW w:w="6626" w:type="dxa"/>
+            <w:vAlign w:val="top"/>
+          </w:tcPr>
+          <w:p>
+            <w:pPr>
+              <w:spacing w:before="0" w:after="0" w:line="240" w:lineRule="auto"/>
+              <w:jc w:val="left"/>
+            </w:pPr>
+            <w:r>
+              <w:rPr>
+                <w:sz w:val="20"/>
+                <w:szCs w:val="20"/>
+              </w:rPr>
+              <w:t xml:space="preserve">IDR 1,931.54 trillion (bank only, 31 December 2025)</w:t>
+            </w:r>
+          </w:p>
+        </w:tc>
+      </w:tr>
+      <w:tr>
+        <w:tc>
+          <w:tcPr>
+            <w:tcW w:w="2400" w:type="dxa"/>
+            <w:vAlign w:val="top"/>
+          </w:tcPr>
+          <w:p>
+            <w:pPr>
+              <w:spacing w:before="0" w:after="0" w:line="240" w:lineRule="auto"/>
+              <w:jc w:val="left"/>
+            </w:pPr>
+            <w:r>
+              <w:rPr>
+                <w:sz w:val="20"/>
+                <w:szCs w:val="20"/>
+              </w:rPr>
+              <w:t xml:space="preserve">Shareholders</w:t>
+            </w:r>
+          </w:p>
+        </w:tc>
+        <w:tc>
+          <w:tcPr>
+            <w:tcW w:w="6626" w:type="dxa"/>
+            <w:vAlign w:val="top"/>
+          </w:tcPr>
+          <w:p>
+            <w:pPr>
+              <w:spacing w:before="0" w:after="0" w:line="240" w:lineRule="auto"/>
+              <w:jc w:val="left"/>
+            </w:pPr>
+            <w:r>
+              <w:rPr>
+                <w:sz w:val="20"/>
+                <w:szCs w:val="20"/>
+              </w:rPr>
+              <w:t xml:space="preserve">PT Danantara Asset Management (Persero) 53.19%; public 46.81%; the Government of Indonesia holds one Series A Dwiwarna share</w:t>
+            </w:r>
+          </w:p>
+        </w:tc>
+      </w:tr>
+      <w:tr>
+        <w:tc>
+          <w:tcPr>
+            <w:tcW w:w="2400" w:type="dxa"/>
+            <w:vAlign w:val="top"/>
+          </w:tcPr>
+          <w:p>
+            <w:pPr>
+              <w:spacing w:before="0" w:after="0" w:line="240" w:lineRule="auto"/>
+              <w:jc w:val="left"/>
+            </w:pPr>
+            <w:r>
+              <w:rPr>
+                <w:sz w:val="20"/>
+                <w:szCs w:val="20"/>
+              </w:rPr>
+              <w:t xml:space="preserve">Website</w:t>
+            </w:r>
+          </w:p>
+        </w:tc>
+        <w:tc>
+          <w:tcPr>
+            <w:tcW w:w="6626" w:type="dxa"/>
+            <w:vAlign w:val="top"/>
+          </w:tcPr>
+          <w:p>
+            <w:pPr>
+              <w:spacing w:before="0" w:after="0" w:line="240" w:lineRule="auto"/>
+              <w:jc w:val="left"/>
+            </w:pPr>
+            <w:r>
+              <w:rPr>
+                <w:sz w:val="20"/>
+                <w:szCs w:val="20"/>
+              </w:rPr>
+              <w:t xml:space="preserve">https://bri.co.id</w:t>
+            </w:r>
+          </w:p>
+        </w:tc>
+      </w:tr>
+    </w:tbl>
+    <w:p>
+      <w:pPr>
+        <w:spacing w:before="0" w:after="60" w:line="240" w:lineRule="auto"/>
+        <w:jc w:val="both"/>
+      </w:pPr>
+    </w:p>
+    <w:p>
+      <w:pPr>
+        <w:keepNext w:val="1"/>
+        <w:spacing w:before="240" w:after="120" w:line="360" w:lineRule="auto"/>
+        <w:jc w:val="left"/>
+      </w:pPr>
+      <w:r>
+        <w:rPr>
+          <w:b w:val="1"/>
+          <w:sz w:val="24"/>
+          <w:szCs w:val="24"/>
+        </w:rPr>
+        <w:t xml:space="preserve">2.2 Type of Business</w:t>
+      </w:r>
+    </w:p>
+    <w:p>
+      <w:pPr>
+        <w:spacing w:before="0" w:after="120" w:line="360" w:lineRule="auto"/>
+        <w:jc w:val="both"/>
+      </w:pPr>
+      <w:r>
+        <w:rPr>
+          <w:sz w:val="24"/>
+          <w:szCs w:val="24"/>
+        </w:rPr>
+        <w:t xml:space="preserve">BRI is a commercial bank. It provides deposit-taking, lending, and other financial services to individuals, corporations, and micro, small, and medium enterprises (MSMEs), with a strategic focus on the MSME segment. Alongside its financial services, BRI runs training and advisory programmes that help MSMEs grow. Its main business areas are:</w:t>
+      </w:r>
+    </w:p>
+    <w:p>
+      <w:pPr>
+        <w:numPr>
+          <w:ilvl w:val="0"/>
+          <w:numId w:val="3"/>
+        </w:numPr>
+        <w:spacing w:before="0" w:after="60" w:line="360" w:lineRule="auto"/>
+        <w:jc w:val="both"/>
+      </w:pPr>
+      <w:r>
+        <w:rPr>
+          <w:sz w:val="24"/>
+          <w:szCs w:val="24"/>
+        </w:rPr>
+        <w:t xml:space="preserve">Individual banking: savings, time deposits, giro (current) accounts, home loans (KPR), vehicle loans (KKB), salary-based loans (BRIguna), credit cards, and the BRIZZI electronic money card.</w:t>
+      </w:r>
+    </w:p>
+    <w:p>
+      <w:pPr>
+        <w:numPr>
+          <w:ilvl w:val="0"/>
+          <w:numId w:val="3"/>
+        </w:numPr>
+        <w:spacing w:before="0" w:after="60" w:line="360" w:lineRule="auto"/>
+        <w:jc w:val="both"/>
+      </w:pPr>
+      <w:r>
+        <w:rPr>
+          <w:sz w:val="24"/>
+          <w:szCs w:val="24"/>
+        </w:rPr>
+        <w:t xml:space="preserve">MSME banking: micro and small business loans such as KUPEDES, supported by the micro-segment ecosystem the bank shares with its subsidiaries Pegadaian and PNM under the Ultra Micro (UMi) Holding.</w:t>
+      </w:r>
+    </w:p>
+    <w:p>
+      <w:pPr>
+        <w:numPr>
+          <w:ilvl w:val="0"/>
+          <w:numId w:val="3"/>
+        </w:numPr>
+        <w:spacing w:before="0" w:after="60" w:line="360" w:lineRule="auto"/>
+        <w:jc w:val="both"/>
+      </w:pPr>
+      <w:r>
+        <w:rPr>
+          <w:sz w:val="24"/>
+          <w:szCs w:val="24"/>
+        </w:rPr>
+        <w:t xml:space="preserve">Corporate and commercial banking: financing, cash management, and transaction services for businesses, including the QLola corporate banking platform.</w:t>
+      </w:r>
+    </w:p>
+    <w:p>
+      <w:pPr>
+        <w:numPr>
+          <w:ilvl w:val="0"/>
+          <w:numId w:val="3"/>
+        </w:numPr>
+        <w:spacing w:before="0" w:after="60" w:line="360" w:lineRule="auto"/>
+        <w:jc w:val="both"/>
+      </w:pPr>
+      <w:r>
+        <w:rPr>
+          <w:sz w:val="24"/>
+          <w:szCs w:val="24"/>
+        </w:rPr>
+        <w:t xml:space="preserve">Wealth management, treasury, and international banking services.</w:t>
+      </w:r>
+    </w:p>
+    <w:p>
+      <w:pPr>
+        <w:numPr>
+          <w:ilvl w:val="0"/>
+          <w:numId w:val="3"/>
+        </w:numPr>
+        <w:spacing w:before="0" w:after="60" w:line="360" w:lineRule="auto"/>
+        <w:jc w:val="both"/>
+      </w:pPr>
+      <w:r>
+        <w:rPr>
+          <w:sz w:val="24"/>
+          <w:szCs w:val="24"/>
+        </w:rPr>
+        <w:t xml:space="preserve">Digital banking: the BRImo mobile banking application and internet banking.</w:t>
+      </w:r>
+    </w:p>
+    <w:p>
+      <w:pPr>
+        <w:spacing w:before="0" w:after="120" w:line="360" w:lineRule="auto"/>
+        <w:jc w:val="both"/>
+      </w:pPr>
+      <w:r>
+        <w:rPr>
+          <w:sz w:val="24"/>
+          <w:szCs w:val="24"/>
+        </w:rPr>
+        <w:t xml:space="preserve">BRI has one of the widest service networks in Indonesia: 7,377 operational work units, 627,679 e-channels, and 1,193,835 BRILink agents (individual agents who provide basic banking services in their communities). It also operates six overseas networks, in the Cayman Islands, New York, Hong Kong, Taiwan, Singapore, and Timor Leste. Table 2.2 shows the domestic office network by region.</w:t>
+      </w:r>
+    </w:p>
+    <w:p>
+      <w:pPr>
+        <w:keepNext w:val="1"/>
+        <w:spacing w:before="120" w:after="60" w:line="240" w:lineRule="auto"/>
+        <w:jc w:val="center"/>
+      </w:pPr>
+      <w:r>
+        <w:rPr>
+          <w:b w:val="1"/>
+          <w:sz w:val="20"/>
+          <w:szCs w:val="20"/>
+        </w:rPr>
+        <w:t xml:space="preserve">Table 2.2 BRI domestic office network by region (2025)</w:t>
+      </w:r>
+    </w:p>
+    <w:tbl>
+      <w:tblPr>
+        <w:tblW w:w="9026" w:type="dxa"/>
+        <w:tblBorders>
+          <w:top w:val="single" w:sz="4" w:space="0" w:color="808080"/>
+          <w:left w:val="single" w:sz="4" w:space="0" w:color="808080"/>
+          <w:bottom w:val="single" w:sz="4" w:space="0" w:color="808080"/>
+          <w:right w:val="single" w:sz="4" w:space="0" w:color="808080"/>
+          <w:insideH w:val="single" w:sz="4" w:space="0" w:color="808080"/>
+          <w:insideV w:val="single" w:sz="4" w:space="0" w:color="808080"/>
+        </w:tblBorders>
+        <w:tblLayout w:type="fixed"/>
+        <w:tblCellMar>
+          <w:top w:w="40" w:type="dxa"/>
+          <w:left w:w="100" w:type="dxa"/>
+          <w:bottom w:w="40" w:type="dxa"/>
+          <w:right w:w="100" w:type="dxa"/>
+        </w:tblCellMar>
+      </w:tblPr>
+      <w:tblGrid>
+        <w:gridCol w:w="2026"/>
+        <w:gridCol w:w="1400"/>
+        <w:gridCol w:w="1400"/>
+        <w:gridCol w:w="1400"/>
+        <w:gridCol w:w="1400"/>
+        <w:gridCol w:w="1400"/>
+      </w:tblGrid>
+      <w:tr>
+        <w:trPr>
+          <w:tblHeader w:val="1"/>
+        </w:trPr>
+        <w:tc>
+          <w:tcPr>
+            <w:tcW w:w="2026" w:type="dxa"/>
+            <w:shd w:val="clear" w:color="auto" w:fill="D9D9D9"/>
+            <w:vAlign w:val="top"/>
+          </w:tcPr>
+          <w:p>
+            <w:pPr>
+              <w:spacing w:before="0" w:after="0" w:line="240" w:lineRule="auto"/>
+              <w:jc w:val="left"/>
+            </w:pPr>
+            <w:r>
+              <w:rPr>
+                <w:b w:val="1"/>
+                <w:sz w:val="20"/>
+                <w:szCs w:val="20"/>
+              </w:rPr>
+              <w:t xml:space="preserve">Region</w:t>
+            </w:r>
+          </w:p>
+        </w:tc>
+        <w:tc>
+          <w:tcPr>
+            <w:tcW w:w="1400" w:type="dxa"/>
+            <w:shd w:val="clear" w:color="auto" w:fill="D9D9D9"/>
+            <w:vAlign w:val="top"/>
+          </w:tcPr>
+          <w:p>
+            <w:pPr>
+              <w:spacing w:before="0" w:after="0" w:line="240" w:lineRule="auto"/>
+              <w:jc w:val="left"/>
+            </w:pPr>
+            <w:r>
+              <w:rPr>
+                <w:b w:val="1"/>
+                <w:sz w:val="20"/>
+                <w:szCs w:val="20"/>
+              </w:rPr>
+              <w:t xml:space="preserve">Regional Offices</w:t>
+            </w:r>
+          </w:p>
+        </w:tc>
+        <w:tc>
+          <w:tcPr>
+            <w:tcW w:w="1400" w:type="dxa"/>
+            <w:shd w:val="clear" w:color="auto" w:fill="D9D9D9"/>
+            <w:vAlign w:val="top"/>
+          </w:tcPr>
+          <w:p>
+            <w:pPr>
+              <w:spacing w:before="0" w:after="0" w:line="240" w:lineRule="auto"/>
+              <w:jc w:val="left"/>
+            </w:pPr>
+            <w:r>
+              <w:rPr>
+                <w:b w:val="1"/>
+                <w:sz w:val="20"/>
+                <w:szCs w:val="20"/>
+              </w:rPr>
+              <w:t xml:space="preserve">Branch Offices</w:t>
+            </w:r>
+          </w:p>
+        </w:tc>
+        <w:tc>
+          <w:tcPr>
+            <w:tcW w:w="1400" w:type="dxa"/>
+            <w:shd w:val="clear" w:color="auto" w:fill="D9D9D9"/>
+            <w:vAlign w:val="top"/>
+          </w:tcPr>
+          <w:p>
+            <w:pPr>
+              <w:spacing w:before="0" w:after="0" w:line="240" w:lineRule="auto"/>
+              <w:jc w:val="left"/>
+            </w:pPr>
+            <w:r>
+              <w:rPr>
+                <w:b w:val="1"/>
+                <w:sz w:val="20"/>
+                <w:szCs w:val="20"/>
+              </w:rPr>
+              <w:t xml:space="preserve">Sub-Branch Offices</w:t>
+            </w:r>
+          </w:p>
+        </w:tc>
+        <w:tc>
+          <w:tcPr>
+            <w:tcW w:w="1400" w:type="dxa"/>
+            <w:shd w:val="clear" w:color="auto" w:fill="D9D9D9"/>
+            <w:vAlign w:val="top"/>
+          </w:tcPr>
+          <w:p>
+            <w:pPr>
+              <w:spacing w:before="0" w:after="0" w:line="240" w:lineRule="auto"/>
+              <w:jc w:val="left"/>
+            </w:pPr>
+            <w:r>
+              <w:rPr>
+                <w:b w:val="1"/>
+                <w:sz w:val="20"/>
+                <w:szCs w:val="20"/>
+              </w:rPr>
+              <w:t xml:space="preserve">BRI Units</w:t>
+            </w:r>
+          </w:p>
+        </w:tc>
+        <w:tc>
+          <w:tcPr>
+            <w:tcW w:w="1400" w:type="dxa"/>
+            <w:shd w:val="clear" w:color="auto" w:fill="D9D9D9"/>
+            <w:vAlign w:val="top"/>
+          </w:tcPr>
+          <w:p>
+            <w:pPr>
+              <w:spacing w:before="0" w:after="0" w:line="240" w:lineRule="auto"/>
+              <w:jc w:val="left"/>
+            </w:pPr>
+            <w:r>
+              <w:rPr>
+                <w:b w:val="1"/>
+                <w:sz w:val="20"/>
+                <w:szCs w:val="20"/>
+              </w:rPr>
+              <w:t xml:space="preserve">BRILink Agents</w:t>
+            </w:r>
+          </w:p>
+        </w:tc>
+      </w:tr>
+      <w:tr>
+        <w:tc>
+          <w:tcPr>
+            <w:tcW w:w="2026" w:type="dxa"/>
+            <w:vAlign w:val="top"/>
+          </w:tcPr>
+          <w:p>
+            <w:pPr>
+              <w:spacing w:before="0" w:after="0" w:line="240" w:lineRule="auto"/>
+              <w:jc w:val="left"/>
+            </w:pPr>
+            <w:r>
+              <w:rPr>
+                <w:sz w:val="20"/>
+                <w:szCs w:val="20"/>
+              </w:rPr>
+              <w:t xml:space="preserve">Sumatera</w:t>
+            </w:r>
+          </w:p>
+        </w:tc>
+        <w:tc>
+          <w:tcPr>
+            <w:tcW w:w="1400" w:type="dxa"/>
+            <w:vAlign w:val="top"/>
+          </w:tcPr>
+          <w:p>
+            <w:pPr>
+              <w:spacing w:before="0" w:after="0" w:line="240" w:lineRule="auto"/>
+              <w:jc w:val="left"/>
+            </w:pPr>
+            <w:r>
+              <w:rPr>
+                <w:sz w:val="20"/>
+                <w:szCs w:val="20"/>
+              </w:rPr>
+              <w:t xml:space="preserve">5</w:t>
+            </w:r>
+          </w:p>
+        </w:tc>
+        <w:tc>
+          <w:tcPr>
+            <w:tcW w:w="1400" w:type="dxa"/>
+            <w:vAlign w:val="top"/>
+          </w:tcPr>
+          <w:p>
+            <w:pPr>
+              <w:spacing w:before="0" w:after="0" w:line="240" w:lineRule="auto"/>
+              <w:jc w:val="left"/>
+            </w:pPr>
+            <w:r>
+              <w:rPr>
+                <w:sz w:val="20"/>
+                <w:szCs w:val="20"/>
+              </w:rPr>
+              <w:t xml:space="preserve">95</w:t>
+            </w:r>
+          </w:p>
+        </w:tc>
+        <w:tc>
+          <w:tcPr>
+            <w:tcW w:w="1400" w:type="dxa"/>
+            <w:vAlign w:val="top"/>
+          </w:tcPr>
+          <w:p>
+            <w:pPr>
+              <w:spacing w:before="0" w:after="0" w:line="240" w:lineRule="auto"/>
+              <w:jc w:val="left"/>
+            </w:pPr>
+            <w:r>
+              <w:rPr>
+                <w:sz w:val="20"/>
+                <w:szCs w:val="20"/>
+              </w:rPr>
+              <w:t xml:space="preserve">105</w:t>
+            </w:r>
+          </w:p>
+        </w:tc>
+        <w:tc>
+          <w:tcPr>
+            <w:tcW w:w="1400" w:type="dxa"/>
+            <w:vAlign w:val="top"/>
+          </w:tcPr>
+          <w:p>
+            <w:pPr>
+              <w:spacing w:before="0" w:after="0" w:line="240" w:lineRule="auto"/>
+              <w:jc w:val="left"/>
+            </w:pPr>
+            <w:r>
+              <w:rPr>
+                <w:sz w:val="20"/>
+                <w:szCs w:val="20"/>
+              </w:rPr>
+              <w:t xml:space="preserve">990</w:t>
+            </w:r>
+          </w:p>
+        </w:tc>
+        <w:tc>
+          <w:tcPr>
+            <w:tcW w:w="1400" w:type="dxa"/>
+            <w:vAlign w:val="top"/>
+          </w:tcPr>
+          <w:p>
+            <w:pPr>
+              <w:spacing w:before="0" w:after="0" w:line="240" w:lineRule="auto"/>
+              <w:jc w:val="left"/>
+            </w:pPr>
+            <w:r>
+              <w:rPr>
+                <w:sz w:val="20"/>
+                <w:szCs w:val="20"/>
+              </w:rPr>
+              <w:t xml:space="preserve">273,100</w:t>
+            </w:r>
+          </w:p>
+        </w:tc>
+      </w:tr>
+      <w:tr>
+        <w:tc>
+          <w:tcPr>
+            <w:tcW w:w="2026" w:type="dxa"/>
+            <w:vAlign w:val="top"/>
+          </w:tcPr>
+          <w:p>
+            <w:pPr>
+              <w:spacing w:before="0" w:after="0" w:line="240" w:lineRule="auto"/>
+              <w:jc w:val="left"/>
+            </w:pPr>
+            <w:r>
+              <w:rPr>
+                <w:sz w:val="20"/>
+                <w:szCs w:val="20"/>
+              </w:rPr>
+              <w:t xml:space="preserve">Java</w:t>
+            </w:r>
+          </w:p>
+        </w:tc>
+        <w:tc>
+          <w:tcPr>
+            <w:tcW w:w="1400" w:type="dxa"/>
+            <w:vAlign w:val="top"/>
+          </w:tcPr>
+          <w:p>
+            <w:pPr>
+              <w:spacing w:before="0" w:after="0" w:line="240" w:lineRule="auto"/>
+              <w:jc w:val="left"/>
+            </w:pPr>
+            <w:r>
+              <w:rPr>
+                <w:sz w:val="20"/>
+                <w:szCs w:val="20"/>
+              </w:rPr>
+              <w:t xml:space="preserve">8</w:t>
+            </w:r>
+          </w:p>
+        </w:tc>
+        <w:tc>
+          <w:tcPr>
+            <w:tcW w:w="1400" w:type="dxa"/>
+            <w:vAlign w:val="top"/>
+          </w:tcPr>
+          <w:p>
+            <w:pPr>
+              <w:spacing w:before="0" w:after="0" w:line="240" w:lineRule="auto"/>
+              <w:jc w:val="left"/>
+            </w:pPr>
+            <w:r>
+              <w:rPr>
+                <w:sz w:val="20"/>
+                <w:szCs w:val="20"/>
+              </w:rPr>
+              <w:t xml:space="preserve">271</w:t>
+            </w:r>
+          </w:p>
+        </w:tc>
+        <w:tc>
+          <w:tcPr>
+            <w:tcW w:w="1400" w:type="dxa"/>
+            <w:vAlign w:val="top"/>
+          </w:tcPr>
+          <w:p>
+            <w:pPr>
+              <w:spacing w:before="0" w:after="0" w:line="240" w:lineRule="auto"/>
+              <w:jc w:val="left"/>
+            </w:pPr>
+            <w:r>
+              <w:rPr>
+                <w:sz w:val="20"/>
+                <w:szCs w:val="20"/>
+              </w:rPr>
+              <w:t xml:space="preserve">326</w:t>
+            </w:r>
+          </w:p>
+        </w:tc>
+        <w:tc>
+          <w:tcPr>
+            <w:tcW w:w="1400" w:type="dxa"/>
+            <w:vAlign w:val="top"/>
+          </w:tcPr>
+          <w:p>
+            <w:pPr>
+              <w:spacing w:before="0" w:after="0" w:line="240" w:lineRule="auto"/>
+              <w:jc w:val="left"/>
+            </w:pPr>
+            <w:r>
+              <w:rPr>
+                <w:sz w:val="20"/>
+                <w:szCs w:val="20"/>
+              </w:rPr>
+              <w:t xml:space="preserve">2,786</w:t>
+            </w:r>
+          </w:p>
+        </w:tc>
+        <w:tc>
+          <w:tcPr>
+            <w:tcW w:w="1400" w:type="dxa"/>
+            <w:vAlign w:val="top"/>
+          </w:tcPr>
+          <w:p>
+            <w:pPr>
+              <w:spacing w:before="0" w:after="0" w:line="240" w:lineRule="auto"/>
+              <w:jc w:val="left"/>
+            </w:pPr>
+            <w:r>
+              <w:rPr>
+                <w:sz w:val="20"/>
+                <w:szCs w:val="20"/>
+              </w:rPr>
+              <w:t xml:space="preserve">653,256</w:t>
+            </w:r>
+          </w:p>
+        </w:tc>
+      </w:tr>
+      <w:tr>
+        <w:tc>
+          <w:tcPr>
+            <w:tcW w:w="2026" w:type="dxa"/>
+            <w:vAlign w:val="top"/>
+          </w:tcPr>
+          <w:p>
+            <w:pPr>
+              <w:spacing w:before="0" w:after="0" w:line="240" w:lineRule="auto"/>
+              <w:jc w:val="left"/>
+            </w:pPr>
+            <w:r>
+              <w:rPr>
+                <w:sz w:val="20"/>
+                <w:szCs w:val="20"/>
+              </w:rPr>
+              <w:t xml:space="preserve">Kalimantan</w:t>
+            </w:r>
+          </w:p>
+        </w:tc>
+        <w:tc>
+          <w:tcPr>
+            <w:tcW w:w="1400" w:type="dxa"/>
+            <w:vAlign w:val="top"/>
+          </w:tcPr>
+          <w:p>
+            <w:pPr>
+              <w:spacing w:before="0" w:after="0" w:line="240" w:lineRule="auto"/>
+              <w:jc w:val="left"/>
+            </w:pPr>
+            <w:r>
+              <w:rPr>
+                <w:sz w:val="20"/>
+                <w:szCs w:val="20"/>
+              </w:rPr>
+              <w:t xml:space="preserve">1</w:t>
+            </w:r>
+          </w:p>
+        </w:tc>
+        <w:tc>
+          <w:tcPr>
+            <w:tcW w:w="1400" w:type="dxa"/>
+            <w:vAlign w:val="top"/>
+          </w:tcPr>
+          <w:p>
+            <w:pPr>
+              <w:spacing w:before="0" w:after="0" w:line="240" w:lineRule="auto"/>
+              <w:jc w:val="left"/>
+            </w:pPr>
+            <w:r>
+              <w:rPr>
+                <w:sz w:val="20"/>
+                <w:szCs w:val="20"/>
+              </w:rPr>
+              <w:t xml:space="preserve">40</w:t>
+            </w:r>
+          </w:p>
+        </w:tc>
+        <w:tc>
+          <w:tcPr>
+            <w:tcW w:w="1400" w:type="dxa"/>
+            <w:vAlign w:val="top"/>
+          </w:tcPr>
+          <w:p>
+            <w:pPr>
+              <w:spacing w:before="0" w:after="0" w:line="240" w:lineRule="auto"/>
+              <w:jc w:val="left"/>
+            </w:pPr>
+            <w:r>
+              <w:rPr>
+                <w:sz w:val="20"/>
+                <w:szCs w:val="20"/>
+              </w:rPr>
+              <w:t xml:space="preserve">42</w:t>
+            </w:r>
+          </w:p>
+        </w:tc>
+        <w:tc>
+          <w:tcPr>
+            <w:tcW w:w="1400" w:type="dxa"/>
+            <w:vAlign w:val="top"/>
+          </w:tcPr>
+          <w:p>
+            <w:pPr>
+              <w:spacing w:before="0" w:after="0" w:line="240" w:lineRule="auto"/>
+              <w:jc w:val="left"/>
+            </w:pPr>
+            <w:r>
+              <w:rPr>
+                <w:sz w:val="20"/>
+                <w:szCs w:val="20"/>
+              </w:rPr>
+              <w:t xml:space="preserve">372</w:t>
+            </w:r>
+          </w:p>
+        </w:tc>
+        <w:tc>
+          <w:tcPr>
+            <w:tcW w:w="1400" w:type="dxa"/>
+            <w:vAlign w:val="top"/>
+          </w:tcPr>
+          <w:p>
+            <w:pPr>
+              <w:spacing w:before="0" w:after="0" w:line="240" w:lineRule="auto"/>
+              <w:jc w:val="left"/>
+            </w:pPr>
+            <w:r>
+              <w:rPr>
+                <w:sz w:val="20"/>
+                <w:szCs w:val="20"/>
+              </w:rPr>
+              <w:t xml:space="preserve">75,220</w:t>
+            </w:r>
+          </w:p>
+        </w:tc>
+      </w:tr>
+      <w:tr>
+        <w:tc>
+          <w:tcPr>
+            <w:tcW w:w="2026" w:type="dxa"/>
+            <w:vAlign w:val="top"/>
+          </w:tcPr>
+          <w:p>
+            <w:pPr>
+              <w:spacing w:before="0" w:after="0" w:line="240" w:lineRule="auto"/>
+              <w:jc w:val="left"/>
+            </w:pPr>
+            <w:r>
+              <w:rPr>
+                <w:sz w:val="20"/>
+                <w:szCs w:val="20"/>
+              </w:rPr>
+              <w:t xml:space="preserve">Sulawesi &amp; Maluku</w:t>
+            </w:r>
+          </w:p>
+        </w:tc>
+        <w:tc>
+          <w:tcPr>
+            <w:tcW w:w="1400" w:type="dxa"/>
+            <w:vAlign w:val="top"/>
+          </w:tcPr>
+          <w:p>
+            <w:pPr>
+              <w:spacing w:before="0" w:after="0" w:line="240" w:lineRule="auto"/>
+              <w:jc w:val="left"/>
+            </w:pPr>
+            <w:r>
+              <w:rPr>
+                <w:sz w:val="20"/>
+                <w:szCs w:val="20"/>
+              </w:rPr>
+              <w:t xml:space="preserve">2</w:t>
+            </w:r>
+          </w:p>
+        </w:tc>
+        <w:tc>
+          <w:tcPr>
+            <w:tcW w:w="1400" w:type="dxa"/>
+            <w:vAlign w:val="top"/>
+          </w:tcPr>
+          <w:p>
+            <w:pPr>
+              <w:spacing w:before="0" w:after="0" w:line="240" w:lineRule="auto"/>
+              <w:jc w:val="left"/>
+            </w:pPr>
+            <w:r>
+              <w:rPr>
+                <w:sz w:val="20"/>
+                <w:szCs w:val="20"/>
+              </w:rPr>
+              <w:t xml:space="preserve">57</w:t>
+            </w:r>
+          </w:p>
+        </w:tc>
+        <w:tc>
+          <w:tcPr>
+            <w:tcW w:w="1400" w:type="dxa"/>
+            <w:vAlign w:val="top"/>
+          </w:tcPr>
+          <w:p>
+            <w:pPr>
+              <w:spacing w:before="0" w:after="0" w:line="240" w:lineRule="auto"/>
+              <w:jc w:val="left"/>
+            </w:pPr>
+            <w:r>
+              <w:rPr>
+                <w:sz w:val="20"/>
+                <w:szCs w:val="20"/>
+              </w:rPr>
+              <w:t xml:space="preserve">43</w:t>
+            </w:r>
+          </w:p>
+        </w:tc>
+        <w:tc>
+          <w:tcPr>
+            <w:tcW w:w="1400" w:type="dxa"/>
+            <w:vAlign w:val="top"/>
+          </w:tcPr>
+          <w:p>
+            <w:pPr>
+              <w:spacing w:before="0" w:after="0" w:line="240" w:lineRule="auto"/>
+              <w:jc w:val="left"/>
+            </w:pPr>
+            <w:r>
+              <w:rPr>
+                <w:sz w:val="20"/>
+                <w:szCs w:val="20"/>
+              </w:rPr>
+              <w:t xml:space="preserve">551</w:t>
+            </w:r>
+          </w:p>
+        </w:tc>
+        <w:tc>
+          <w:tcPr>
+            <w:tcW w:w="1400" w:type="dxa"/>
+            <w:vAlign w:val="top"/>
+          </w:tcPr>
+          <w:p>
+            <w:pPr>
+              <w:spacing w:before="0" w:after="0" w:line="240" w:lineRule="auto"/>
+              <w:jc w:val="left"/>
+            </w:pPr>
+            <w:r>
+              <w:rPr>
+                <w:sz w:val="20"/>
+                <w:szCs w:val="20"/>
+              </w:rPr>
+              <w:t xml:space="preserve">113,622</w:t>
+            </w:r>
+          </w:p>
+        </w:tc>
+      </w:tr>
+      <w:tr>
+        <w:tc>
+          <w:tcPr>
+            <w:tcW w:w="2026" w:type="dxa"/>
+            <w:vAlign w:val="top"/>
+          </w:tcPr>
+          <w:p>
+            <w:pPr>
+              <w:spacing w:before="0" w:after="0" w:line="240" w:lineRule="auto"/>
+              <w:jc w:val="left"/>
+            </w:pPr>
+            <w:r>
+              <w:rPr>
+                <w:sz w:val="20"/>
+                <w:szCs w:val="20"/>
+              </w:rPr>
+              <w:t xml:space="preserve">Bali &amp; Nusa Tenggara</w:t>
+            </w:r>
+          </w:p>
+        </w:tc>
+        <w:tc>
+          <w:tcPr>
+            <w:tcW w:w="1400" w:type="dxa"/>
+            <w:vAlign w:val="top"/>
+          </w:tcPr>
+          <w:p>
+            <w:pPr>
+              <w:spacing w:before="0" w:after="0" w:line="240" w:lineRule="auto"/>
+              <w:jc w:val="left"/>
+            </w:pPr>
+            <w:r>
+              <w:rPr>
+                <w:sz w:val="20"/>
+                <w:szCs w:val="20"/>
+              </w:rPr>
+              <w:t xml:space="preserve">1</w:t>
+            </w:r>
+          </w:p>
+        </w:tc>
+        <w:tc>
+          <w:tcPr>
+            <w:tcW w:w="1400" w:type="dxa"/>
+            <w:vAlign w:val="top"/>
+          </w:tcPr>
+          <w:p>
+            <w:pPr>
+              <w:spacing w:before="0" w:after="0" w:line="240" w:lineRule="auto"/>
+              <w:jc w:val="left"/>
+            </w:pPr>
+            <w:r>
+              <w:rPr>
+                <w:sz w:val="20"/>
+                <w:szCs w:val="20"/>
+              </w:rPr>
+              <w:t xml:space="preserve">32</w:t>
+            </w:r>
+          </w:p>
+        </w:tc>
+        <w:tc>
+          <w:tcPr>
+            <w:tcW w:w="1400" w:type="dxa"/>
+            <w:vAlign w:val="top"/>
+          </w:tcPr>
+          <w:p>
+            <w:pPr>
+              <w:spacing w:before="0" w:after="0" w:line="240" w:lineRule="auto"/>
+              <w:jc w:val="left"/>
+            </w:pPr>
+            <w:r>
+              <w:rPr>
+                <w:sz w:val="20"/>
+                <w:szCs w:val="20"/>
+              </w:rPr>
+              <w:t xml:space="preserve">26</w:t>
+            </w:r>
+          </w:p>
+        </w:tc>
+        <w:tc>
+          <w:tcPr>
+            <w:tcW w:w="1400" w:type="dxa"/>
+            <w:vAlign w:val="top"/>
+          </w:tcPr>
+          <w:p>
+            <w:pPr>
+              <w:spacing w:before="0" w:after="0" w:line="240" w:lineRule="auto"/>
+              <w:jc w:val="left"/>
+            </w:pPr>
+            <w:r>
+              <w:rPr>
+                <w:sz w:val="20"/>
+                <w:szCs w:val="20"/>
+              </w:rPr>
+              <w:t xml:space="preserve">295</w:t>
+            </w:r>
+          </w:p>
+        </w:tc>
+        <w:tc>
+          <w:tcPr>
+            <w:tcW w:w="1400" w:type="dxa"/>
+            <w:vAlign w:val="top"/>
+          </w:tcPr>
+          <w:p>
+            <w:pPr>
+              <w:spacing w:before="0" w:after="0" w:line="240" w:lineRule="auto"/>
+              <w:jc w:val="left"/>
+            </w:pPr>
+            <w:r>
+              <w:rPr>
+                <w:sz w:val="20"/>
+                <w:szCs w:val="20"/>
+              </w:rPr>
+              <w:t xml:space="preserve">65,007</w:t>
+            </w:r>
+          </w:p>
+        </w:tc>
+      </w:tr>
+      <w:tr>
+        <w:tc>
+          <w:tcPr>
+            <w:tcW w:w="2026" w:type="dxa"/>
+            <w:vAlign w:val="top"/>
+          </w:tcPr>
+          <w:p>
+            <w:pPr>
+              <w:spacing w:before="0" w:after="0" w:line="240" w:lineRule="auto"/>
+              <w:jc w:val="left"/>
+            </w:pPr>
+            <w:r>
+              <w:rPr>
+                <w:sz w:val="20"/>
+                <w:szCs w:val="20"/>
+              </w:rPr>
+              <w:t xml:space="preserve">Papua</w:t>
+            </w:r>
+          </w:p>
+        </w:tc>
+        <w:tc>
+          <w:tcPr>
+            <w:tcW w:w="1400" w:type="dxa"/>
+            <w:vAlign w:val="top"/>
+          </w:tcPr>
+          <w:p>
+            <w:pPr>
+              <w:spacing w:before="0" w:after="0" w:line="240" w:lineRule="auto"/>
+              <w:jc w:val="left"/>
+            </w:pPr>
+            <w:r>
+              <w:rPr>
+                <w:sz w:val="20"/>
+                <w:szCs w:val="20"/>
+              </w:rPr>
+              <w:t xml:space="preserve">1</w:t>
+            </w:r>
+          </w:p>
+        </w:tc>
+        <w:tc>
+          <w:tcPr>
+            <w:tcW w:w="1400" w:type="dxa"/>
+            <w:vAlign w:val="top"/>
+          </w:tcPr>
+          <w:p>
+            <w:pPr>
+              <w:spacing w:before="0" w:after="0" w:line="240" w:lineRule="auto"/>
+              <w:jc w:val="left"/>
+            </w:pPr>
+            <w:r>
+              <w:rPr>
+                <w:sz w:val="20"/>
+                <w:szCs w:val="20"/>
+              </w:rPr>
+              <w:t xml:space="preserve">13</w:t>
+            </w:r>
+          </w:p>
+        </w:tc>
+        <w:tc>
+          <w:tcPr>
+            <w:tcW w:w="1400" w:type="dxa"/>
+            <w:vAlign w:val="top"/>
+          </w:tcPr>
+          <w:p>
+            <w:pPr>
+              <w:spacing w:before="0" w:after="0" w:line="240" w:lineRule="auto"/>
+              <w:jc w:val="left"/>
+            </w:pPr>
+            <w:r>
+              <w:rPr>
+                <w:sz w:val="20"/>
+                <w:szCs w:val="20"/>
+              </w:rPr>
+              <w:t xml:space="preserve">13</w:t>
+            </w:r>
+          </w:p>
+        </w:tc>
+        <w:tc>
+          <w:tcPr>
+            <w:tcW w:w="1400" w:type="dxa"/>
+            <w:vAlign w:val="top"/>
+          </w:tcPr>
+          <w:p>
+            <w:pPr>
+              <w:spacing w:before="0" w:after="0" w:line="240" w:lineRule="auto"/>
+              <w:jc w:val="left"/>
+            </w:pPr>
+            <w:r>
+              <w:rPr>
+                <w:sz w:val="20"/>
+                <w:szCs w:val="20"/>
+              </w:rPr>
+              <w:t xml:space="preserve">88</w:t>
+            </w:r>
+          </w:p>
+        </w:tc>
+        <w:tc>
+          <w:tcPr>
+            <w:tcW w:w="1400" w:type="dxa"/>
+            <w:vAlign w:val="top"/>
+          </w:tcPr>
+          <w:p>
+            <w:pPr>
+              <w:spacing w:before="0" w:after="0" w:line="240" w:lineRule="auto"/>
+              <w:jc w:val="left"/>
+            </w:pPr>
+            <w:r>
+              <w:rPr>
+                <w:sz w:val="20"/>
+                <w:szCs w:val="20"/>
+              </w:rPr>
+              <w:t xml:space="preserve">13,630</w:t>
+            </w:r>
+          </w:p>
+        </w:tc>
+      </w:tr>
+      <w:tr>
+        <w:tc>
+          <w:tcPr>
+            <w:tcW w:w="2026" w:type="dxa"/>
+            <w:vAlign w:val="top"/>
+          </w:tcPr>
+          <w:p>
+            <w:pPr>
+              <w:spacing w:before="0" w:after="0" w:line="240" w:lineRule="auto"/>
+              <w:jc w:val="left"/>
+            </w:pPr>
+            <w:r>
+              <w:rPr>
+                <w:sz w:val="20"/>
+                <w:szCs w:val="20"/>
+              </w:rPr>
+              <w:t xml:space="preserve">Total</w:t>
+            </w:r>
+          </w:p>
+        </w:tc>
+        <w:tc>
+          <w:tcPr>
+            <w:tcW w:w="1400" w:type="dxa"/>
+            <w:vAlign w:val="top"/>
+          </w:tcPr>
+          <w:p>
+            <w:pPr>
+              <w:spacing w:before="0" w:after="0" w:line="240" w:lineRule="auto"/>
+              <w:jc w:val="left"/>
+            </w:pPr>
+            <w:r>
+              <w:rPr>
+                <w:sz w:val="20"/>
+                <w:szCs w:val="20"/>
+              </w:rPr>
+              <w:t xml:space="preserve">18</w:t>
+            </w:r>
+          </w:p>
+        </w:tc>
+        <w:tc>
+          <w:tcPr>
+            <w:tcW w:w="1400" w:type="dxa"/>
+            <w:vAlign w:val="top"/>
+          </w:tcPr>
+          <w:p>
+            <w:pPr>
+              <w:spacing w:before="0" w:after="0" w:line="240" w:lineRule="auto"/>
+              <w:jc w:val="left"/>
+            </w:pPr>
+            <w:r>
+              <w:rPr>
+                <w:sz w:val="20"/>
+                <w:szCs w:val="20"/>
+              </w:rPr>
+              <w:t xml:space="preserve">508</w:t>
+            </w:r>
+          </w:p>
+        </w:tc>
+        <w:tc>
+          <w:tcPr>
+            <w:tcW w:w="1400" w:type="dxa"/>
+            <w:vAlign w:val="top"/>
+          </w:tcPr>
+          <w:p>
+            <w:pPr>
+              <w:spacing w:before="0" w:after="0" w:line="240" w:lineRule="auto"/>
+              <w:jc w:val="left"/>
+            </w:pPr>
+            <w:r>
+              <w:rPr>
+                <w:sz w:val="20"/>
+                <w:szCs w:val="20"/>
+              </w:rPr>
+              <w:t xml:space="preserve">555</w:t>
+            </w:r>
+          </w:p>
+        </w:tc>
+        <w:tc>
+          <w:tcPr>
+            <w:tcW w:w="1400" w:type="dxa"/>
+            <w:vAlign w:val="top"/>
+          </w:tcPr>
+          <w:p>
+            <w:pPr>
+              <w:spacing w:before="0" w:after="0" w:line="240" w:lineRule="auto"/>
+              <w:jc w:val="left"/>
+            </w:pPr>
+            <w:r>
+              <w:rPr>
+                <w:sz w:val="20"/>
+                <w:szCs w:val="20"/>
+              </w:rPr>
+              <w:t xml:space="preserve">5,082</w:t>
+            </w:r>
+          </w:p>
+        </w:tc>
+        <w:tc>
+          <w:tcPr>
+            <w:tcW w:w="1400" w:type="dxa"/>
+            <w:vAlign w:val="top"/>
+          </w:tcPr>
+          <w:p>
+            <w:pPr>
+              <w:spacing w:before="0" w:after="0" w:line="240" w:lineRule="auto"/>
+              <w:jc w:val="left"/>
+            </w:pPr>
+            <w:r>
+              <w:rPr>
+                <w:sz w:val="20"/>
+                <w:szCs w:val="20"/>
+              </w:rPr>
+              <w:t xml:space="preserve">1,193,835</w:t>
+            </w:r>
+          </w:p>
+        </w:tc>
+      </w:tr>
+    </w:tbl>
+    <w:p>
+      <w:pPr>
+        <w:spacing w:before="0" w:after="60" w:line="240" w:lineRule="auto"/>
+        <w:jc w:val="both"/>
+      </w:pPr>
+    </w:p>
+    <w:p>
+      <w:pPr>
+        <w:spacing w:before="0" w:after="120" w:line="360" w:lineRule="auto"/>
+        <w:jc w:val="both"/>
+      </w:pPr>
+      <w:r>
+        <w:rPr>
+          <w:sz w:val="24"/>
+          <w:szCs w:val="24"/>
+        </w:rPr>
+        <w:t xml:space="preserve">Through ten main subsidiaries, the BRI Group also provides services beyond banking, as listed in Table 2.3.</w:t>
+      </w:r>
+    </w:p>
+    <w:p>
+      <w:pPr>
+        <w:keepNext w:val="1"/>
+        <w:spacing w:before="120" w:after="60" w:line="240" w:lineRule="auto"/>
+        <w:jc w:val="center"/>
+      </w:pPr>
+      <w:r>
+        <w:rPr>
+          <w:b w:val="1"/>
+          <w:sz w:val="20"/>
+          <w:szCs w:val="20"/>
+        </w:rPr>
+        <w:t xml:space="preserve">Table 2.3 BRI subsidiaries</w:t>
+      </w:r>
+    </w:p>
+    <w:tbl>
+      <w:tblPr>
+        <w:tblW w:w="9026" w:type="dxa"/>
+        <w:tblBorders>
+          <w:top w:val="single" w:sz="4" w:space="0" w:color="808080"/>
+          <w:left w:val="single" w:sz="4" w:space="0" w:color="808080"/>
+          <w:bottom w:val="single" w:sz="4" w:space="0" w:color="808080"/>
+          <w:right w:val="single" w:sz="4" w:space="0" w:color="808080"/>
+          <w:insideH w:val="single" w:sz="4" w:space="0" w:color="808080"/>
+          <w:insideV w:val="single" w:sz="4" w:space="0" w:color="808080"/>
+        </w:tblBorders>
+        <w:tblLayout w:type="fixed"/>
+        <w:tblCellMar>
+          <w:top w:w="40" w:type="dxa"/>
+          <w:left w:w="100" w:type="dxa"/>
+          <w:bottom w:w="40" w:type="dxa"/>
+          <w:right w:w="100" w:type="dxa"/>
+        </w:tblCellMar>
+      </w:tblPr>
+      <w:tblGrid>
+        <w:gridCol w:w="4513"/>
+        <w:gridCol w:w="4513"/>
+      </w:tblGrid>
+      <w:tr>
+        <w:trPr>
+          <w:tblHeader w:val="1"/>
+        </w:trPr>
+        <w:tc>
+          <w:tcPr>
+            <w:tcW w:w="4513" w:type="dxa"/>
+            <w:shd w:val="clear" w:color="auto" w:fill="D9D9D9"/>
+            <w:vAlign w:val="top"/>
+          </w:tcPr>
+          <w:p>
+            <w:pPr>
+              <w:spacing w:before="0" w:after="0" w:line="240" w:lineRule="auto"/>
+              <w:jc w:val="left"/>
+            </w:pPr>
+            <w:r>
+              <w:rPr>
+                <w:b w:val="1"/>
+                <w:sz w:val="20"/>
+                <w:szCs w:val="20"/>
+              </w:rPr>
+              <w:t xml:space="preserve">Subsidiary</w:t>
+            </w:r>
+          </w:p>
+        </w:tc>
+        <w:tc>
+          <w:tcPr>
+            <w:tcW w:w="4513" w:type="dxa"/>
+            <w:shd w:val="clear" w:color="auto" w:fill="D9D9D9"/>
+            <w:vAlign w:val="top"/>
+          </w:tcPr>
+          <w:p>
+            <w:pPr>
+              <w:spacing w:before="0" w:after="0" w:line="240" w:lineRule="auto"/>
+              <w:jc w:val="left"/>
+            </w:pPr>
+            <w:r>
+              <w:rPr>
+                <w:b w:val="1"/>
+                <w:sz w:val="20"/>
+                <w:szCs w:val="20"/>
+              </w:rPr>
+              <w:t xml:space="preserve">Business</w:t>
+            </w:r>
+          </w:p>
+        </w:tc>
+      </w:tr>
+      <w:tr>
+        <w:tc>
+          <w:tcPr>
+            <w:tcW w:w="4513" w:type="dxa"/>
+            <w:vAlign w:val="top"/>
+          </w:tcPr>
+          <w:p>
+            <w:pPr>
+              <w:spacing w:before="0" w:after="0" w:line="240" w:lineRule="auto"/>
+              <w:jc w:val="left"/>
+            </w:pPr>
+            <w:r>
+              <w:rPr>
+                <w:sz w:val="20"/>
+                <w:szCs w:val="20"/>
+              </w:rPr>
+              <w:t xml:space="preserve">PT Bank Raya Indonesia Tbk</w:t>
+            </w:r>
+          </w:p>
+        </w:tc>
+        <w:tc>
+          <w:tcPr>
+            <w:tcW w:w="4513" w:type="dxa"/>
+            <w:vAlign w:val="top"/>
+          </w:tcPr>
+          <w:p>
+            <w:pPr>
+              <w:spacing w:before="0" w:after="0" w:line="240" w:lineRule="auto"/>
+              <w:jc w:val="left"/>
+            </w:pPr>
+            <w:r>
+              <w:rPr>
+                <w:sz w:val="20"/>
+                <w:szCs w:val="20"/>
+              </w:rPr>
+              <w:t xml:space="preserve">Digital banking</w:t>
+            </w:r>
+          </w:p>
+        </w:tc>
+      </w:tr>
+      <w:tr>
+        <w:tc>
+          <w:tcPr>
+            <w:tcW w:w="4513" w:type="dxa"/>
+            <w:vAlign w:val="top"/>
+          </w:tcPr>
+          <w:p>
+            <w:pPr>
+              <w:spacing w:before="0" w:after="0" w:line="240" w:lineRule="auto"/>
+              <w:jc w:val="left"/>
+            </w:pPr>
+            <w:r>
+              <w:rPr>
+                <w:sz w:val="20"/>
+                <w:szCs w:val="20"/>
+              </w:rPr>
+              <w:t xml:space="preserve">BRI Global Financial Services Ltd</w:t>
+            </w:r>
+          </w:p>
+        </w:tc>
+        <w:tc>
+          <w:tcPr>
+            <w:tcW w:w="4513" w:type="dxa"/>
+            <w:vAlign w:val="top"/>
+          </w:tcPr>
+          <w:p>
+            <w:pPr>
+              <w:spacing w:before="0" w:after="0" w:line="240" w:lineRule="auto"/>
+              <w:jc w:val="left"/>
+            </w:pPr>
+            <w:r>
+              <w:rPr>
+                <w:sz w:val="20"/>
+                <w:szCs w:val="20"/>
+              </w:rPr>
+              <w:t xml:space="preserve">Remittance and financing</w:t>
+            </w:r>
+          </w:p>
+        </w:tc>
+      </w:tr>
+      <w:tr>
+        <w:tc>
+          <w:tcPr>
+            <w:tcW w:w="4513" w:type="dxa"/>
+            <w:vAlign w:val="top"/>
+          </w:tcPr>
+          <w:p>
+            <w:pPr>
+              <w:spacing w:before="0" w:after="0" w:line="240" w:lineRule="auto"/>
+              <w:jc w:val="left"/>
+            </w:pPr>
+            <w:r>
+              <w:rPr>
+                <w:sz w:val="20"/>
+                <w:szCs w:val="20"/>
+              </w:rPr>
+              <w:t xml:space="preserve">PT Asuransi BRI Life</w:t>
+            </w:r>
+          </w:p>
+        </w:tc>
+        <w:tc>
+          <w:tcPr>
+            <w:tcW w:w="4513" w:type="dxa"/>
+            <w:vAlign w:val="top"/>
+          </w:tcPr>
+          <w:p>
+            <w:pPr>
+              <w:spacing w:before="0" w:after="0" w:line="240" w:lineRule="auto"/>
+              <w:jc w:val="left"/>
+            </w:pPr>
+            <w:r>
+              <w:rPr>
+                <w:sz w:val="20"/>
+                <w:szCs w:val="20"/>
+              </w:rPr>
+              <w:t xml:space="preserve">Life insurance</w:t>
+            </w:r>
+          </w:p>
+        </w:tc>
+      </w:tr>
+      <w:tr>
+        <w:tc>
+          <w:tcPr>
+            <w:tcW w:w="4513" w:type="dxa"/>
+            <w:vAlign w:val="top"/>
+          </w:tcPr>
+          <w:p>
+            <w:pPr>
+              <w:spacing w:before="0" w:after="0" w:line="240" w:lineRule="auto"/>
+              <w:jc w:val="left"/>
+            </w:pPr>
+            <w:r>
+              <w:rPr>
+                <w:sz w:val="20"/>
+                <w:szCs w:val="20"/>
+              </w:rPr>
+              <w:t xml:space="preserve">PT BRI Multifinance Indonesia (BRI Finance)</w:t>
+            </w:r>
+          </w:p>
+        </w:tc>
+        <w:tc>
+          <w:tcPr>
+            <w:tcW w:w="4513" w:type="dxa"/>
+            <w:vAlign w:val="top"/>
+          </w:tcPr>
+          <w:p>
+            <w:pPr>
+              <w:spacing w:before="0" w:after="0" w:line="240" w:lineRule="auto"/>
+              <w:jc w:val="left"/>
+            </w:pPr>
+            <w:r>
+              <w:rPr>
+                <w:sz w:val="20"/>
+                <w:szCs w:val="20"/>
+              </w:rPr>
+              <w:t xml:space="preserve">Financing</w:t>
+            </w:r>
+          </w:p>
+        </w:tc>
+      </w:tr>
+      <w:tr>
+        <w:tc>
+          <w:tcPr>
+            <w:tcW w:w="4513" w:type="dxa"/>
+            <w:vAlign w:val="top"/>
+          </w:tcPr>
+          <w:p>
+            <w:pPr>
+              <w:spacing w:before="0" w:after="0" w:line="240" w:lineRule="auto"/>
+              <w:jc w:val="left"/>
+            </w:pPr>
+            <w:r>
+              <w:rPr>
+                <w:sz w:val="20"/>
+                <w:szCs w:val="20"/>
+              </w:rPr>
+              <w:t xml:space="preserve">PT BRI Danareksa Sekuritas</w:t>
+            </w:r>
+          </w:p>
+        </w:tc>
+        <w:tc>
+          <w:tcPr>
+            <w:tcW w:w="4513" w:type="dxa"/>
+            <w:vAlign w:val="top"/>
+          </w:tcPr>
+          <w:p>
+            <w:pPr>
+              <w:spacing w:before="0" w:after="0" w:line="240" w:lineRule="auto"/>
+              <w:jc w:val="left"/>
+            </w:pPr>
+            <w:r>
+              <w:rPr>
+                <w:sz w:val="20"/>
+                <w:szCs w:val="20"/>
+              </w:rPr>
+              <w:t xml:space="preserve">Securities services</w:t>
+            </w:r>
+          </w:p>
+        </w:tc>
+      </w:tr>
+      <w:tr>
+        <w:tc>
+          <w:tcPr>
+            <w:tcW w:w="4513" w:type="dxa"/>
+            <w:vAlign w:val="top"/>
+          </w:tcPr>
+          <w:p>
+            <w:pPr>
+              <w:spacing w:before="0" w:after="0" w:line="240" w:lineRule="auto"/>
+              <w:jc w:val="left"/>
+            </w:pPr>
+            <w:r>
+              <w:rPr>
+                <w:sz w:val="20"/>
+                <w:szCs w:val="20"/>
+              </w:rPr>
+              <w:t xml:space="preserve">PT BRI Ventura Investama (BRI Ventures)</w:t>
+            </w:r>
+          </w:p>
+        </w:tc>
+        <w:tc>
+          <w:tcPr>
+            <w:tcW w:w="4513" w:type="dxa"/>
+            <w:vAlign w:val="top"/>
+          </w:tcPr>
+          <w:p>
+            <w:pPr>
+              <w:spacing w:before="0" w:after="0" w:line="240" w:lineRule="auto"/>
+              <w:jc w:val="left"/>
+            </w:pPr>
+            <w:r>
+              <w:rPr>
+                <w:sz w:val="20"/>
+                <w:szCs w:val="20"/>
+              </w:rPr>
+              <w:t xml:space="preserve">Venture capital</w:t>
+            </w:r>
+          </w:p>
+        </w:tc>
+      </w:tr>
+      <w:tr>
+        <w:tc>
+          <w:tcPr>
+            <w:tcW w:w="4513" w:type="dxa"/>
+            <w:vAlign w:val="top"/>
+          </w:tcPr>
+          <w:p>
+            <w:pPr>
+              <w:spacing w:before="0" w:after="0" w:line="240" w:lineRule="auto"/>
+              <w:jc w:val="left"/>
+            </w:pPr>
+            <w:r>
+              <w:rPr>
+                <w:sz w:val="20"/>
+                <w:szCs w:val="20"/>
+              </w:rPr>
+              <w:t xml:space="preserve">PT BRI Asuransi Indonesia (BRI Insurance)</w:t>
+            </w:r>
+          </w:p>
+        </w:tc>
+        <w:tc>
+          <w:tcPr>
+            <w:tcW w:w="4513" w:type="dxa"/>
+            <w:vAlign w:val="top"/>
+          </w:tcPr>
+          <w:p>
+            <w:pPr>
+              <w:spacing w:before="0" w:after="0" w:line="240" w:lineRule="auto"/>
+              <w:jc w:val="left"/>
+            </w:pPr>
+            <w:r>
+              <w:rPr>
+                <w:sz w:val="20"/>
+                <w:szCs w:val="20"/>
+              </w:rPr>
+              <w:t xml:space="preserve">General insurance</w:t>
+            </w:r>
+          </w:p>
+        </w:tc>
+      </w:tr>
+      <w:tr>
+        <w:tc>
+          <w:tcPr>
+            <w:tcW w:w="4513" w:type="dxa"/>
+            <w:vAlign w:val="top"/>
+          </w:tcPr>
+          <w:p>
+            <w:pPr>
+              <w:spacing w:before="0" w:after="0" w:line="240" w:lineRule="auto"/>
+              <w:jc w:val="left"/>
+            </w:pPr>
+            <w:r>
+              <w:rPr>
+                <w:sz w:val="20"/>
+                <w:szCs w:val="20"/>
+              </w:rPr>
+              <w:t xml:space="preserve">PT Pegadaian</w:t>
+            </w:r>
+          </w:p>
+        </w:tc>
+        <w:tc>
+          <w:tcPr>
+            <w:tcW w:w="4513" w:type="dxa"/>
+            <w:vAlign w:val="top"/>
+          </w:tcPr>
+          <w:p>
+            <w:pPr>
+              <w:spacing w:before="0" w:after="0" w:line="240" w:lineRule="auto"/>
+              <w:jc w:val="left"/>
+            </w:pPr>
+            <w:r>
+              <w:rPr>
+                <w:sz w:val="20"/>
+                <w:szCs w:val="20"/>
+              </w:rPr>
+              <w:t xml:space="preserve">Pawn-based and other financing</w:t>
+            </w:r>
+          </w:p>
+        </w:tc>
+      </w:tr>
+      <w:tr>
+        <w:tc>
+          <w:tcPr>
+            <w:tcW w:w="4513" w:type="dxa"/>
+            <w:vAlign w:val="top"/>
+          </w:tcPr>
+          <w:p>
+            <w:pPr>
+              <w:spacing w:before="0" w:after="0" w:line="240" w:lineRule="auto"/>
+              <w:jc w:val="left"/>
+            </w:pPr>
+            <w:r>
+              <w:rPr>
+                <w:sz w:val="20"/>
+                <w:szCs w:val="20"/>
+              </w:rPr>
+              <w:t xml:space="preserve">PT Permodalan Nasional Madani (PNM)</w:t>
+            </w:r>
+          </w:p>
+        </w:tc>
+        <w:tc>
+          <w:tcPr>
+            <w:tcW w:w="4513" w:type="dxa"/>
+            <w:vAlign w:val="top"/>
+          </w:tcPr>
+          <w:p>
+            <w:pPr>
+              <w:spacing w:before="0" w:after="0" w:line="240" w:lineRule="auto"/>
+              <w:jc w:val="left"/>
+            </w:pPr>
+            <w:r>
+              <w:rPr>
+                <w:sz w:val="20"/>
+                <w:szCs w:val="20"/>
+              </w:rPr>
+              <w:t xml:space="preserve">Financing and mentoring for micro enterprises</w:t>
+            </w:r>
+          </w:p>
+        </w:tc>
+      </w:tr>
+      <w:tr>
+        <w:tc>
+          <w:tcPr>
+            <w:tcW w:w="4513" w:type="dxa"/>
+            <w:vAlign w:val="top"/>
+          </w:tcPr>
+          <w:p>
+            <w:pPr>
+              <w:spacing w:before="0" w:after="0" w:line="240" w:lineRule="auto"/>
+              <w:jc w:val="left"/>
+            </w:pPr>
+            <w:r>
+              <w:rPr>
+                <w:sz w:val="20"/>
+                <w:szCs w:val="20"/>
+              </w:rPr>
+              <w:t xml:space="preserve">PT BRI Manajemen Investasi</w:t>
+            </w:r>
+          </w:p>
+        </w:tc>
+        <w:tc>
+          <w:tcPr>
+            <w:tcW w:w="4513" w:type="dxa"/>
+            <w:vAlign w:val="top"/>
+          </w:tcPr>
+          <w:p>
+            <w:pPr>
+              <w:spacing w:before="0" w:after="0" w:line="240" w:lineRule="auto"/>
+              <w:jc w:val="left"/>
+            </w:pPr>
+            <w:r>
+              <w:rPr>
+                <w:sz w:val="20"/>
+                <w:szCs w:val="20"/>
+              </w:rPr>
+              <w:t xml:space="preserve">Investment management</w:t>
+            </w:r>
+          </w:p>
+        </w:tc>
+      </w:tr>
+    </w:tbl>
+    <w:p>
+      <w:pPr>
+        <w:spacing w:before="0" w:after="60" w:line="240" w:lineRule="auto"/>
+        <w:jc w:val="both"/>
+      </w:pPr>
+    </w:p>
+    <w:p>
+      <w:pPr>
+        <w:keepNext w:val="1"/>
+        <w:spacing w:before="240" w:after="120" w:line="360" w:lineRule="auto"/>
+        <w:jc w:val="left"/>
+      </w:pPr>
+      <w:r>
+        <w:rPr>
+          <w:b w:val="1"/>
+          <w:sz w:val="24"/>
+          <w:szCs w:val="24"/>
+        </w:rPr>
+        <w:t xml:space="preserve">2.3 Vision, Strategy, and Corporate Values</w:t>
+      </w:r>
+    </w:p>
+    <w:p>
+      <w:pPr>
+        <w:spacing w:before="0" w:after="120" w:line="360" w:lineRule="auto"/>
+        <w:jc w:val="both"/>
+      </w:pPr>
+      <w:r>
+        <w:rPr>
+          <w:b w:val="1"/>
+          <w:sz w:val="24"/>
+          <w:szCs w:val="24"/>
+        </w:rPr>
+        <w:t xml:space="preserve">Vision. </w:t>
+      </w:r>
+      <w:r>
+        <w:rPr>
+          <w:sz w:val="24"/>
+          <w:szCs w:val="24"/>
+        </w:rPr>
+        <w:t xml:space="preserve">"Deliver Sustainable Values and Integrated Solutions to Achieve Indonesia's Aspiration."</w:t>
+      </w:r>
+    </w:p>
+    <w:p>
+      <w:pPr>
+        <w:spacing w:before="0" w:after="120" w:line="360" w:lineRule="auto"/>
+        <w:jc w:val="both"/>
+      </w:pPr>
+      <w:r>
+        <w:rPr>
+          <w:sz w:val="24"/>
+          <w:szCs w:val="24"/>
+        </w:rPr>
+        <w:t xml:space="preserve">BRI pursues this vision through its transformation programme, BRIvolution Reignite, under the positioning "One Bank for All": an inclusive universal bank serving every segment of Indonesian society. The programme rests on two main pillars, Transform the Funding Franchise, and Revamp Existing Core and Build New Core. These are supported by six enablers: Human Capital, Risk Management, IT &amp; Digital, Distribution, Operational Excellence, and Rebranding. In practice, this means growing low-cost funding and transaction banking, strengthening the micro segment as the core business, building new income sources in the consumer segment, and improving digital capability, risk management, and human resources.</w:t>
+      </w:r>
+    </w:p>
+    <w:p>
+      <w:pPr>
+        <w:spacing w:before="0" w:after="120" w:line="360" w:lineRule="auto"/>
+        <w:jc w:val="both"/>
+      </w:pPr>
+      <w:r>
+        <w:rPr>
+          <w:sz w:val="24"/>
+          <w:szCs w:val="24"/>
+        </w:rPr>
+        <w:t xml:space="preserve">On 14 July 2025, BRI adopted the BRILiaN Way as its corporate culture. It sets out five core values that guide the behaviour of every employee, shown in Table 2.4.</w:t>
+      </w:r>
+    </w:p>
+    <w:p>
+      <w:pPr>
+        <w:keepNext w:val="1"/>
+        <w:spacing w:before="120" w:after="60" w:line="240" w:lineRule="auto"/>
+        <w:jc w:val="center"/>
+      </w:pPr>
+      <w:r>
+        <w:rPr>
+          <w:b w:val="1"/>
+          <w:sz w:val="20"/>
+          <w:szCs w:val="20"/>
+        </w:rPr>
+        <w:t xml:space="preserve">Table 2.4 BRI core values (the BRILiaN Way)</w:t>
+      </w:r>
+    </w:p>
+    <w:tbl>
+      <w:tblPr>
+        <w:tblW w:w="9026" w:type="dxa"/>
+        <w:tblBorders>
+          <w:top w:val="single" w:sz="4" w:space="0" w:color="808080"/>
+          <w:left w:val="single" w:sz="4" w:space="0" w:color="808080"/>
+          <w:bottom w:val="single" w:sz="4" w:space="0" w:color="808080"/>
+          <w:right w:val="single" w:sz="4" w:space="0" w:color="808080"/>
+          <w:insideH w:val="single" w:sz="4" w:space="0" w:color="808080"/>
+          <w:insideV w:val="single" w:sz="4" w:space="0" w:color="808080"/>
+        </w:tblBorders>
+        <w:tblLayout w:type="fixed"/>
+        <w:tblCellMar>
+          <w:top w:w="40" w:type="dxa"/>
+          <w:left w:w="100" w:type="dxa"/>
+          <w:bottom w:w="40" w:type="dxa"/>
+          <w:right w:w="100" w:type="dxa"/>
+        </w:tblCellMar>
+      </w:tblPr>
+      <w:tblGrid>
+        <w:gridCol w:w="2400"/>
+        <w:gridCol w:w="6626"/>
+      </w:tblGrid>
+      <w:tr>
+        <w:trPr>
+          <w:tblHeader w:val="1"/>
+        </w:trPr>
+        <w:tc>
+          <w:tcPr>
+            <w:tcW w:w="2400" w:type="dxa"/>
+            <w:shd w:val="clear" w:color="auto" w:fill="D9D9D9"/>
+            <w:vAlign w:val="top"/>
+          </w:tcPr>
+          <w:p>
+            <w:pPr>
+              <w:spacing w:before="0" w:after="0" w:line="240" w:lineRule="auto"/>
+              <w:jc w:val="left"/>
+            </w:pPr>
+            <w:r>
+              <w:rPr>
+                <w:b w:val="1"/>
+                <w:sz w:val="20"/>
+                <w:szCs w:val="20"/>
+              </w:rPr>
+              <w:t xml:space="preserve">Core value</w:t>
+            </w:r>
+          </w:p>
+        </w:tc>
+        <w:tc>
+          <w:tcPr>
+            <w:tcW w:w="6626" w:type="dxa"/>
+            <w:shd w:val="clear" w:color="auto" w:fill="D9D9D9"/>
+            <w:vAlign w:val="top"/>
+          </w:tcPr>
+          <w:p>
+            <w:pPr>
+              <w:spacing w:before="0" w:after="0" w:line="240" w:lineRule="auto"/>
+              <w:jc w:val="left"/>
+            </w:pPr>
+            <w:r>
+              <w:rPr>
+                <w:b w:val="1"/>
+                <w:sz w:val="20"/>
+                <w:szCs w:val="20"/>
+              </w:rPr>
+              <w:t xml:space="preserve">Definition</w:t>
+            </w:r>
+          </w:p>
+        </w:tc>
+      </w:tr>
+      <w:tr>
+        <w:tc>
+          <w:tcPr>
+            <w:tcW w:w="2400" w:type="dxa"/>
+            <w:vAlign w:val="top"/>
+          </w:tcPr>
+          <w:p>
+            <w:pPr>
+              <w:spacing w:before="0" w:after="0" w:line="240" w:lineRule="auto"/>
+              <w:jc w:val="left"/>
+            </w:pPr>
+            <w:r>
+              <w:rPr>
+                <w:sz w:val="20"/>
+                <w:szCs w:val="20"/>
+              </w:rPr>
+              <w:t xml:space="preserve">Integrity</w:t>
+            </w:r>
+          </w:p>
+        </w:tc>
+        <w:tc>
+          <w:tcPr>
+            <w:tcW w:w="6626" w:type="dxa"/>
+            <w:vAlign w:val="top"/>
+          </w:tcPr>
+          <w:p>
+            <w:pPr>
+              <w:spacing w:before="0" w:after="0" w:line="240" w:lineRule="auto"/>
+              <w:jc w:val="left"/>
+            </w:pPr>
+            <w:r>
+              <w:rPr>
+                <w:sz w:val="20"/>
+                <w:szCs w:val="20"/>
+              </w:rPr>
+              <w:t xml:space="preserve">Upholding professionalism, ethics, and honesty by considering risks in every action.</w:t>
+            </w:r>
+          </w:p>
+        </w:tc>
+      </w:tr>
+      <w:tr>
+        <w:tc>
+          <w:tcPr>
+            <w:tcW w:w="2400" w:type="dxa"/>
+            <w:vAlign w:val="top"/>
+          </w:tcPr>
+          <w:p>
+            <w:pPr>
+              <w:spacing w:before="0" w:after="0" w:line="240" w:lineRule="auto"/>
+              <w:jc w:val="left"/>
+            </w:pPr>
+            <w:r>
+              <w:rPr>
+                <w:sz w:val="20"/>
+                <w:szCs w:val="20"/>
+              </w:rPr>
+              <w:t xml:space="preserve">Collaboration</w:t>
+            </w:r>
+          </w:p>
+        </w:tc>
+        <w:tc>
+          <w:tcPr>
+            <w:tcW w:w="6626" w:type="dxa"/>
+            <w:vAlign w:val="top"/>
+          </w:tcPr>
+          <w:p>
+            <w:pPr>
+              <w:spacing w:before="0" w:after="0" w:line="240" w:lineRule="auto"/>
+              <w:jc w:val="left"/>
+            </w:pPr>
+            <w:r>
+              <w:rPr>
+                <w:sz w:val="20"/>
+                <w:szCs w:val="20"/>
+              </w:rPr>
+              <w:t xml:space="preserve">Working in synergy and contributing actively to achieve shared objectives.</w:t>
+            </w:r>
+          </w:p>
+        </w:tc>
+      </w:tr>
+      <w:tr>
+        <w:tc>
+          <w:tcPr>
+            <w:tcW w:w="2400" w:type="dxa"/>
+            <w:vAlign w:val="top"/>
+          </w:tcPr>
+          <w:p>
+            <w:pPr>
+              <w:spacing w:before="0" w:after="0" w:line="240" w:lineRule="auto"/>
+              <w:jc w:val="left"/>
+            </w:pPr>
+            <w:r>
+              <w:rPr>
+                <w:sz w:val="20"/>
+                <w:szCs w:val="20"/>
+              </w:rPr>
+              <w:t xml:space="preserve">Accountability</w:t>
+            </w:r>
+          </w:p>
+        </w:tc>
+        <w:tc>
+          <w:tcPr>
+            <w:tcW w:w="6626" w:type="dxa"/>
+            <w:vAlign w:val="top"/>
+          </w:tcPr>
+          <w:p>
+            <w:pPr>
+              <w:spacing w:before="0" w:after="0" w:line="240" w:lineRule="auto"/>
+              <w:jc w:val="left"/>
+            </w:pPr>
+            <w:r>
+              <w:rPr>
+                <w:sz w:val="20"/>
+                <w:szCs w:val="20"/>
+              </w:rPr>
+              <w:t xml:space="preserve">Taking full responsibility for people development and exercising disciplined execution to achieve optimal results.</w:t>
+            </w:r>
+          </w:p>
+        </w:tc>
+      </w:tr>
+      <w:tr>
+        <w:tc>
+          <w:tcPr>
+            <w:tcW w:w="2400" w:type="dxa"/>
+            <w:vAlign w:val="top"/>
+          </w:tcPr>
+          <w:p>
+            <w:pPr>
+              <w:spacing w:before="0" w:after="0" w:line="240" w:lineRule="auto"/>
+              <w:jc w:val="left"/>
+            </w:pPr>
+            <w:r>
+              <w:rPr>
+                <w:sz w:val="20"/>
+                <w:szCs w:val="20"/>
+              </w:rPr>
+              <w:t xml:space="preserve">Growth Mindset</w:t>
+            </w:r>
+          </w:p>
+        </w:tc>
+        <w:tc>
+          <w:tcPr>
+            <w:tcW w:w="6626" w:type="dxa"/>
+            <w:vAlign w:val="top"/>
+          </w:tcPr>
+          <w:p>
+            <w:pPr>
+              <w:spacing w:before="0" w:after="0" w:line="240" w:lineRule="auto"/>
+              <w:jc w:val="left"/>
+            </w:pPr>
+            <w:r>
+              <w:rPr>
+                <w:sz w:val="20"/>
+                <w:szCs w:val="20"/>
+              </w:rPr>
+              <w:t xml:space="preserve">Being adaptive, innovative, and open to continuous learning through every stage of change.</w:t>
+            </w:r>
+          </w:p>
+        </w:tc>
+      </w:tr>
+      <w:tr>
+        <w:tc>
+          <w:tcPr>
+            <w:tcW w:w="2400" w:type="dxa"/>
+            <w:vAlign w:val="top"/>
+          </w:tcPr>
+          <w:p>
+            <w:pPr>
+              <w:spacing w:before="0" w:after="0" w:line="240" w:lineRule="auto"/>
+              <w:jc w:val="left"/>
+            </w:pPr>
+            <w:r>
+              <w:rPr>
+                <w:sz w:val="20"/>
+                <w:szCs w:val="20"/>
+              </w:rPr>
+              <w:t xml:space="preserve">Customer Focus</w:t>
+            </w:r>
+          </w:p>
+        </w:tc>
+        <w:tc>
+          <w:tcPr>
+            <w:tcW w:w="6626" w:type="dxa"/>
+            <w:vAlign w:val="top"/>
+          </w:tcPr>
+          <w:p>
+            <w:pPr>
+              <w:spacing w:before="0" w:after="0" w:line="240" w:lineRule="auto"/>
+              <w:jc w:val="left"/>
+            </w:pPr>
+            <w:r>
+              <w:rPr>
+                <w:sz w:val="20"/>
+                <w:szCs w:val="20"/>
+              </w:rPr>
+              <w:t xml:space="preserve">Delivering empathetic services and solutions aligned with customer needs.</w:t>
+            </w:r>
+          </w:p>
+        </w:tc>
+      </w:tr>
+    </w:tbl>
+    <w:p>
+      <w:pPr>
+        <w:spacing w:before="0" w:after="60" w:line="240" w:lineRule="auto"/>
+        <w:jc w:val="both"/>
+      </w:pPr>
+    </w:p>
+    <w:p>
+      <w:pPr>
+        <w:keepNext w:val="1"/>
+        <w:spacing w:before="240" w:after="120" w:line="360" w:lineRule="auto"/>
+        <w:jc w:val="left"/>
+      </w:pPr>
+      <w:r>
+        <w:rPr>
+          <w:b w:val="1"/>
+          <w:sz w:val="24"/>
+          <w:szCs w:val="24"/>
+        </w:rPr>
+        <w:t xml:space="preserve">2.4 Company History</w:t>
+      </w:r>
+    </w:p>
+    <w:p>
+      <w:pPr>
+        <w:spacing w:before="0" w:after="120" w:line="360" w:lineRule="auto"/>
+        <w:jc w:val="both"/>
+      </w:pPr>
+      <w:r>
+        <w:rPr>
+          <w:sz w:val="24"/>
+          <w:szCs w:val="24"/>
+        </w:rPr>
+        <w:t xml:space="preserve">BRI began in 1895 as De Poerwokertosche Hulp en Spaarbank der Inlandsche Hoofden, a savings and loan bank in Purwokerto intended to serve Indonesian people. Since then it has gone through several changes of name and legal status. Table 2.5 lists the main milestones.</w:t>
+      </w:r>
+    </w:p>
+    <w:p>
+      <w:pPr>
+        <w:keepNext w:val="1"/>
+        <w:spacing w:before="120" w:after="60" w:line="240" w:lineRule="auto"/>
+        <w:jc w:val="center"/>
+      </w:pPr>
+      <w:r>
+        <w:rPr>
+          <w:b w:val="1"/>
+          <w:sz w:val="20"/>
+          <w:szCs w:val="20"/>
+        </w:rPr>
+        <w:t xml:space="preserve">Table 2.5 Milestones in BRI's history</w:t>
+      </w:r>
+    </w:p>
+    <w:tbl>
+      <w:tblPr>
+        <w:tblW w:w="9026" w:type="dxa"/>
+        <w:tblBorders>
+          <w:top w:val="single" w:sz="4" w:space="0" w:color="808080"/>
+          <w:left w:val="single" w:sz="4" w:space="0" w:color="808080"/>
+          <w:bottom w:val="single" w:sz="4" w:space="0" w:color="808080"/>
+          <w:right w:val="single" w:sz="4" w:space="0" w:color="808080"/>
+          <w:insideH w:val="single" w:sz="4" w:space="0" w:color="808080"/>
+          <w:insideV w:val="single" w:sz="4" w:space="0" w:color="808080"/>
+        </w:tblBorders>
+        <w:tblLayout w:type="fixed"/>
+        <w:tblCellMar>
+          <w:top w:w="40" w:type="dxa"/>
+          <w:left w:w="100" w:type="dxa"/>
+          <w:bottom w:w="40" w:type="dxa"/>
+          <w:right w:w="100" w:type="dxa"/>
+        </w:tblCellMar>
+      </w:tblPr>
+      <w:tblGrid>
+        <w:gridCol w:w="1600"/>
+        <w:gridCol w:w="7426"/>
+      </w:tblGrid>
+      <w:tr>
+        <w:trPr>
+          <w:tblHeader w:val="1"/>
+        </w:trPr>
+        <w:tc>
+          <w:tcPr>
+            <w:tcW w:w="1600" w:type="dxa"/>
+            <w:shd w:val="clear" w:color="auto" w:fill="D9D9D9"/>
+            <w:vAlign w:val="top"/>
+          </w:tcPr>
+          <w:p>
+            <w:pPr>
+              <w:spacing w:before="0" w:after="0" w:line="240" w:lineRule="auto"/>
+              <w:jc w:val="left"/>
+            </w:pPr>
+            <w:r>
+              <w:rPr>
+                <w:b w:val="1"/>
+                <w:sz w:val="20"/>
+                <w:szCs w:val="20"/>
+              </w:rPr>
+              <w:t xml:space="preserve">Year</w:t>
+            </w:r>
+          </w:p>
+        </w:tc>
+        <w:tc>
+          <w:tcPr>
+            <w:tcW w:w="7426" w:type="dxa"/>
+            <w:shd w:val="clear" w:color="auto" w:fill="D9D9D9"/>
+            <w:vAlign w:val="top"/>
+          </w:tcPr>
+          <w:p>
+            <w:pPr>
+              <w:spacing w:before="0" w:after="0" w:line="240" w:lineRule="auto"/>
+              <w:jc w:val="left"/>
+            </w:pPr>
+            <w:r>
+              <w:rPr>
+                <w:b w:val="1"/>
+                <w:sz w:val="20"/>
+                <w:szCs w:val="20"/>
+              </w:rPr>
+              <w:t xml:space="preserve">Milestone</w:t>
+            </w:r>
+          </w:p>
+        </w:tc>
+      </w:tr>
+      <w:tr>
+        <w:tc>
+          <w:tcPr>
+            <w:tcW w:w="1600" w:type="dxa"/>
+            <w:vAlign w:val="top"/>
+          </w:tcPr>
+          <w:p>
+            <w:pPr>
+              <w:spacing w:before="0" w:after="0" w:line="240" w:lineRule="auto"/>
+              <w:jc w:val="left"/>
+            </w:pPr>
+            <w:r>
+              <w:rPr>
+                <w:sz w:val="20"/>
+                <w:szCs w:val="20"/>
+              </w:rPr>
+              <w:t xml:space="preserve">1895</w:t>
+            </w:r>
+          </w:p>
+        </w:tc>
+        <w:tc>
+          <w:tcPr>
+            <w:tcW w:w="7426" w:type="dxa"/>
+            <w:vAlign w:val="top"/>
+          </w:tcPr>
+          <w:p>
+            <w:pPr>
+              <w:spacing w:before="0" w:after="0" w:line="240" w:lineRule="auto"/>
+              <w:jc w:val="left"/>
+            </w:pPr>
+            <w:r>
+              <w:rPr>
+                <w:sz w:val="20"/>
+                <w:szCs w:val="20"/>
+              </w:rPr>
+              <w:t xml:space="preserve">Established on 16 December in Purwokerto, Central Java, by Raden Bei Aria Wirjaatmadja as De Poerwokertosche Hulp en Spaarbank der Inlandsche Hoofden.</w:t>
+            </w:r>
+          </w:p>
+        </w:tc>
+      </w:tr>
+      <w:tr>
+        <w:tc>
+          <w:tcPr>
+            <w:tcW w:w="1600" w:type="dxa"/>
+            <w:vAlign w:val="top"/>
+          </w:tcPr>
+          <w:p>
+            <w:pPr>
+              <w:spacing w:before="0" w:after="0" w:line="240" w:lineRule="auto"/>
+              <w:jc w:val="left"/>
+            </w:pPr>
+            <w:r>
+              <w:rPr>
+                <w:sz w:val="20"/>
+                <w:szCs w:val="20"/>
+              </w:rPr>
+              <w:t xml:space="preserve">1946</w:t>
+            </w:r>
+          </w:p>
+        </w:tc>
+        <w:tc>
+          <w:tcPr>
+            <w:tcW w:w="7426" w:type="dxa"/>
+            <w:vAlign w:val="top"/>
+          </w:tcPr>
+          <w:p>
+            <w:pPr>
+              <w:spacing w:before="0" w:after="0" w:line="240" w:lineRule="auto"/>
+              <w:jc w:val="left"/>
+            </w:pPr>
+            <w:r>
+              <w:rPr>
+                <w:sz w:val="20"/>
+                <w:szCs w:val="20"/>
+              </w:rPr>
+              <w:t xml:space="preserve">Became the first state-owned bank of the Republic of Indonesia under Article 1 of Government Regulation No. 1 of 1946.</w:t>
+            </w:r>
+          </w:p>
+        </w:tc>
+      </w:tr>
+      <w:tr>
+        <w:tc>
+          <w:tcPr>
+            <w:tcW w:w="1600" w:type="dxa"/>
+            <w:vAlign w:val="top"/>
+          </w:tcPr>
+          <w:p>
+            <w:pPr>
+              <w:spacing w:before="0" w:after="0" w:line="240" w:lineRule="auto"/>
+              <w:jc w:val="left"/>
+            </w:pPr>
+            <w:r>
+              <w:rPr>
+                <w:sz w:val="20"/>
+                <w:szCs w:val="20"/>
+              </w:rPr>
+              <w:t xml:space="preserve">1948 to 1949</w:t>
+            </w:r>
+          </w:p>
+        </w:tc>
+        <w:tc>
+          <w:tcPr>
+            <w:tcW w:w="7426" w:type="dxa"/>
+            <w:vAlign w:val="top"/>
+          </w:tcPr>
+          <w:p>
+            <w:pPr>
+              <w:spacing w:before="0" w:after="0" w:line="240" w:lineRule="auto"/>
+              <w:jc w:val="left"/>
+            </w:pPr>
+            <w:r>
+              <w:rPr>
+                <w:sz w:val="20"/>
+                <w:szCs w:val="20"/>
+              </w:rPr>
+              <w:t xml:space="preserve">Operations were suspended during the revolutionary war and resumed after the Renville Agreement, under the name Bank Rakyat Indonesia Serikat.</w:t>
+            </w:r>
+          </w:p>
+        </w:tc>
+      </w:tr>
+      <w:tr>
+        <w:tc>
+          <w:tcPr>
+            <w:tcW w:w="1600" w:type="dxa"/>
+            <w:vAlign w:val="top"/>
+          </w:tcPr>
+          <w:p>
+            <w:pPr>
+              <w:spacing w:before="0" w:after="0" w:line="240" w:lineRule="auto"/>
+              <w:jc w:val="left"/>
+            </w:pPr>
+            <w:r>
+              <w:rPr>
+                <w:sz w:val="20"/>
+                <w:szCs w:val="20"/>
+              </w:rPr>
+              <w:t xml:space="preserve">1960</w:t>
+            </w:r>
+          </w:p>
+        </w:tc>
+        <w:tc>
+          <w:tcPr>
+            <w:tcW w:w="7426" w:type="dxa"/>
+            <w:vAlign w:val="top"/>
+          </w:tcPr>
+          <w:p>
+            <w:pPr>
+              <w:spacing w:before="0" w:after="0" w:line="240" w:lineRule="auto"/>
+              <w:jc w:val="left"/>
+            </w:pPr>
+            <w:r>
+              <w:rPr>
+                <w:sz w:val="20"/>
+                <w:szCs w:val="20"/>
+              </w:rPr>
+              <w:t xml:space="preserve">Merged with Bank Tani Nelayan and Nederlandsche Handel-Maatschappij (NHM) into Bank Koperasi Tani dan Nelayan (BKTN) under PERPU No. 41 of 1960.</w:t>
+            </w:r>
+          </w:p>
+        </w:tc>
+      </w:tr>
+      <w:tr>
+        <w:tc>
+          <w:tcPr>
+            <w:tcW w:w="1600" w:type="dxa"/>
+            <w:vAlign w:val="top"/>
+          </w:tcPr>
+          <w:p>
+            <w:pPr>
+              <w:spacing w:before="0" w:after="0" w:line="240" w:lineRule="auto"/>
+              <w:jc w:val="left"/>
+            </w:pPr>
+            <w:r>
+              <w:rPr>
+                <w:sz w:val="20"/>
+                <w:szCs w:val="20"/>
+              </w:rPr>
+              <w:t xml:space="preserve">1965</w:t>
+            </w:r>
+          </w:p>
+        </w:tc>
+        <w:tc>
+          <w:tcPr>
+            <w:tcW w:w="7426" w:type="dxa"/>
+            <w:vAlign w:val="top"/>
+          </w:tcPr>
+          <w:p>
+            <w:pPr>
+              <w:spacing w:before="0" w:after="0" w:line="240" w:lineRule="auto"/>
+              <w:jc w:val="left"/>
+            </w:pPr>
+            <w:r>
+              <w:rPr>
+                <w:sz w:val="20"/>
+                <w:szCs w:val="20"/>
+              </w:rPr>
+              <w:t xml:space="preserve">BKTN was integrated into Bank Indonesia and then into Bank Negara Indonesia Unit II (Rural Sector) under Presidential Decrees No. 9 and No. 17 of 1965.</w:t>
+            </w:r>
+          </w:p>
+        </w:tc>
+      </w:tr>
+      <w:tr>
+        <w:tc>
+          <w:tcPr>
+            <w:tcW w:w="1600" w:type="dxa"/>
+            <w:vAlign w:val="top"/>
+          </w:tcPr>
+          <w:p>
+            <w:pPr>
+              <w:spacing w:before="0" w:after="0" w:line="240" w:lineRule="auto"/>
+              <w:jc w:val="left"/>
+            </w:pPr>
+            <w:r>
+              <w:rPr>
+                <w:sz w:val="20"/>
+                <w:szCs w:val="20"/>
+              </w:rPr>
+              <w:t xml:space="preserve">1992</w:t>
+            </w:r>
+          </w:p>
+        </w:tc>
+        <w:tc>
+          <w:tcPr>
+            <w:tcW w:w="7426" w:type="dxa"/>
+            <w:vAlign w:val="top"/>
+          </w:tcPr>
+          <w:p>
+            <w:pPr>
+              <w:spacing w:before="0" w:after="0" w:line="240" w:lineRule="auto"/>
+              <w:jc w:val="left"/>
+            </w:pPr>
+            <w:r>
+              <w:rPr>
+                <w:sz w:val="20"/>
+                <w:szCs w:val="20"/>
+              </w:rPr>
+              <w:t xml:space="preserve">Became a limited liability company (Persero) on 1 August 1992 under Banking Law No. 7 of 1992 and Government Regulation No. 21 of 1992, wholly owned by the Government.</w:t>
+            </w:r>
+          </w:p>
+        </w:tc>
+      </w:tr>
+      <w:tr>
+        <w:tc>
+          <w:tcPr>
+            <w:tcW w:w="1600" w:type="dxa"/>
+            <w:vAlign w:val="top"/>
+          </w:tcPr>
+          <w:p>
+            <w:pPr>
+              <w:spacing w:before="0" w:after="0" w:line="240" w:lineRule="auto"/>
+              <w:jc w:val="left"/>
+            </w:pPr>
+            <w:r>
+              <w:rPr>
+                <w:sz w:val="20"/>
+                <w:szCs w:val="20"/>
+              </w:rPr>
+              <w:t xml:space="preserve">2003</w:t>
+            </w:r>
+          </w:p>
+        </w:tc>
+        <w:tc>
+          <w:tcPr>
+            <w:tcW w:w="7426" w:type="dxa"/>
+            <w:vAlign w:val="top"/>
+          </w:tcPr>
+          <w:p>
+            <w:pPr>
+              <w:spacing w:before="0" w:after="0" w:line="240" w:lineRule="auto"/>
+              <w:jc w:val="left"/>
+            </w:pPr>
+            <w:r>
+              <w:rPr>
+                <w:sz w:val="20"/>
+                <w:szCs w:val="20"/>
+              </w:rPr>
+              <w:t xml:space="preserve">The Government sold 30% of its shares to the public, and the bank became PT Bank Rakyat Indonesia (Persero) Tbk.</w:t>
+            </w:r>
+          </w:p>
+        </w:tc>
+      </w:tr>
+      <w:tr>
+        <w:tc>
+          <w:tcPr>
+            <w:tcW w:w="1600" w:type="dxa"/>
+            <w:vAlign w:val="top"/>
+          </w:tcPr>
+          <w:p>
+            <w:pPr>
+              <w:spacing w:before="0" w:after="0" w:line="240" w:lineRule="auto"/>
+              <w:jc w:val="left"/>
+            </w:pPr>
+            <w:r>
+              <w:rPr>
+                <w:sz w:val="20"/>
+                <w:szCs w:val="20"/>
+              </w:rPr>
+              <w:t xml:space="preserve">2025</w:t>
+            </w:r>
+          </w:p>
+        </w:tc>
+        <w:tc>
+          <w:tcPr>
+            <w:tcW w:w="7426" w:type="dxa"/>
+            <w:vAlign w:val="top"/>
+          </w:tcPr>
+          <w:p>
+            <w:pPr>
+              <w:spacing w:before="0" w:after="0" w:line="240" w:lineRule="auto"/>
+              <w:jc w:val="left"/>
+            </w:pPr>
+            <w:r>
+              <w:rPr>
+                <w:sz w:val="20"/>
+                <w:szCs w:val="20"/>
+              </w:rPr>
+              <w:t xml:space="preserve">Marked 130 years of operation, continued its transformation under BRIvolution Reignite, and adopted the BRILiaN Way corporate culture; the state's Series B shares are now held through PT Danantara Asset Management (Persero).</w:t>
+            </w:r>
+          </w:p>
+        </w:tc>
+      </w:tr>
+    </w:tbl>
+    <w:p>
+      <w:pPr>
+        <w:spacing w:before="0" w:after="60" w:line="240" w:lineRule="auto"/>
+        <w:jc w:val="both"/>
+      </w:pPr>
+    </w:p>
+    <w:p>
+      <w:pPr>
+        <w:keepNext w:val="1"/>
+        <w:spacing w:before="240" w:after="120" w:line="360" w:lineRule="auto"/>
+        <w:jc w:val="left"/>
+      </w:pPr>
+      <w:r>
+        <w:rPr>
+          <w:b w:val="1"/>
+          <w:sz w:val="24"/>
+          <w:szCs w:val="24"/>
+        </w:rPr>
+        <w:t xml:space="preserve">2.5 Organizational Structure</w:t>
+      </w:r>
+    </w:p>
+    <w:p>
+      <w:pPr>
+        <w:spacing w:before="0" w:after="120" w:line="360" w:lineRule="auto"/>
+        <w:jc w:val="both"/>
+      </w:pPr>
+      <w:r>
+        <w:rPr>
+          <w:sz w:val="24"/>
+          <w:szCs w:val="24"/>
+        </w:rPr>
+        <w:t xml:space="preserve">Figure 2.1 shows BRI's organizational structure. The General Meeting of Shareholders (Rapat Umum Pemegang Saham) is the highest authority. The Board of Commissioners (Dewan Komisaris) supervises the Board of Directors and is supported by committees for audit, nomination and remuneration, risk monitoring, and integrated governance. The President Director (Direktur Utama) leads the Board of Directors, together with the Vice President Director (Wakil Direktur Utama).</w:t>
+      </w:r>
+    </w:p>
+    <w:p>
+      <w:pPr>
+        <w:keepNext/>
+        <w:jc w:val="center"/>
+      </w:pPr>
+      <w:r>
+        <w:drawing>
+          <wp:inline>
+            <wp:extent cx="5669280" cy="3188970"/>
+            <wp:docPr id="2" name="Picture 2"/>
+            <wp:cNvGraphicFramePr>
+              <a:graphicFrameLocks noChangeAspect="1"/>
+            </wp:cNvGraphicFramePr>
+            <a:graphic>
+              <a:graphicData uri="http://schemas.openxmlformats.org/drawingml/2006/picture">
+                <pic:pic>
+                  <pic:nvPicPr>
+                    <pic:cNvPr id="0" name="bri_org.jpg"/>
+                    <pic:cNvPicPr/>
+                  </pic:nvPicPr>
+                  <pic:blipFill>
+                    <a:blip r:embed="rId8"/>
+                    <a:stretch>
+                      <a:fillRect/>
+                    </a:stretch>
+                  </pic:blipFill>
+                  <pic:spPr>
+                    <a:xfrm>
+                      <a:off x="0" y="0"/>
+                      <a:ext cx="5669280" cy="3188970"/>
+                    </a:xfrm>
+                    <a:prstGeom prst="rect"/>
+                  </pic:spPr>
+                </pic:pic>
+              </a:graphicData>
+            </a:graphic>
+          </wp:inline>
+        </w:drawing>
+      </w:r>
+    </w:p>
+    <w:p>
+      <w:pPr>
+        <w:spacing w:before="60" w:after="160" w:line="240" w:lineRule="auto"/>
+        <w:jc w:val="center"/>
+      </w:pPr>
+      <w:r>
+        <w:rPr>
+          <w:b w:val="1"/>
+          <w:sz w:val="20"/>
+          <w:szCs w:val="20"/>
+        </w:rPr>
+        <w:t xml:space="preserve">Figure 2.1 Organizational structure of PT Bank Rakyat Indonesia (Persero) Tbk (source: bri.co.id)</w:t>
+      </w:r>
+    </w:p>
+    <w:p>
+      <w:pPr>
+        <w:spacing w:before="0" w:after="120" w:line="360" w:lineRule="auto"/>
+        <w:jc w:val="both"/>
+      </w:pPr>
+      <w:r>
+        <w:rPr>
+          <w:sz w:val="24"/>
+          <w:szCs w:val="24"/>
+        </w:rPr>
+        <w:t xml:space="preserve">Below the President Director and Vice President Director, the bank is organized into directorates: Micro, Operations, Treasury &amp; International Banking, Corporate Banking, Commercial Banking, Consumer Banking, Network &amp; Retail Funding, Information Technology, Risk Management, Human Capital &amp; Compliance, and Finance &amp; Strategy. Senior Executive Vice President (SEVP) units handle Retail Transaction &amp; Funding, Digital, Retail Risk, Wholesale Risk, Human Capital, Corporate Transformation, and Internal Audit. Directors are further supported by committees covering asset and liability management (ALCO), capital and investment, human capital, information technology, procurement, credit and policy, products, transformation, risk management, and ESG. Table 2.6 lists the members of the Board of Commissioners and Board of Directors as published on the BRI website.</w:t>
+      </w:r>
+    </w:p>
+    <w:p>
+      <w:pPr>
+        <w:keepNext w:val="1"/>
+        <w:spacing w:before="120" w:after="60" w:line="240" w:lineRule="auto"/>
+        <w:jc w:val="center"/>
+      </w:pPr>
+      <w:r>
+        <w:rPr>
+          <w:b w:val="1"/>
+          <w:sz w:val="20"/>
+          <w:szCs w:val="20"/>
+        </w:rPr>
+        <w:t xml:space="preserve">Table 2.6 BRI Board of Commissioners and Board of Directors</w:t>
+      </w:r>
+    </w:p>
+    <w:tbl>
+      <w:tblPr>
+        <w:tblW w:w="9026" w:type="dxa"/>
+        <w:tblBorders>
+          <w:top w:val="single" w:sz="4" w:space="0" w:color="808080"/>
+          <w:left w:val="single" w:sz="4" w:space="0" w:color="808080"/>
+          <w:bottom w:val="single" w:sz="4" w:space="0" w:color="808080"/>
+          <w:right w:val="single" w:sz="4" w:space="0" w:color="808080"/>
+          <w:insideH w:val="single" w:sz="4" w:space="0" w:color="808080"/>
+          <w:insideV w:val="single" w:sz="4" w:space="0" w:color="808080"/>
+        </w:tblBorders>
+        <w:tblLayout w:type="fixed"/>
+        <w:tblCellMar>
+          <w:top w:w="40" w:type="dxa"/>
+          <w:left w:w="100" w:type="dxa"/>
+          <w:bottom w:w="40" w:type="dxa"/>
+          <w:right w:w="100" w:type="dxa"/>
+        </w:tblCellMar>
+      </w:tblPr>
+      <w:tblGrid>
+        <w:gridCol w:w="3800"/>
+        <w:gridCol w:w="5226"/>
+      </w:tblGrid>
+      <w:tr>
+        <w:trPr>
+          <w:tblHeader w:val="1"/>
+        </w:trPr>
+        <w:tc>
+          <w:tcPr>
+            <w:tcW w:w="3800" w:type="dxa"/>
+            <w:shd w:val="clear" w:color="auto" w:fill="D9D9D9"/>
+            <w:vAlign w:val="top"/>
+          </w:tcPr>
+          <w:p>
+            <w:pPr>
+              <w:spacing w:before="0" w:after="0" w:line="240" w:lineRule="auto"/>
+              <w:jc w:val="left"/>
+            </w:pPr>
+            <w:r>
+              <w:rPr>
+                <w:b w:val="1"/>
+                <w:sz w:val="20"/>
+                <w:szCs w:val="20"/>
+              </w:rPr>
+              <w:t xml:space="preserve">Name</w:t>
+            </w:r>
+          </w:p>
+        </w:tc>
+        <w:tc>
+          <w:tcPr>
+            <w:tcW w:w="5226" w:type="dxa"/>
+            <w:shd w:val="clear" w:color="auto" w:fill="D9D9D9"/>
+            <w:vAlign w:val="top"/>
+          </w:tcPr>
+          <w:p>
+            <w:pPr>
+              <w:spacing w:before="0" w:after="0" w:line="240" w:lineRule="auto"/>
+              <w:jc w:val="left"/>
+            </w:pPr>
+            <w:r>
+              <w:rPr>
+                <w:b w:val="1"/>
+                <w:sz w:val="20"/>
+                <w:szCs w:val="20"/>
+              </w:rPr>
+              <w:t xml:space="preserve">Position</w:t>
+            </w:r>
+          </w:p>
+        </w:tc>
+      </w:tr>
+      <w:tr>
+        <w:tc>
+          <w:tcPr>
+            <w:tcW w:w="3800" w:type="dxa"/>
+            <w:vAlign w:val="top"/>
+          </w:tcPr>
+          <w:p>
+            <w:pPr>
+              <w:spacing w:before="0" w:after="0" w:line="240" w:lineRule="auto"/>
+              <w:jc w:val="left"/>
+            </w:pPr>
+            <w:r>
+              <w:rPr>
+                <w:sz w:val="20"/>
+                <w:szCs w:val="20"/>
+              </w:rPr>
+              <w:t xml:space="preserve">Kartika Wirjoatmodjo</w:t>
+            </w:r>
+          </w:p>
+        </w:tc>
+        <w:tc>
+          <w:tcPr>
+            <w:tcW w:w="5226" w:type="dxa"/>
+            <w:vAlign w:val="top"/>
+          </w:tcPr>
+          <w:p>
+            <w:pPr>
+              <w:spacing w:before="0" w:after="0" w:line="240" w:lineRule="auto"/>
+              <w:jc w:val="left"/>
+            </w:pPr>
+            <w:r>
+              <w:rPr>
+                <w:sz w:val="20"/>
+                <w:szCs w:val="20"/>
+              </w:rPr>
+              <w:t xml:space="preserve">President Commissioner</w:t>
+            </w:r>
+          </w:p>
+        </w:tc>
+      </w:tr>
+      <w:tr>
+        <w:tc>
+          <w:tcPr>
+            <w:tcW w:w="3800" w:type="dxa"/>
+            <w:vAlign w:val="top"/>
+          </w:tcPr>
+          <w:p>
+            <w:pPr>
+              <w:spacing w:before="0" w:after="0" w:line="240" w:lineRule="auto"/>
+              <w:jc w:val="left"/>
+            </w:pPr>
+            <w:r>
+              <w:rPr>
+                <w:sz w:val="20"/>
+                <w:szCs w:val="20"/>
+              </w:rPr>
+              <w:t xml:space="preserve">Parman Nataatmadja</w:t>
+            </w:r>
+          </w:p>
+        </w:tc>
+        <w:tc>
+          <w:tcPr>
+            <w:tcW w:w="5226" w:type="dxa"/>
+            <w:vAlign w:val="top"/>
+          </w:tcPr>
+          <w:p>
+            <w:pPr>
+              <w:spacing w:before="0" w:after="0" w:line="240" w:lineRule="auto"/>
+              <w:jc w:val="left"/>
+            </w:pPr>
+            <w:r>
+              <w:rPr>
+                <w:sz w:val="20"/>
+                <w:szCs w:val="20"/>
+              </w:rPr>
+              <w:t xml:space="preserve">Vice President Commissioner / Independent Commissioner</w:t>
+            </w:r>
+          </w:p>
+        </w:tc>
+      </w:tr>
+      <w:tr>
+        <w:tc>
+          <w:tcPr>
+            <w:tcW w:w="3800" w:type="dxa"/>
+            <w:vAlign w:val="top"/>
+          </w:tcPr>
+          <w:p>
+            <w:pPr>
+              <w:spacing w:before="0" w:after="0" w:line="240" w:lineRule="auto"/>
+              <w:jc w:val="left"/>
+            </w:pPr>
+            <w:r>
+              <w:rPr>
+                <w:sz w:val="20"/>
+                <w:szCs w:val="20"/>
+              </w:rPr>
+              <w:t xml:space="preserve">Awan Nurmawan Nuh</w:t>
+            </w:r>
+          </w:p>
+        </w:tc>
+        <w:tc>
+          <w:tcPr>
+            <w:tcW w:w="5226" w:type="dxa"/>
+            <w:vAlign w:val="top"/>
+          </w:tcPr>
+          <w:p>
+            <w:pPr>
+              <w:spacing w:before="0" w:after="0" w:line="240" w:lineRule="auto"/>
+              <w:jc w:val="left"/>
+            </w:pPr>
+            <w:r>
+              <w:rPr>
+                <w:sz w:val="20"/>
+                <w:szCs w:val="20"/>
+              </w:rPr>
+              <w:t xml:space="preserve">Commissioner</w:t>
+            </w:r>
+          </w:p>
+        </w:tc>
+      </w:tr>
+      <w:tr>
+        <w:tc>
+          <w:tcPr>
+            <w:tcW w:w="3800" w:type="dxa"/>
+            <w:vAlign w:val="top"/>
+          </w:tcPr>
+          <w:p>
+            <w:pPr>
+              <w:spacing w:before="0" w:after="0" w:line="240" w:lineRule="auto"/>
+              <w:jc w:val="left"/>
+            </w:pPr>
+            <w:r>
+              <w:rPr>
+                <w:sz w:val="20"/>
+                <w:szCs w:val="20"/>
+              </w:rPr>
+              <w:t xml:space="preserve">Helvi Yuni Moraza</w:t>
+            </w:r>
+          </w:p>
+        </w:tc>
+        <w:tc>
+          <w:tcPr>
+            <w:tcW w:w="5226" w:type="dxa"/>
+            <w:vAlign w:val="top"/>
+          </w:tcPr>
+          <w:p>
+            <w:pPr>
+              <w:spacing w:before="0" w:after="0" w:line="240" w:lineRule="auto"/>
+              <w:jc w:val="left"/>
+            </w:pPr>
+            <w:r>
+              <w:rPr>
+                <w:sz w:val="20"/>
+                <w:szCs w:val="20"/>
+              </w:rPr>
+              <w:t xml:space="preserve">Commissioner</w:t>
+            </w:r>
+          </w:p>
+        </w:tc>
+      </w:tr>
+      <w:tr>
+        <w:tc>
+          <w:tcPr>
+            <w:tcW w:w="3800" w:type="dxa"/>
+            <w:vAlign w:val="top"/>
+          </w:tcPr>
+          <w:p>
+            <w:pPr>
+              <w:spacing w:before="0" w:after="0" w:line="240" w:lineRule="auto"/>
+              <w:jc w:val="left"/>
+            </w:pPr>
+            <w:r>
+              <w:rPr>
+                <w:sz w:val="20"/>
+                <w:szCs w:val="20"/>
+              </w:rPr>
+              <w:t xml:space="preserve">Edi Susianto</w:t>
+            </w:r>
+          </w:p>
+        </w:tc>
+        <w:tc>
+          <w:tcPr>
+            <w:tcW w:w="5226" w:type="dxa"/>
+            <w:vAlign w:val="top"/>
+          </w:tcPr>
+          <w:p>
+            <w:pPr>
+              <w:spacing w:before="0" w:after="0" w:line="240" w:lineRule="auto"/>
+              <w:jc w:val="left"/>
+            </w:pPr>
+            <w:r>
+              <w:rPr>
+                <w:sz w:val="20"/>
+                <w:szCs w:val="20"/>
+              </w:rPr>
+              <w:t xml:space="preserve">Independent Commissioner</w:t>
+            </w:r>
+          </w:p>
+        </w:tc>
+      </w:tr>
+      <w:tr>
+        <w:tc>
+          <w:tcPr>
+            <w:tcW w:w="3800" w:type="dxa"/>
+            <w:vAlign w:val="top"/>
+          </w:tcPr>
+          <w:p>
+            <w:pPr>
+              <w:spacing w:before="0" w:after="0" w:line="240" w:lineRule="auto"/>
+              <w:jc w:val="left"/>
+            </w:pPr>
+            <w:r>
+              <w:rPr>
+                <w:sz w:val="20"/>
+                <w:szCs w:val="20"/>
+              </w:rPr>
+              <w:t xml:space="preserve">Lukmanul Khakim</w:t>
+            </w:r>
+          </w:p>
+        </w:tc>
+        <w:tc>
+          <w:tcPr>
+            <w:tcW w:w="5226" w:type="dxa"/>
+            <w:vAlign w:val="top"/>
+          </w:tcPr>
+          <w:p>
+            <w:pPr>
+              <w:spacing w:before="0" w:after="0" w:line="240" w:lineRule="auto"/>
+              <w:jc w:val="left"/>
+            </w:pPr>
+            <w:r>
+              <w:rPr>
+                <w:sz w:val="20"/>
+                <w:szCs w:val="20"/>
+              </w:rPr>
+              <w:t xml:space="preserve">Independent Commissioner</w:t>
+            </w:r>
+          </w:p>
+        </w:tc>
+      </w:tr>
+      <w:tr>
+        <w:tc>
+          <w:tcPr>
+            <w:tcW w:w="3800" w:type="dxa"/>
+            <w:vAlign w:val="top"/>
+          </w:tcPr>
+          <w:p>
+            <w:pPr>
+              <w:spacing w:before="0" w:after="0" w:line="240" w:lineRule="auto"/>
+              <w:jc w:val="left"/>
+            </w:pPr>
+            <w:r>
+              <w:rPr>
+                <w:sz w:val="20"/>
+                <w:szCs w:val="20"/>
+              </w:rPr>
+              <w:t xml:space="preserve">Hery Gunardi</w:t>
+            </w:r>
+          </w:p>
+        </w:tc>
+        <w:tc>
+          <w:tcPr>
+            <w:tcW w:w="5226" w:type="dxa"/>
+            <w:vAlign w:val="top"/>
+          </w:tcPr>
+          <w:p>
+            <w:pPr>
+              <w:spacing w:before="0" w:after="0" w:line="240" w:lineRule="auto"/>
+              <w:jc w:val="left"/>
+            </w:pPr>
+            <w:r>
+              <w:rPr>
+                <w:sz w:val="20"/>
+                <w:szCs w:val="20"/>
+              </w:rPr>
+              <w:t xml:space="preserve">President Director</w:t>
+            </w:r>
+          </w:p>
+        </w:tc>
+      </w:tr>
+      <w:tr>
+        <w:tc>
+          <w:tcPr>
+            <w:tcW w:w="3800" w:type="dxa"/>
+            <w:vAlign w:val="top"/>
+          </w:tcPr>
+          <w:p>
+            <w:pPr>
+              <w:spacing w:before="0" w:after="0" w:line="240" w:lineRule="auto"/>
+              <w:jc w:val="left"/>
+            </w:pPr>
+            <w:r>
+              <w:rPr>
+                <w:sz w:val="20"/>
+                <w:szCs w:val="20"/>
+              </w:rPr>
+              <w:t xml:space="preserve">Viviana Dyah Ayu Retno</w:t>
+            </w:r>
+          </w:p>
+        </w:tc>
+        <w:tc>
+          <w:tcPr>
+            <w:tcW w:w="5226" w:type="dxa"/>
+            <w:vAlign w:val="top"/>
+          </w:tcPr>
+          <w:p>
+            <w:pPr>
+              <w:spacing w:before="0" w:after="0" w:line="240" w:lineRule="auto"/>
+              <w:jc w:val="left"/>
+            </w:pPr>
+            <w:r>
+              <w:rPr>
+                <w:sz w:val="20"/>
+                <w:szCs w:val="20"/>
+              </w:rPr>
+              <w:t xml:space="preserve">Vice President Director</w:t>
+            </w:r>
+          </w:p>
+        </w:tc>
+      </w:tr>
+      <w:tr>
+        <w:tc>
+          <w:tcPr>
+            <w:tcW w:w="3800" w:type="dxa"/>
+            <w:vAlign w:val="top"/>
+          </w:tcPr>
+          <w:p>
+            <w:pPr>
+              <w:spacing w:before="0" w:after="0" w:line="240" w:lineRule="auto"/>
+              <w:jc w:val="left"/>
+            </w:pPr>
+            <w:r>
+              <w:rPr>
+                <w:sz w:val="20"/>
+                <w:szCs w:val="20"/>
+              </w:rPr>
+              <w:t xml:space="preserve">Achmad Royadi</w:t>
+            </w:r>
+          </w:p>
+        </w:tc>
+        <w:tc>
+          <w:tcPr>
+            <w:tcW w:w="5226" w:type="dxa"/>
+            <w:vAlign w:val="top"/>
+          </w:tcPr>
+          <w:p>
+            <w:pPr>
+              <w:spacing w:before="0" w:after="0" w:line="240" w:lineRule="auto"/>
+              <w:jc w:val="left"/>
+            </w:pPr>
+            <w:r>
+              <w:rPr>
+                <w:sz w:val="20"/>
+                <w:szCs w:val="20"/>
+              </w:rPr>
+              <w:t xml:space="preserve">Director of Finance &amp; Strategy</w:t>
+            </w:r>
+          </w:p>
+        </w:tc>
+      </w:tr>
+      <w:tr>
+        <w:tc>
+          <w:tcPr>
+            <w:tcW w:w="3800" w:type="dxa"/>
+            <w:vAlign w:val="top"/>
+          </w:tcPr>
+          <w:p>
+            <w:pPr>
+              <w:spacing w:before="0" w:after="0" w:line="240" w:lineRule="auto"/>
+              <w:jc w:val="left"/>
+            </w:pPr>
+            <w:r>
+              <w:rPr>
+                <w:sz w:val="20"/>
+                <w:szCs w:val="20"/>
+              </w:rPr>
+              <w:t xml:space="preserve">Aquarius Rudianto</w:t>
+            </w:r>
+          </w:p>
+        </w:tc>
+        <w:tc>
+          <w:tcPr>
+            <w:tcW w:w="5226" w:type="dxa"/>
+            <w:vAlign w:val="top"/>
+          </w:tcPr>
+          <w:p>
+            <w:pPr>
+              <w:spacing w:before="0" w:after="0" w:line="240" w:lineRule="auto"/>
+              <w:jc w:val="left"/>
+            </w:pPr>
+            <w:r>
+              <w:rPr>
+                <w:sz w:val="20"/>
+                <w:szCs w:val="20"/>
+              </w:rPr>
+              <w:t xml:space="preserve">Director of Network and Retail Funding</w:t>
+            </w:r>
+          </w:p>
+        </w:tc>
+      </w:tr>
+      <w:tr>
+        <w:tc>
+          <w:tcPr>
+            <w:tcW w:w="3800" w:type="dxa"/>
+            <w:vAlign w:val="top"/>
+          </w:tcPr>
+          <w:p>
+            <w:pPr>
+              <w:spacing w:before="0" w:after="0" w:line="240" w:lineRule="auto"/>
+              <w:jc w:val="left"/>
+            </w:pPr>
+            <w:r>
+              <w:rPr>
+                <w:sz w:val="20"/>
+                <w:szCs w:val="20"/>
+              </w:rPr>
+              <w:t xml:space="preserve">Alexander Dippo Paris Y. S.</w:t>
+            </w:r>
+          </w:p>
+        </w:tc>
+        <w:tc>
+          <w:tcPr>
+            <w:tcW w:w="5226" w:type="dxa"/>
+            <w:vAlign w:val="top"/>
+          </w:tcPr>
+          <w:p>
+            <w:pPr>
+              <w:spacing w:before="0" w:after="0" w:line="240" w:lineRule="auto"/>
+              <w:jc w:val="left"/>
+            </w:pPr>
+            <w:r>
+              <w:rPr>
+                <w:sz w:val="20"/>
+                <w:szCs w:val="20"/>
+              </w:rPr>
+              <w:t xml:space="preserve">Director of Commercial Banking</w:t>
+            </w:r>
+          </w:p>
+        </w:tc>
+      </w:tr>
+      <w:tr>
+        <w:tc>
+          <w:tcPr>
+            <w:tcW w:w="3800" w:type="dxa"/>
+            <w:vAlign w:val="top"/>
+          </w:tcPr>
+          <w:p>
+            <w:pPr>
+              <w:spacing w:before="0" w:after="0" w:line="240" w:lineRule="auto"/>
+              <w:jc w:val="left"/>
+            </w:pPr>
+            <w:r>
+              <w:rPr>
+                <w:sz w:val="20"/>
+                <w:szCs w:val="20"/>
+              </w:rPr>
+              <w:t xml:space="preserve">Saladin Dharma Nugraha Effendi</w:t>
+            </w:r>
+          </w:p>
+        </w:tc>
+        <w:tc>
+          <w:tcPr>
+            <w:tcW w:w="5226" w:type="dxa"/>
+            <w:vAlign w:val="top"/>
+          </w:tcPr>
+          <w:p>
+            <w:pPr>
+              <w:spacing w:before="0" w:after="0" w:line="240" w:lineRule="auto"/>
+              <w:jc w:val="left"/>
+            </w:pPr>
+            <w:r>
+              <w:rPr>
+                <w:sz w:val="20"/>
+                <w:szCs w:val="20"/>
+              </w:rPr>
+              <w:t xml:space="preserve">Director of Information Technology</w:t>
+            </w:r>
+          </w:p>
+        </w:tc>
+      </w:tr>
+      <w:tr>
+        <w:tc>
+          <w:tcPr>
+            <w:tcW w:w="3800" w:type="dxa"/>
+            <w:vAlign w:val="top"/>
+          </w:tcPr>
+          <w:p>
+            <w:pPr>
+              <w:spacing w:before="0" w:after="0" w:line="240" w:lineRule="auto"/>
+              <w:jc w:val="left"/>
+            </w:pPr>
+            <w:r>
+              <w:rPr>
+                <w:sz w:val="20"/>
+                <w:szCs w:val="20"/>
+              </w:rPr>
+              <w:t xml:space="preserve">Riko Tasmaya</w:t>
+            </w:r>
+          </w:p>
+        </w:tc>
+        <w:tc>
+          <w:tcPr>
+            <w:tcW w:w="5226" w:type="dxa"/>
+            <w:vAlign w:val="top"/>
+          </w:tcPr>
+          <w:p>
+            <w:pPr>
+              <w:spacing w:before="0" w:after="0" w:line="240" w:lineRule="auto"/>
+              <w:jc w:val="left"/>
+            </w:pPr>
+            <w:r>
+              <w:rPr>
+                <w:sz w:val="20"/>
+                <w:szCs w:val="20"/>
+              </w:rPr>
+              <w:t xml:space="preserve">Director of Corporate Banking</w:t>
+            </w:r>
+          </w:p>
+        </w:tc>
+      </w:tr>
+      <w:tr>
+        <w:tc>
+          <w:tcPr>
+            <w:tcW w:w="3800" w:type="dxa"/>
+            <w:vAlign w:val="top"/>
+          </w:tcPr>
+          <w:p>
+            <w:pPr>
+              <w:spacing w:before="0" w:after="0" w:line="240" w:lineRule="auto"/>
+              <w:jc w:val="left"/>
+            </w:pPr>
+            <w:r>
+              <w:rPr>
+                <w:sz w:val="20"/>
+                <w:szCs w:val="20"/>
+              </w:rPr>
+              <w:t xml:space="preserve">Hakim Putratama</w:t>
+            </w:r>
+          </w:p>
+        </w:tc>
+        <w:tc>
+          <w:tcPr>
+            <w:tcW w:w="5226" w:type="dxa"/>
+            <w:vAlign w:val="top"/>
+          </w:tcPr>
+          <w:p>
+            <w:pPr>
+              <w:spacing w:before="0" w:after="0" w:line="240" w:lineRule="auto"/>
+              <w:jc w:val="left"/>
+            </w:pPr>
+            <w:r>
+              <w:rPr>
+                <w:sz w:val="20"/>
+                <w:szCs w:val="20"/>
+              </w:rPr>
+              <w:t xml:space="preserve">Director of Operations</w:t>
+            </w:r>
+          </w:p>
+        </w:tc>
+      </w:tr>
+      <w:tr>
+        <w:tc>
+          <w:tcPr>
+            <w:tcW w:w="3800" w:type="dxa"/>
+            <w:vAlign w:val="top"/>
+          </w:tcPr>
+          <w:p>
+            <w:pPr>
+              <w:spacing w:before="0" w:after="0" w:line="240" w:lineRule="auto"/>
+              <w:jc w:val="left"/>
+            </w:pPr>
+            <w:r>
+              <w:rPr>
+                <w:sz w:val="20"/>
+                <w:szCs w:val="20"/>
+              </w:rPr>
+              <w:t xml:space="preserve">Akhmad Purwakajaya</w:t>
+            </w:r>
+          </w:p>
+        </w:tc>
+        <w:tc>
+          <w:tcPr>
+            <w:tcW w:w="5226" w:type="dxa"/>
+            <w:vAlign w:val="top"/>
+          </w:tcPr>
+          <w:p>
+            <w:pPr>
+              <w:spacing w:before="0" w:after="0" w:line="240" w:lineRule="auto"/>
+              <w:jc w:val="left"/>
+            </w:pPr>
+            <w:r>
+              <w:rPr>
+                <w:sz w:val="20"/>
+                <w:szCs w:val="20"/>
+              </w:rPr>
+              <w:t xml:space="preserve">Director of Micro</w:t>
+            </w:r>
+          </w:p>
+        </w:tc>
+      </w:tr>
+      <w:tr>
+        <w:tc>
+          <w:tcPr>
+            <w:tcW w:w="3800" w:type="dxa"/>
+            <w:vAlign w:val="top"/>
+          </w:tcPr>
+          <w:p>
+            <w:pPr>
+              <w:spacing w:before="0" w:after="0" w:line="240" w:lineRule="auto"/>
+              <w:jc w:val="left"/>
+            </w:pPr>
+            <w:r>
+              <w:rPr>
+                <w:sz w:val="20"/>
+                <w:szCs w:val="20"/>
+              </w:rPr>
+              <w:t xml:space="preserve">Farida Thamrin</w:t>
+            </w:r>
+          </w:p>
+        </w:tc>
+        <w:tc>
+          <w:tcPr>
+            <w:tcW w:w="5226" w:type="dxa"/>
+            <w:vAlign w:val="top"/>
+          </w:tcPr>
+          <w:p>
+            <w:pPr>
+              <w:spacing w:before="0" w:after="0" w:line="240" w:lineRule="auto"/>
+              <w:jc w:val="left"/>
+            </w:pPr>
+            <w:r>
+              <w:rPr>
+                <w:sz w:val="20"/>
+                <w:szCs w:val="20"/>
+              </w:rPr>
+              <w:t xml:space="preserve">Director of Treasury and International Banking</w:t>
+            </w:r>
+          </w:p>
+        </w:tc>
+      </w:tr>
+      <w:tr>
+        <w:tc>
+          <w:tcPr>
+            <w:tcW w:w="3800" w:type="dxa"/>
+            <w:vAlign w:val="top"/>
+          </w:tcPr>
+          <w:p>
+            <w:pPr>
+              <w:spacing w:before="0" w:after="0" w:line="240" w:lineRule="auto"/>
+              <w:jc w:val="left"/>
+            </w:pPr>
+            <w:r>
+              <w:rPr>
+                <w:sz w:val="20"/>
+                <w:szCs w:val="20"/>
+              </w:rPr>
+              <w:t xml:space="preserve">Ety Yuniarti</w:t>
+            </w:r>
+          </w:p>
+        </w:tc>
+        <w:tc>
+          <w:tcPr>
+            <w:tcW w:w="5226" w:type="dxa"/>
+            <w:vAlign w:val="top"/>
+          </w:tcPr>
+          <w:p>
+            <w:pPr>
+              <w:spacing w:before="0" w:after="0" w:line="240" w:lineRule="auto"/>
+              <w:jc w:val="left"/>
+            </w:pPr>
+            <w:r>
+              <w:rPr>
+                <w:sz w:val="20"/>
+                <w:szCs w:val="20"/>
+              </w:rPr>
+              <w:t xml:space="preserve">Director of Risk Management</w:t>
+            </w:r>
+          </w:p>
+        </w:tc>
+      </w:tr>
+      <w:tr>
+        <w:tc>
+          <w:tcPr>
+            <w:tcW w:w="3800" w:type="dxa"/>
+            <w:vAlign w:val="top"/>
+          </w:tcPr>
+          <w:p>
+            <w:pPr>
+              <w:spacing w:before="0" w:after="0" w:line="240" w:lineRule="auto"/>
+              <w:jc w:val="left"/>
+            </w:pPr>
+            <w:r>
+              <w:rPr>
+                <w:sz w:val="20"/>
+                <w:szCs w:val="20"/>
+              </w:rPr>
+              <w:t xml:space="preserve">Aris Hartanto</w:t>
+            </w:r>
+          </w:p>
+        </w:tc>
+        <w:tc>
+          <w:tcPr>
+            <w:tcW w:w="5226" w:type="dxa"/>
+            <w:vAlign w:val="top"/>
+          </w:tcPr>
+          <w:p>
+            <w:pPr>
+              <w:spacing w:before="0" w:after="0" w:line="240" w:lineRule="auto"/>
+              <w:jc w:val="left"/>
+            </w:pPr>
+            <w:r>
+              <w:rPr>
+                <w:sz w:val="20"/>
+                <w:szCs w:val="20"/>
+              </w:rPr>
+              <w:t xml:space="preserve">Director of Consumer Banking</w:t>
+            </w:r>
+          </w:p>
+        </w:tc>
+      </w:tr>
+      <w:tr>
+        <w:tc>
+          <w:tcPr>
+            <w:tcW w:w="3800" w:type="dxa"/>
+            <w:vAlign w:val="top"/>
+          </w:tcPr>
+          <w:p>
+            <w:pPr>
+              <w:spacing w:before="0" w:after="0" w:line="240" w:lineRule="auto"/>
+              <w:jc w:val="left"/>
+            </w:pPr>
+            <w:r>
+              <w:rPr>
+                <w:sz w:val="20"/>
+                <w:szCs w:val="20"/>
+              </w:rPr>
+              <w:t xml:space="preserve">Mahdi Yusuf</w:t>
+            </w:r>
+          </w:p>
+        </w:tc>
+        <w:tc>
+          <w:tcPr>
+            <w:tcW w:w="5226" w:type="dxa"/>
+            <w:vAlign w:val="top"/>
+          </w:tcPr>
+          <w:p>
+            <w:pPr>
+              <w:spacing w:before="0" w:after="0" w:line="240" w:lineRule="auto"/>
+              <w:jc w:val="left"/>
+            </w:pPr>
+            <w:r>
+              <w:rPr>
+                <w:sz w:val="20"/>
+                <w:szCs w:val="20"/>
+              </w:rPr>
+              <w:t xml:space="preserve">Director of Legal &amp; Compliance</w:t>
+            </w:r>
+          </w:p>
+        </w:tc>
+      </w:tr>
+    </w:tbl>
+    <w:p>
+      <w:pPr>
+        <w:spacing w:before="0" w:after="60" w:line="240" w:lineRule="auto"/>
+        <w:jc w:val="both"/>
+      </w:pPr>
+    </w:p>
+    <w:p>
+      <w:pPr>
+        <w:keepNext w:val="1"/>
+        <w:spacing w:before="240" w:after="120" w:line="360" w:lineRule="auto"/>
+        <w:jc w:val="left"/>
+      </w:pPr>
+      <w:r>
+        <w:rPr>
+          <w:b w:val="1"/>
+          <w:sz w:val="24"/>
+          <w:szCs w:val="24"/>
+        </w:rPr>
+        <w:t xml:space="preserve">2.6 Internship Placement: Regional Office Malang</w:t>
+      </w:r>
+    </w:p>
+    <w:p>
+      <w:pPr>
+        <w:spacing w:before="0" w:after="120" w:line="360" w:lineRule="auto"/>
+        <w:jc w:val="both"/>
+      </w:pPr>
+      <w:r>
+        <w:rPr>
+          <w:sz w:val="24"/>
+          <w:szCs w:val="24"/>
+        </w:rPr>
+        <w:t xml:space="preserve">BRI's domestic network is managed through 18 regional offices (Kantor Wilayah), eight of them in Java. The internship took place at the Regional Office (Kantor Wilayah) Malang, which oversees 25 branch offices in East Java: Banyuwangi, Batu, Blitar, Bondowoso, Genteng, Jember, Kediri, Kepanjen, Lumajang, Madiun, Magetan, Malang Kawi, Malang Marthadinata, Malang Soekarno Hatta, Malang Sutoyo, Nganjuk, Ngawi, Pacitan, Pare, Pasuruan, Ponorogo, Probolinggo, Situbondo, Trenggalek, and Tulungagung. The regional office coordinates and monitors the performance of these branches, and relies on recurring reports and internal systems to do so. During the internship I worked with two of its divisions: the IT division, which manages the office's IT devices and systems, and the RTB division, which prepares the regional performance reports for the branch network. The work done for each division is described in Chapter 3.</w:t>
       </w:r>
     </w:p>
     <w:p>
@@ -5554,11 +9380,29 @@
       </w:rPr>
     </w:lvl>
   </w:abstractNum>
+  <w:abstractNum w:abstractNumId="3">
+    <w:multiLevelType w:val="singleLevel"/>
+    <w:lvl w:ilvl="0">
+      <w:start w:val="1"/>
+      <w:numFmt w:val="bullet"/>
+      <w:lvlText w:val="•"/>
+      <w:lvlJc w:val="left"/>
+      <w:pPr>
+        <w:ind w:left="720" w:hanging="360"/>
+      </w:pPr>
+      <w:rPr>
+        <w:rFonts w:ascii="Calibri" w:hAnsi="Calibri" w:cs="Calibri"/>
+      </w:rPr>
+    </w:lvl>
+  </w:abstractNum>
   <w:num w:numId="1">
     <w:abstractNumId w:val="1"/>
   </w:num>
   <w:num w:numId="2">
     <w:abstractNumId w:val="2"/>
+  </w:num>
+  <w:num w:numId="3">
+    <w:abstractNumId w:val="3"/>
   </w:num>
 </w:numbering>
 </file>

</xml_diff>

<commit_message>
Fill Chapter 1 objectives, benefits, and scope of work from the IT and RTB internship completion forms.
Co-authored-by: Cursor <cursoragent@cursor.com>
</commit_message>
<xml_diff>
--- a/DRAFT Internship Report.docx
+++ b/DRAFT Internship Report.docx
@@ -392,21 +392,1517 @@
     </w:p>
     <w:p>
       <w:pPr>
-        <w:spacing w:line="360" w:lineRule="auto"/>
+        <w:keepNext w:val="1"/>
+        <w:spacing w:before="240" w:after="120" w:line="360" w:lineRule="auto"/>
+        <w:jc w:val="left"/>
+      </w:pPr>
+      <w:r>
         <w:rPr>
           <w:b w:val="1"/>
           <w:sz w:val="24"/>
           <w:szCs w:val="24"/>
         </w:rPr>
+        <w:t xml:space="preserve">1.1 Background</w:t>
+      </w:r>
+    </w:p>
+    <w:p>
+      <w:pPr>
+        <w:spacing w:before="0" w:after="120" w:line="360" w:lineRule="auto"/>
+        <w:jc w:val="both"/>
+      </w:pPr>
+      <w:r>
+        <w:rPr>
+          <w:sz w:val="24"/>
+          <w:szCs w:val="24"/>
+        </w:rPr>
+        <w:t xml:space="preserve">(insert Bank BRI Regional Malang Office background, including IT Division and RTB Division scope)</w:t>
+      </w:r>
+    </w:p>
+    <w:p>
+      <w:pPr>
+        <w:keepNext w:val="1"/>
+        <w:spacing w:before="240" w:after="120" w:line="360" w:lineRule="auto"/>
+        <w:jc w:val="left"/>
       </w:pPr>
       <w:r>
         <w:rPr>
           <w:b w:val="1"/>
           <w:sz w:val="24"/>
           <w:szCs w:val="24"/>
-          <w:rtl w:val="0"/>
-        </w:rPr>
-        <w:t xml:space="preserve">[Background, Objectives, Benefits, Scope of work]</w:t>
+        </w:rPr>
+        <w:t xml:space="preserve">1.2 Objectives</w:t>
+      </w:r>
+    </w:p>
+    <w:p>
+      <w:pPr>
+        <w:spacing w:before="0" w:after="120" w:line="360" w:lineRule="auto"/>
+        <w:jc w:val="both"/>
+      </w:pPr>
+      <w:r>
+        <w:rPr>
+          <w:sz w:val="24"/>
+          <w:szCs w:val="24"/>
+        </w:rPr>
+        <w:t xml:space="preserve">The internship was carried out as part of the internship course (STEM4301) of the Information Systems study program, Faculty of Engineering and Technology, Sampoerna University. Its objectives were:</w:t>
+      </w:r>
+    </w:p>
+    <w:p>
+      <w:pPr>
+        <w:numPr>
+          <w:ilvl w:val="0"/>
+          <w:numId w:val="4"/>
+        </w:numPr>
+        <w:spacing w:before="0" w:after="60" w:line="360" w:lineRule="auto"/>
+        <w:jc w:val="both"/>
+      </w:pPr>
+      <w:r>
+        <w:rPr>
+          <w:sz w:val="24"/>
+          <w:szCs w:val="24"/>
+        </w:rPr>
+        <w:t xml:space="preserve">To apply what I learned in Information Systems, such as systems analysis, web development, databases, and data processing, to real problems in a banking workplace.</w:t>
+      </w:r>
+    </w:p>
+    <w:p>
+      <w:pPr>
+        <w:numPr>
+          <w:ilvl w:val="0"/>
+          <w:numId w:val="4"/>
+        </w:numPr>
+        <w:spacing w:before="0" w:after="60" w:line="360" w:lineRule="auto"/>
+        <w:jc w:val="both"/>
+      </w:pPr>
+      <w:r>
+        <w:rPr>
+          <w:sz w:val="24"/>
+          <w:szCs w:val="24"/>
+        </w:rPr>
+        <w:t xml:space="preserve">To understand how a regional office of a state-owned bank works, in particular how the Information Technology (IT) division looks after the office's devices and internal systems, and how the Retail Transaction Banking (RTB) division serves business customers through products such as Qlola, current (giro) accounts, and BRIVA.</w:t>
+      </w:r>
+    </w:p>
+    <w:p>
+      <w:pPr>
+        <w:numPr>
+          <w:ilvl w:val="0"/>
+          <w:numId w:val="4"/>
+        </w:numPr>
+        <w:spacing w:before="0" w:after="60" w:line="360" w:lineRule="auto"/>
+        <w:jc w:val="both"/>
+      </w:pPr>
+      <w:r>
+        <w:rPr>
+          <w:sz w:val="24"/>
+          <w:szCs w:val="24"/>
+        </w:rPr>
+        <w:t xml:space="preserve">To design, build, and hand over working software that meets an actual operational need of the divisions I was placed in.</w:t>
+      </w:r>
+    </w:p>
+    <w:p>
+      <w:pPr>
+        <w:numPr>
+          <w:ilvl w:val="0"/>
+          <w:numId w:val="4"/>
+        </w:numPr>
+        <w:spacing w:before="0" w:after="60" w:line="360" w:lineRule="auto"/>
+        <w:jc w:val="both"/>
+      </w:pPr>
+      <w:r>
+        <w:rPr>
+          <w:sz w:val="24"/>
+          <w:szCs w:val="24"/>
+        </w:rPr>
+        <w:t xml:space="preserve">To develop professional skills: communicating with supervisors, staff, and customers, working to deadlines, documenting my work, and taking part in internal and customer meetings.</w:t>
+      </w:r>
+    </w:p>
+    <w:p>
+      <w:pPr>
+        <w:numPr>
+          <w:ilvl w:val="0"/>
+          <w:numId w:val="4"/>
+        </w:numPr>
+        <w:spacing w:before="0" w:after="60" w:line="360" w:lineRule="auto"/>
+        <w:jc w:val="both"/>
+      </w:pPr>
+      <w:r>
+        <w:rPr>
+          <w:sz w:val="24"/>
+          <w:szCs w:val="24"/>
+        </w:rPr>
+        <w:t xml:space="preserve">To gain work experience that prepares me for a career in information systems after graduation.</w:t>
+      </w:r>
+    </w:p>
+    <w:p>
+      <w:pPr>
+        <w:keepNext w:val="1"/>
+        <w:spacing w:before="240" w:after="120" w:line="360" w:lineRule="auto"/>
+        <w:jc w:val="left"/>
+      </w:pPr>
+      <w:r>
+        <w:rPr>
+          <w:b w:val="1"/>
+          <w:sz w:val="24"/>
+          <w:szCs w:val="24"/>
+        </w:rPr>
+        <w:t xml:space="preserve">1.3 Benefits</w:t>
+      </w:r>
+    </w:p>
+    <w:p>
+      <w:pPr>
+        <w:spacing w:before="0" w:after="120" w:line="360" w:lineRule="auto"/>
+        <w:jc w:val="both"/>
+      </w:pPr>
+      <w:r>
+        <w:rPr>
+          <w:sz w:val="24"/>
+          <w:szCs w:val="24"/>
+        </w:rPr>
+        <w:t xml:space="preserve">The internship benefits three parties: the student, the company, and the university.</w:t>
+      </w:r>
+    </w:p>
+    <w:p>
+      <w:pPr>
+        <w:spacing w:before="0" w:after="120" w:line="360" w:lineRule="auto"/>
+        <w:jc w:val="both"/>
+      </w:pPr>
+      <w:r>
+        <w:rPr>
+          <w:b w:val="1"/>
+          <w:sz w:val="24"/>
+          <w:szCs w:val="24"/>
+        </w:rPr>
+        <w:t xml:space="preserve">For the student. </w:t>
+      </w:r>
+      <w:r>
+        <w:rPr>
+          <w:sz w:val="24"/>
+          <w:szCs w:val="24"/>
+        </w:rPr>
+        <w:t xml:space="preserve">I gained hands-on experience across the whole life of a software system, from analysing requirements to building, testing, and deploying it. This covered web development with React, Node.js, and PostgreSQL, server work with Ubuntu Server and phpMyAdmin for MariaDB and MySQL, data processing with Python and Excel, and running a locally hosted AI agent (OpenClaw with Ollama) on spreadsheet data. I also learned how banking products such as Qlola, giro accounts, and BRIVA work from the bank's side, and how a regional office handles customer data, reports, and official correspondence.</w:t>
+      </w:r>
+    </w:p>
+    <w:p>
+      <w:pPr>
+        <w:spacing w:before="0" w:after="120" w:line="360" w:lineRule="auto"/>
+        <w:jc w:val="both"/>
+      </w:pPr>
+      <w:r>
+        <w:rPr>
+          <w:b w:val="1"/>
+          <w:sz w:val="24"/>
+          <w:szCs w:val="24"/>
+        </w:rPr>
+        <w:t xml:space="preserve">For Bank BRI Regional Office Malang. </w:t>
+      </w:r>
+      <w:r>
+        <w:rPr>
+          <w:sz w:val="24"/>
+          <w:szCs w:val="24"/>
+        </w:rPr>
+        <w:t xml:space="preserve">The IT division received an inventory system for its IT devices, deployed on an Ubuntu server for internal use. The RTB division received the Excel Workflow Processor, which turns its recurring Qlola reports into a one-click process. Both divisions also had extra help with day-to-day work, including data processing and mapping, standardising customer group categories, infographics for the marketing team, maintenance reports, and drafting a Digital Office (DiO) letter.</w:t>
+      </w:r>
+    </w:p>
+    <w:p>
+      <w:pPr>
+        <w:spacing w:before="0" w:after="120" w:line="360" w:lineRule="auto"/>
+        <w:jc w:val="both"/>
+      </w:pPr>
+      <w:r>
+        <w:rPr>
+          <w:b w:val="1"/>
+          <w:sz w:val="24"/>
+          <w:szCs w:val="24"/>
+        </w:rPr>
+        <w:t xml:space="preserve">For Sampoerna University. </w:t>
+      </w:r>
+      <w:r>
+        <w:rPr>
+          <w:sz w:val="24"/>
+          <w:szCs w:val="24"/>
+        </w:rPr>
+        <w:t xml:space="preserve">The internship gives the university feedback on how well the Information Systems curriculum matches the skills a large bank needs. It also strengthens the relationship between the university and Bank BRI, which can open placements for future students.</w:t>
+      </w:r>
+    </w:p>
+    <w:p>
+      <w:pPr>
+        <w:keepNext w:val="1"/>
+        <w:spacing w:before="240" w:after="120" w:line="360" w:lineRule="auto"/>
+        <w:jc w:val="left"/>
+      </w:pPr>
+      <w:r>
+        <w:rPr>
+          <w:b w:val="1"/>
+          <w:sz w:val="24"/>
+          <w:szCs w:val="24"/>
+        </w:rPr>
+        <w:t xml:space="preserve">1.4 Scope of Work</w:t>
+      </w:r>
+    </w:p>
+    <w:p>
+      <w:pPr>
+        <w:spacing w:before="0" w:after="120" w:line="360" w:lineRule="auto"/>
+        <w:jc w:val="both"/>
+      </w:pPr>
+      <w:r>
+        <w:rPr>
+          <w:sz w:val="24"/>
+          <w:szCs w:val="24"/>
+        </w:rPr>
+        <w:t xml:space="preserve">The internship took place at Bank BRI Regional Office Malang, Menara BRI Malang, Jalan Laksamana Martadinata No. 80, Kelurahan Sukoharjo, Kecamatan Klojen, Kota Malang, East Java, from 5 June to 21 August 2026. It was split into two placements, one in each division, as shown in Table 1.1.</w:t>
+      </w:r>
+    </w:p>
+    <w:p>
+      <w:pPr>
+        <w:keepNext w:val="1"/>
+        <w:spacing w:before="120" w:after="60" w:line="240" w:lineRule="auto"/>
+        <w:jc w:val="center"/>
+      </w:pPr>
+      <w:r>
+        <w:rPr>
+          <w:b w:val="1"/>
+          <w:sz w:val="20"/>
+          <w:szCs w:val="20"/>
+        </w:rPr>
+        <w:t xml:space="preserve">Table 1.1 Internship placements</w:t>
+      </w:r>
+    </w:p>
+    <w:tbl>
+      <w:tblPr>
+        <w:tblW w:w="9026" w:type="dxa"/>
+        <w:tblBorders>
+          <w:top w:val="single" w:sz="4" w:space="0" w:color="808080"/>
+          <w:left w:val="single" w:sz="4" w:space="0" w:color="808080"/>
+          <w:bottom w:val="single" w:sz="4" w:space="0" w:color="808080"/>
+          <w:right w:val="single" w:sz="4" w:space="0" w:color="808080"/>
+          <w:insideH w:val="single" w:sz="4" w:space="0" w:color="808080"/>
+          <w:insideV w:val="single" w:sz="4" w:space="0" w:color="808080"/>
+        </w:tblBorders>
+        <w:tblLayout w:type="fixed"/>
+        <w:tblCellMar>
+          <w:top w:w="40" w:type="dxa"/>
+          <w:left w:w="100" w:type="dxa"/>
+          <w:bottom w:w="40" w:type="dxa"/>
+          <w:right w:w="100" w:type="dxa"/>
+        </w:tblCellMar>
+      </w:tblPr>
+      <w:tblGrid>
+        <w:gridCol w:w="3600"/>
+        <w:gridCol w:w="2800"/>
+        <w:gridCol w:w="2626"/>
+      </w:tblGrid>
+      <w:tr>
+        <w:trPr>
+          <w:tblHeader w:val="1"/>
+        </w:trPr>
+        <w:tc>
+          <w:tcPr>
+            <w:tcW w:w="3600" w:type="dxa"/>
+            <w:shd w:val="clear" w:color="auto" w:fill="D9D9D9"/>
+            <w:vAlign w:val="top"/>
+          </w:tcPr>
+          <w:p>
+            <w:pPr>
+              <w:spacing w:before="0" w:after="0" w:line="240" w:lineRule="auto"/>
+              <w:jc w:val="left"/>
+            </w:pPr>
+            <w:r>
+              <w:rPr>
+                <w:b w:val="1"/>
+                <w:sz w:val="20"/>
+                <w:szCs w:val="20"/>
+              </w:rPr>
+              <w:t xml:space="preserve">Division</w:t>
+            </w:r>
+          </w:p>
+        </w:tc>
+        <w:tc>
+          <w:tcPr>
+            <w:tcW w:w="2800" w:type="dxa"/>
+            <w:shd w:val="clear" w:color="auto" w:fill="D9D9D9"/>
+            <w:vAlign w:val="top"/>
+          </w:tcPr>
+          <w:p>
+            <w:pPr>
+              <w:spacing w:before="0" w:after="0" w:line="240" w:lineRule="auto"/>
+              <w:jc w:val="left"/>
+            </w:pPr>
+            <w:r>
+              <w:rPr>
+                <w:b w:val="1"/>
+                <w:sz w:val="20"/>
+                <w:szCs w:val="20"/>
+              </w:rPr>
+              <w:t xml:space="preserve">Period</w:t>
+            </w:r>
+          </w:p>
+        </w:tc>
+        <w:tc>
+          <w:tcPr>
+            <w:tcW w:w="2626" w:type="dxa"/>
+            <w:shd w:val="clear" w:color="auto" w:fill="D9D9D9"/>
+            <w:vAlign w:val="top"/>
+          </w:tcPr>
+          <w:p>
+            <w:pPr>
+              <w:spacing w:before="0" w:after="0" w:line="240" w:lineRule="auto"/>
+              <w:jc w:val="left"/>
+            </w:pPr>
+            <w:r>
+              <w:rPr>
+                <w:b w:val="1"/>
+                <w:sz w:val="20"/>
+                <w:szCs w:val="20"/>
+              </w:rPr>
+              <w:t xml:space="preserve">Supervisor</w:t>
+            </w:r>
+          </w:p>
+        </w:tc>
+      </w:tr>
+      <w:tr>
+        <w:tc>
+          <w:tcPr>
+            <w:tcW w:w="3600" w:type="dxa"/>
+            <w:vAlign w:val="top"/>
+          </w:tcPr>
+          <w:p>
+            <w:pPr>
+              <w:spacing w:before="0" w:after="0" w:line="240" w:lineRule="auto"/>
+              <w:jc w:val="left"/>
+            </w:pPr>
+            <w:r>
+              <w:rPr>
+                <w:sz w:val="20"/>
+                <w:szCs w:val="20"/>
+              </w:rPr>
+              <w:t xml:space="preserve">Information Technology (IT)</w:t>
+            </w:r>
+          </w:p>
+        </w:tc>
+        <w:tc>
+          <w:tcPr>
+            <w:tcW w:w="2800" w:type="dxa"/>
+            <w:vAlign w:val="top"/>
+          </w:tcPr>
+          <w:p>
+            <w:pPr>
+              <w:spacing w:before="0" w:after="0" w:line="240" w:lineRule="auto"/>
+              <w:jc w:val="left"/>
+            </w:pPr>
+            <w:r>
+              <w:rPr>
+                <w:sz w:val="20"/>
+                <w:szCs w:val="20"/>
+              </w:rPr>
+              <w:t xml:space="preserve">5 June – 7 July 2026</w:t>
+            </w:r>
+          </w:p>
+        </w:tc>
+        <w:tc>
+          <w:tcPr>
+            <w:tcW w:w="2626" w:type="dxa"/>
+            <w:vAlign w:val="top"/>
+          </w:tcPr>
+          <w:p>
+            <w:pPr>
+              <w:spacing w:before="0" w:after="0" w:line="240" w:lineRule="auto"/>
+              <w:jc w:val="left"/>
+            </w:pPr>
+            <w:r>
+              <w:rPr>
+                <w:sz w:val="20"/>
+                <w:szCs w:val="20"/>
+              </w:rPr>
+              <w:t xml:space="preserve">Ugro Wiseno</w:t>
+            </w:r>
+          </w:p>
+        </w:tc>
+      </w:tr>
+      <w:tr>
+        <w:tc>
+          <w:tcPr>
+            <w:tcW w:w="3600" w:type="dxa"/>
+            <w:vAlign w:val="top"/>
+          </w:tcPr>
+          <w:p>
+            <w:pPr>
+              <w:spacing w:before="0" w:after="0" w:line="240" w:lineRule="auto"/>
+              <w:jc w:val="left"/>
+            </w:pPr>
+            <w:r>
+              <w:rPr>
+                <w:sz w:val="20"/>
+                <w:szCs w:val="20"/>
+              </w:rPr>
+              <w:t xml:space="preserve">Retail Transaction Banking (RTB)</w:t>
+            </w:r>
+          </w:p>
+        </w:tc>
+        <w:tc>
+          <w:tcPr>
+            <w:tcW w:w="2800" w:type="dxa"/>
+            <w:vAlign w:val="top"/>
+          </w:tcPr>
+          <w:p>
+            <w:pPr>
+              <w:spacing w:before="0" w:after="0" w:line="240" w:lineRule="auto"/>
+              <w:jc w:val="left"/>
+            </w:pPr>
+            <w:r>
+              <w:rPr>
+                <w:sz w:val="20"/>
+                <w:szCs w:val="20"/>
+              </w:rPr>
+              <w:t xml:space="preserve">8 July – 21 August 2026</w:t>
+            </w:r>
+          </w:p>
+        </w:tc>
+        <w:tc>
+          <w:tcPr>
+            <w:tcW w:w="2626" w:type="dxa"/>
+            <w:vAlign w:val="top"/>
+          </w:tcPr>
+          <w:p>
+            <w:pPr>
+              <w:spacing w:before="0" w:after="0" w:line="240" w:lineRule="auto"/>
+              <w:jc w:val="left"/>
+            </w:pPr>
+            <w:r>
+              <w:rPr>
+                <w:sz w:val="20"/>
+                <w:szCs w:val="20"/>
+              </w:rPr>
+              <w:t xml:space="preserve">Mochamad Denny Julianto</w:t>
+            </w:r>
+          </w:p>
+        </w:tc>
+      </w:tr>
+    </w:tbl>
+    <w:p>
+      <w:pPr>
+        <w:spacing w:before="0" w:after="60" w:line="240" w:lineRule="auto"/>
+        <w:jc w:val="both"/>
+      </w:pPr>
+    </w:p>
+    <w:p>
+      <w:pPr>
+        <w:spacing w:before="0" w:after="120" w:line="360" w:lineRule="auto"/>
+        <w:jc w:val="both"/>
+      </w:pPr>
+      <w:r>
+        <w:rPr>
+          <w:sz w:val="24"/>
+          <w:szCs w:val="24"/>
+        </w:rPr>
+        <w:t xml:space="preserve">Table 1.2 lists the tasks I carried out in the IT division, as recorded on the internship completion form signed by my supervisor.</w:t>
+      </w:r>
+    </w:p>
+    <w:p>
+      <w:pPr>
+        <w:keepNext w:val="1"/>
+        <w:spacing w:before="120" w:after="60" w:line="240" w:lineRule="auto"/>
+        <w:jc w:val="center"/>
+      </w:pPr>
+      <w:r>
+        <w:rPr>
+          <w:b w:val="1"/>
+          <w:sz w:val="20"/>
+          <w:szCs w:val="20"/>
+        </w:rPr>
+        <w:t xml:space="preserve">Table 1.2 Tasks carried out in the IT division</w:t>
+      </w:r>
+    </w:p>
+    <w:tbl>
+      <w:tblPr>
+        <w:tblW w:w="9026" w:type="dxa"/>
+        <w:tblBorders>
+          <w:top w:val="single" w:sz="4" w:space="0" w:color="808080"/>
+          <w:left w:val="single" w:sz="4" w:space="0" w:color="808080"/>
+          <w:bottom w:val="single" w:sz="4" w:space="0" w:color="808080"/>
+          <w:right w:val="single" w:sz="4" w:space="0" w:color="808080"/>
+          <w:insideH w:val="single" w:sz="4" w:space="0" w:color="808080"/>
+          <w:insideV w:val="single" w:sz="4" w:space="0" w:color="808080"/>
+        </w:tblBorders>
+        <w:tblLayout w:type="fixed"/>
+        <w:tblCellMar>
+          <w:top w:w="40" w:type="dxa"/>
+          <w:left w:w="100" w:type="dxa"/>
+          <w:bottom w:w="40" w:type="dxa"/>
+          <w:right w:w="100" w:type="dxa"/>
+        </w:tblCellMar>
+      </w:tblPr>
+      <w:tblGrid>
+        <w:gridCol w:w="800"/>
+        <w:gridCol w:w="8226"/>
+      </w:tblGrid>
+      <w:tr>
+        <w:trPr>
+          <w:tblHeader w:val="1"/>
+        </w:trPr>
+        <w:tc>
+          <w:tcPr>
+            <w:tcW w:w="800" w:type="dxa"/>
+            <w:shd w:val="clear" w:color="auto" w:fill="D9D9D9"/>
+            <w:vAlign w:val="top"/>
+          </w:tcPr>
+          <w:p>
+            <w:pPr>
+              <w:spacing w:before="0" w:after="0" w:line="240" w:lineRule="auto"/>
+              <w:jc w:val="left"/>
+            </w:pPr>
+            <w:r>
+              <w:rPr>
+                <w:b w:val="1"/>
+                <w:sz w:val="20"/>
+                <w:szCs w:val="20"/>
+              </w:rPr>
+              <w:t xml:space="preserve">No.</w:t>
+            </w:r>
+          </w:p>
+        </w:tc>
+        <w:tc>
+          <w:tcPr>
+            <w:tcW w:w="8226" w:type="dxa"/>
+            <w:shd w:val="clear" w:color="auto" w:fill="D9D9D9"/>
+            <w:vAlign w:val="top"/>
+          </w:tcPr>
+          <w:p>
+            <w:pPr>
+              <w:spacing w:before="0" w:after="0" w:line="240" w:lineRule="auto"/>
+              <w:jc w:val="left"/>
+            </w:pPr>
+            <w:r>
+              <w:rPr>
+                <w:b w:val="1"/>
+                <w:sz w:val="20"/>
+                <w:szCs w:val="20"/>
+              </w:rPr>
+              <w:t xml:space="preserve">Task</w:t>
+            </w:r>
+          </w:p>
+        </w:tc>
+      </w:tr>
+      <w:tr>
+        <w:tc>
+          <w:tcPr>
+            <w:tcW w:w="800" w:type="dxa"/>
+            <w:vAlign w:val="top"/>
+          </w:tcPr>
+          <w:p>
+            <w:pPr>
+              <w:spacing w:before="0" w:after="0" w:line="240" w:lineRule="auto"/>
+              <w:jc w:val="left"/>
+            </w:pPr>
+            <w:r>
+              <w:rPr>
+                <w:sz w:val="20"/>
+                <w:szCs w:val="20"/>
+              </w:rPr>
+              <w:t xml:space="preserve">1</w:t>
+            </w:r>
+          </w:p>
+        </w:tc>
+        <w:tc>
+          <w:tcPr>
+            <w:tcW w:w="8226" w:type="dxa"/>
+            <w:vAlign w:val="top"/>
+          </w:tcPr>
+          <w:p>
+            <w:pPr>
+              <w:spacing w:before="0" w:after="0" w:line="240" w:lineRule="auto"/>
+              <w:jc w:val="left"/>
+            </w:pPr>
+            <w:r>
+              <w:rPr>
+                <w:sz w:val="20"/>
+                <w:szCs w:val="20"/>
+              </w:rPr>
+              <w:t xml:space="preserve">Organising the availability of document access within a spreadsheet</w:t>
+            </w:r>
+          </w:p>
+        </w:tc>
+      </w:tr>
+      <w:tr>
+        <w:tc>
+          <w:tcPr>
+            <w:tcW w:w="800" w:type="dxa"/>
+            <w:vAlign w:val="top"/>
+          </w:tcPr>
+          <w:p>
+            <w:pPr>
+              <w:spacing w:before="0" w:after="0" w:line="240" w:lineRule="auto"/>
+              <w:jc w:val="left"/>
+            </w:pPr>
+            <w:r>
+              <w:rPr>
+                <w:sz w:val="20"/>
+                <w:szCs w:val="20"/>
+              </w:rPr>
+              <w:t xml:space="preserve">2</w:t>
+            </w:r>
+          </w:p>
+        </w:tc>
+        <w:tc>
+          <w:tcPr>
+            <w:tcW w:w="8226" w:type="dxa"/>
+            <w:vAlign w:val="top"/>
+          </w:tcPr>
+          <w:p>
+            <w:pPr>
+              <w:spacing w:before="0" w:after="0" w:line="240" w:lineRule="auto"/>
+              <w:jc w:val="left"/>
+            </w:pPr>
+            <w:r>
+              <w:rPr>
+                <w:sz w:val="20"/>
+                <w:szCs w:val="20"/>
+              </w:rPr>
+              <w:t xml:space="preserve">Developing the inventory system website for IT devices (Perangkat IT)</w:t>
+            </w:r>
+          </w:p>
+        </w:tc>
+      </w:tr>
+      <w:tr>
+        <w:tc>
+          <w:tcPr>
+            <w:tcW w:w="800" w:type="dxa"/>
+            <w:vAlign w:val="top"/>
+          </w:tcPr>
+          <w:p>
+            <w:pPr>
+              <w:spacing w:before="0" w:after="0" w:line="240" w:lineRule="auto"/>
+              <w:jc w:val="left"/>
+            </w:pPr>
+            <w:r>
+              <w:rPr>
+                <w:sz w:val="20"/>
+                <w:szCs w:val="20"/>
+              </w:rPr>
+              <w:t xml:space="preserve">3</w:t>
+            </w:r>
+          </w:p>
+        </w:tc>
+        <w:tc>
+          <w:tcPr>
+            <w:tcW w:w="8226" w:type="dxa"/>
+            <w:vAlign w:val="top"/>
+          </w:tcPr>
+          <w:p>
+            <w:pPr>
+              <w:spacing w:before="0" w:after="0" w:line="240" w:lineRule="auto"/>
+              <w:jc w:val="left"/>
+            </w:pPr>
+            <w:r>
+              <w:rPr>
+                <w:sz w:val="20"/>
+                <w:szCs w:val="20"/>
+              </w:rPr>
+              <w:t xml:space="preserve">Installing an Ubuntu server to deploy the finished inventory system website</w:t>
+            </w:r>
+          </w:p>
+        </w:tc>
+      </w:tr>
+      <w:tr>
+        <w:tc>
+          <w:tcPr>
+            <w:tcW w:w="800" w:type="dxa"/>
+            <w:vAlign w:val="top"/>
+          </w:tcPr>
+          <w:p>
+            <w:pPr>
+              <w:spacing w:before="0" w:after="0" w:line="240" w:lineRule="auto"/>
+              <w:jc w:val="left"/>
+            </w:pPr>
+            <w:r>
+              <w:rPr>
+                <w:sz w:val="20"/>
+                <w:szCs w:val="20"/>
+              </w:rPr>
+              <w:t xml:space="preserve">4</w:t>
+            </w:r>
+          </w:p>
+        </w:tc>
+        <w:tc>
+          <w:tcPr>
+            <w:tcW w:w="8226" w:type="dxa"/>
+            <w:vAlign w:val="top"/>
+          </w:tcPr>
+          <w:p>
+            <w:pPr>
+              <w:spacing w:before="0" w:after="0" w:line="240" w:lineRule="auto"/>
+              <w:jc w:val="left"/>
+            </w:pPr>
+            <w:r>
+              <w:rPr>
+                <w:sz w:val="20"/>
+                <w:szCs w:val="20"/>
+              </w:rPr>
+              <w:t xml:space="preserve">Installing and managing phpMyAdmin for the database servers (MariaDB and MySQL)</w:t>
+            </w:r>
+          </w:p>
+        </w:tc>
+      </w:tr>
+      <w:tr>
+        <w:tc>
+          <w:tcPr>
+            <w:tcW w:w="800" w:type="dxa"/>
+            <w:vAlign w:val="top"/>
+          </w:tcPr>
+          <w:p>
+            <w:pPr>
+              <w:spacing w:before="0" w:after="0" w:line="240" w:lineRule="auto"/>
+              <w:jc w:val="left"/>
+            </w:pPr>
+            <w:r>
+              <w:rPr>
+                <w:sz w:val="20"/>
+                <w:szCs w:val="20"/>
+              </w:rPr>
+              <w:t xml:space="preserve">5</w:t>
+            </w:r>
+          </w:p>
+        </w:tc>
+        <w:tc>
+          <w:tcPr>
+            <w:tcW w:w="8226" w:type="dxa"/>
+            <w:vAlign w:val="top"/>
+          </w:tcPr>
+          <w:p>
+            <w:pPr>
+              <w:spacing w:before="0" w:after="0" w:line="240" w:lineRule="auto"/>
+              <w:jc w:val="left"/>
+            </w:pPr>
+            <w:r>
+              <w:rPr>
+                <w:sz w:val="20"/>
+                <w:szCs w:val="20"/>
+              </w:rPr>
+              <w:t xml:space="preserve">Installing and setting up the OpenClaw AI agent with the Ollama framework for processing spreadsheets</w:t>
+            </w:r>
+          </w:p>
+        </w:tc>
+      </w:tr>
+      <w:tr>
+        <w:tc>
+          <w:tcPr>
+            <w:tcW w:w="800" w:type="dxa"/>
+            <w:vAlign w:val="top"/>
+          </w:tcPr>
+          <w:p>
+            <w:pPr>
+              <w:spacing w:before="0" w:after="0" w:line="240" w:lineRule="auto"/>
+              <w:jc w:val="left"/>
+            </w:pPr>
+            <w:r>
+              <w:rPr>
+                <w:sz w:val="20"/>
+                <w:szCs w:val="20"/>
+              </w:rPr>
+              <w:t xml:space="preserve">6</w:t>
+            </w:r>
+          </w:p>
+        </w:tc>
+        <w:tc>
+          <w:tcPr>
+            <w:tcW w:w="8226" w:type="dxa"/>
+            <w:vAlign w:val="top"/>
+          </w:tcPr>
+          <w:p>
+            <w:pPr>
+              <w:spacing w:before="0" w:after="0" w:line="240" w:lineRule="auto"/>
+              <w:jc w:val="left"/>
+            </w:pPr>
+            <w:r>
+              <w:rPr>
+                <w:sz w:val="20"/>
+                <w:szCs w:val="20"/>
+              </w:rPr>
+              <w:t xml:space="preserve">Editing and processing data in spreadsheets with the OpenClaw AI agent</w:t>
+            </w:r>
+          </w:p>
+        </w:tc>
+      </w:tr>
+    </w:tbl>
+    <w:p>
+      <w:pPr>
+        <w:spacing w:before="0" w:after="60" w:line="240" w:lineRule="auto"/>
+        <w:jc w:val="both"/>
+      </w:pPr>
+    </w:p>
+    <w:p>
+      <w:pPr>
+        <w:spacing w:before="0" w:after="120" w:line="360" w:lineRule="auto"/>
+        <w:jc w:val="both"/>
+      </w:pPr>
+      <w:r>
+        <w:rPr>
+          <w:sz w:val="24"/>
+          <w:szCs w:val="24"/>
+        </w:rPr>
+        <w:t xml:space="preserve">Table 1.3 lists the tasks I carried out in the RTB division, as recorded on the internship completion form signed by my supervisor.</w:t>
+      </w:r>
+    </w:p>
+    <w:p>
+      <w:pPr>
+        <w:keepNext w:val="1"/>
+        <w:spacing w:before="120" w:after="60" w:line="240" w:lineRule="auto"/>
+        <w:jc w:val="center"/>
+      </w:pPr>
+      <w:r>
+        <w:rPr>
+          <w:b w:val="1"/>
+          <w:sz w:val="20"/>
+          <w:szCs w:val="20"/>
+        </w:rPr>
+        <w:t xml:space="preserve">Table 1.3 Tasks carried out in the RTB division</w:t>
+      </w:r>
+    </w:p>
+    <w:tbl>
+      <w:tblPr>
+        <w:tblW w:w="9026" w:type="dxa"/>
+        <w:tblBorders>
+          <w:top w:val="single" w:sz="4" w:space="0" w:color="808080"/>
+          <w:left w:val="single" w:sz="4" w:space="0" w:color="808080"/>
+          <w:bottom w:val="single" w:sz="4" w:space="0" w:color="808080"/>
+          <w:right w:val="single" w:sz="4" w:space="0" w:color="808080"/>
+          <w:insideH w:val="single" w:sz="4" w:space="0" w:color="808080"/>
+          <w:insideV w:val="single" w:sz="4" w:space="0" w:color="808080"/>
+        </w:tblBorders>
+        <w:tblLayout w:type="fixed"/>
+        <w:tblCellMar>
+          <w:top w:w="40" w:type="dxa"/>
+          <w:left w:w="100" w:type="dxa"/>
+          <w:bottom w:w="40" w:type="dxa"/>
+          <w:right w:w="100" w:type="dxa"/>
+        </w:tblCellMar>
+      </w:tblPr>
+      <w:tblGrid>
+        <w:gridCol w:w="800"/>
+        <w:gridCol w:w="8226"/>
+      </w:tblGrid>
+      <w:tr>
+        <w:trPr>
+          <w:tblHeader w:val="1"/>
+        </w:trPr>
+        <w:tc>
+          <w:tcPr>
+            <w:tcW w:w="800" w:type="dxa"/>
+            <w:shd w:val="clear" w:color="auto" w:fill="D9D9D9"/>
+            <w:vAlign w:val="top"/>
+          </w:tcPr>
+          <w:p>
+            <w:pPr>
+              <w:spacing w:before="0" w:after="0" w:line="240" w:lineRule="auto"/>
+              <w:jc w:val="left"/>
+            </w:pPr>
+            <w:r>
+              <w:rPr>
+                <w:b w:val="1"/>
+                <w:sz w:val="20"/>
+                <w:szCs w:val="20"/>
+              </w:rPr>
+              <w:t xml:space="preserve">No.</w:t>
+            </w:r>
+          </w:p>
+        </w:tc>
+        <w:tc>
+          <w:tcPr>
+            <w:tcW w:w="8226" w:type="dxa"/>
+            <w:shd w:val="clear" w:color="auto" w:fill="D9D9D9"/>
+            <w:vAlign w:val="top"/>
+          </w:tcPr>
+          <w:p>
+            <w:pPr>
+              <w:spacing w:before="0" w:after="0" w:line="240" w:lineRule="auto"/>
+              <w:jc w:val="left"/>
+            </w:pPr>
+            <w:r>
+              <w:rPr>
+                <w:b w:val="1"/>
+                <w:sz w:val="20"/>
+                <w:szCs w:val="20"/>
+              </w:rPr>
+              <w:t xml:space="preserve">Task</w:t>
+            </w:r>
+          </w:p>
+        </w:tc>
+      </w:tr>
+      <w:tr>
+        <w:tc>
+          <w:tcPr>
+            <w:tcW w:w="800" w:type="dxa"/>
+            <w:vAlign w:val="top"/>
+          </w:tcPr>
+          <w:p>
+            <w:pPr>
+              <w:spacing w:before="0" w:after="0" w:line="240" w:lineRule="auto"/>
+              <w:jc w:val="left"/>
+            </w:pPr>
+            <w:r>
+              <w:rPr>
+                <w:sz w:val="20"/>
+                <w:szCs w:val="20"/>
+              </w:rPr>
+              <w:t xml:space="preserve">1</w:t>
+            </w:r>
+          </w:p>
+        </w:tc>
+        <w:tc>
+          <w:tcPr>
+            <w:tcW w:w="8226" w:type="dxa"/>
+            <w:vAlign w:val="top"/>
+          </w:tcPr>
+          <w:p>
+            <w:pPr>
+              <w:spacing w:before="0" w:after="0" w:line="240" w:lineRule="auto"/>
+              <w:jc w:val="left"/>
+            </w:pPr>
+            <w:r>
+              <w:rPr>
+                <w:sz w:val="20"/>
+                <w:szCs w:val="20"/>
+              </w:rPr>
+              <w:t xml:space="preserve">Editing and processing Qlola data (Static Data Report, Accumulated Summary Report, Monthly Summary Report, BG Portal Details, and TF Volume Details) in spreadsheets using Excel and the Excel Workflow Processor system</w:t>
+            </w:r>
+          </w:p>
+        </w:tc>
+      </w:tr>
+      <w:tr>
+        <w:tc>
+          <w:tcPr>
+            <w:tcW w:w="800" w:type="dxa"/>
+            <w:vAlign w:val="top"/>
+          </w:tcPr>
+          <w:p>
+            <w:pPr>
+              <w:spacing w:before="0" w:after="0" w:line="240" w:lineRule="auto"/>
+              <w:jc w:val="left"/>
+            </w:pPr>
+            <w:r>
+              <w:rPr>
+                <w:sz w:val="20"/>
+                <w:szCs w:val="20"/>
+              </w:rPr>
+              <w:t xml:space="preserve">2</w:t>
+            </w:r>
+          </w:p>
+        </w:tc>
+        <w:tc>
+          <w:tcPr>
+            <w:tcW w:w="8226" w:type="dxa"/>
+            <w:vAlign w:val="top"/>
+          </w:tcPr>
+          <w:p>
+            <w:pPr>
+              <w:spacing w:before="0" w:after="0" w:line="240" w:lineRule="auto"/>
+              <w:jc w:val="left"/>
+            </w:pPr>
+            <w:r>
+              <w:rPr>
+                <w:sz w:val="20"/>
+                <w:szCs w:val="20"/>
+              </w:rPr>
+              <w:t xml:space="preserve">Registering a new business, together with its Admin and SysAdmin users, in the Qlola system</w:t>
+            </w:r>
+          </w:p>
+        </w:tc>
+      </w:tr>
+      <w:tr>
+        <w:tc>
+          <w:tcPr>
+            <w:tcW w:w="800" w:type="dxa"/>
+            <w:vAlign w:val="top"/>
+          </w:tcPr>
+          <w:p>
+            <w:pPr>
+              <w:spacing w:before="0" w:after="0" w:line="240" w:lineRule="auto"/>
+              <w:jc w:val="left"/>
+            </w:pPr>
+            <w:r>
+              <w:rPr>
+                <w:sz w:val="20"/>
+                <w:szCs w:val="20"/>
+              </w:rPr>
+              <w:t xml:space="preserve">3</w:t>
+            </w:r>
+          </w:p>
+        </w:tc>
+        <w:tc>
+          <w:tcPr>
+            <w:tcW w:w="8226" w:type="dxa"/>
+            <w:vAlign w:val="top"/>
+          </w:tcPr>
+          <w:p>
+            <w:pPr>
+              <w:spacing w:before="0" w:after="0" w:line="240" w:lineRule="auto"/>
+              <w:jc w:val="left"/>
+            </w:pPr>
+            <w:r>
+              <w:rPr>
+                <w:sz w:val="20"/>
+                <w:szCs w:val="20"/>
+              </w:rPr>
+              <w:t xml:space="preserve">Creating digital infographics for bank customers and the marketing team that explain the features and benefits of the Giro Rewards Program and the Edupay Growth Program</w:t>
+            </w:r>
+          </w:p>
+        </w:tc>
+      </w:tr>
+      <w:tr>
+        <w:tc>
+          <w:tcPr>
+            <w:tcW w:w="800" w:type="dxa"/>
+            <w:vAlign w:val="top"/>
+          </w:tcPr>
+          <w:p>
+            <w:pPr>
+              <w:spacing w:before="0" w:after="0" w:line="240" w:lineRule="auto"/>
+              <w:jc w:val="left"/>
+            </w:pPr>
+            <w:r>
+              <w:rPr>
+                <w:sz w:val="20"/>
+                <w:szCs w:val="20"/>
+              </w:rPr>
+              <w:t xml:space="preserve">4</w:t>
+            </w:r>
+          </w:p>
+        </w:tc>
+        <w:tc>
+          <w:tcPr>
+            <w:tcW w:w="8226" w:type="dxa"/>
+            <w:vAlign w:val="top"/>
+          </w:tcPr>
+          <w:p>
+            <w:pPr>
+              <w:spacing w:before="0" w:after="0" w:line="240" w:lineRule="auto"/>
+              <w:jc w:val="left"/>
+            </w:pPr>
+            <w:r>
+              <w:rPr>
+                <w:sz w:val="20"/>
+                <w:szCs w:val="20"/>
+              </w:rPr>
+              <w:t xml:space="preserve">Attending a company-wide Microsoft Teams meeting on the Qlola Token app update and the switch to the new Qlola login URL, and studying the new Qlola version through the New Qlola by BRI PDF</w:t>
+            </w:r>
+          </w:p>
+        </w:tc>
+      </w:tr>
+      <w:tr>
+        <w:tc>
+          <w:tcPr>
+            <w:tcW w:w="800" w:type="dxa"/>
+            <w:vAlign w:val="top"/>
+          </w:tcPr>
+          <w:p>
+            <w:pPr>
+              <w:spacing w:before="0" w:after="0" w:line="240" w:lineRule="auto"/>
+              <w:jc w:val="left"/>
+            </w:pPr>
+            <w:r>
+              <w:rPr>
+                <w:sz w:val="20"/>
+                <w:szCs w:val="20"/>
+              </w:rPr>
+              <w:t xml:space="preserve">5</w:t>
+            </w:r>
+          </w:p>
+        </w:tc>
+        <w:tc>
+          <w:tcPr>
+            <w:tcW w:w="8226" w:type="dxa"/>
+            <w:vAlign w:val="top"/>
+          </w:tcPr>
+          <w:p>
+            <w:pPr>
+              <w:spacing w:before="0" w:after="0" w:line="240" w:lineRule="auto"/>
+              <w:jc w:val="left"/>
+            </w:pPr>
+            <w:r>
+              <w:rPr>
+                <w:sz w:val="20"/>
+                <w:szCs w:val="20"/>
+              </w:rPr>
+              <w:t xml:space="preserve">Studying the Online Update Administrator PDF for Qlola</w:t>
+            </w:r>
+          </w:p>
+        </w:tc>
+      </w:tr>
+      <w:tr>
+        <w:tc>
+          <w:tcPr>
+            <w:tcW w:w="800" w:type="dxa"/>
+            <w:vAlign w:val="top"/>
+          </w:tcPr>
+          <w:p>
+            <w:pPr>
+              <w:spacing w:before="0" w:after="0" w:line="240" w:lineRule="auto"/>
+              <w:jc w:val="left"/>
+            </w:pPr>
+            <w:r>
+              <w:rPr>
+                <w:sz w:val="20"/>
+                <w:szCs w:val="20"/>
+              </w:rPr>
+              <w:t xml:space="preserve">6</w:t>
+            </w:r>
+          </w:p>
+        </w:tc>
+        <w:tc>
+          <w:tcPr>
+            <w:tcW w:w="8226" w:type="dxa"/>
+            <w:vAlign w:val="top"/>
+          </w:tcPr>
+          <w:p>
+            <w:pPr>
+              <w:spacing w:before="0" w:after="0" w:line="240" w:lineRule="auto"/>
+              <w:jc w:val="left"/>
+            </w:pPr>
+            <w:r>
+              <w:rPr>
+                <w:sz w:val="20"/>
+                <w:szCs w:val="20"/>
+              </w:rPr>
+              <w:t xml:space="preserve">Printing maintenance reports for the Malang Regional Office</w:t>
+            </w:r>
+          </w:p>
+        </w:tc>
+      </w:tr>
+      <w:tr>
+        <w:tc>
+          <w:tcPr>
+            <w:tcW w:w="800" w:type="dxa"/>
+            <w:vAlign w:val="top"/>
+          </w:tcPr>
+          <w:p>
+            <w:pPr>
+              <w:spacing w:before="0" w:after="0" w:line="240" w:lineRule="auto"/>
+              <w:jc w:val="left"/>
+            </w:pPr>
+            <w:r>
+              <w:rPr>
+                <w:sz w:val="20"/>
+                <w:szCs w:val="20"/>
+              </w:rPr>
+              <w:t xml:space="preserve">7</w:t>
+            </w:r>
+          </w:p>
+        </w:tc>
+        <w:tc>
+          <w:tcPr>
+            <w:tcW w:w="8226" w:type="dxa"/>
+            <w:vAlign w:val="top"/>
+          </w:tcPr>
+          <w:p>
+            <w:pPr>
+              <w:spacing w:before="0" w:after="0" w:line="240" w:lineRule="auto"/>
+              <w:jc w:val="left"/>
+            </w:pPr>
+            <w:r>
+              <w:rPr>
+                <w:sz w:val="20"/>
+                <w:szCs w:val="20"/>
+              </w:rPr>
+              <w:t xml:space="preserve">Classifying and standardising group categories for Malang Regional Office customers in the Excel file for BRI's nationwide customer list</w:t>
+            </w:r>
+          </w:p>
+        </w:tc>
+      </w:tr>
+      <w:tr>
+        <w:tc>
+          <w:tcPr>
+            <w:tcW w:w="800" w:type="dxa"/>
+            <w:vAlign w:val="top"/>
+          </w:tcPr>
+          <w:p>
+            <w:pPr>
+              <w:spacing w:before="0" w:after="0" w:line="240" w:lineRule="auto"/>
+              <w:jc w:val="left"/>
+            </w:pPr>
+            <w:r>
+              <w:rPr>
+                <w:sz w:val="20"/>
+                <w:szCs w:val="20"/>
+              </w:rPr>
+              <w:t xml:space="preserve">8</w:t>
+            </w:r>
+          </w:p>
+        </w:tc>
+        <w:tc>
+          <w:tcPr>
+            <w:tcW w:w="8226" w:type="dxa"/>
+            <w:vAlign w:val="top"/>
+          </w:tcPr>
+          <w:p>
+            <w:pPr>
+              <w:spacing w:before="0" w:after="0" w:line="240" w:lineRule="auto"/>
+              <w:jc w:val="left"/>
+            </w:pPr>
+            <w:r>
+              <w:rPr>
+                <w:sz w:val="20"/>
+                <w:szCs w:val="20"/>
+              </w:rPr>
+              <w:t xml:space="preserve">Mapping currently registered Qlola customers and active users' transaction frequency and volume as of June 2026</w:t>
+            </w:r>
+          </w:p>
+        </w:tc>
+      </w:tr>
+      <w:tr>
+        <w:tc>
+          <w:tcPr>
+            <w:tcW w:w="800" w:type="dxa"/>
+            <w:vAlign w:val="top"/>
+          </w:tcPr>
+          <w:p>
+            <w:pPr>
+              <w:spacing w:before="0" w:after="0" w:line="240" w:lineRule="auto"/>
+              <w:jc w:val="left"/>
+            </w:pPr>
+            <w:r>
+              <w:rPr>
+                <w:sz w:val="20"/>
+                <w:szCs w:val="20"/>
+              </w:rPr>
+              <w:t xml:space="preserve">9</w:t>
+            </w:r>
+          </w:p>
+        </w:tc>
+        <w:tc>
+          <w:tcPr>
+            <w:tcW w:w="8226" w:type="dxa"/>
+            <w:vAlign w:val="top"/>
+          </w:tcPr>
+          <w:p>
+            <w:pPr>
+              <w:spacing w:before="0" w:after="0" w:line="240" w:lineRule="auto"/>
+              <w:jc w:val="left"/>
+            </w:pPr>
+            <w:r>
+              <w:rPr>
+                <w:sz w:val="20"/>
+                <w:szCs w:val="20"/>
+              </w:rPr>
+              <w:t xml:space="preserve">Building the Excel Workflow Processor system</w:t>
+            </w:r>
+          </w:p>
+        </w:tc>
+      </w:tr>
+      <w:tr>
+        <w:tc>
+          <w:tcPr>
+            <w:tcW w:w="800" w:type="dxa"/>
+            <w:vAlign w:val="top"/>
+          </w:tcPr>
+          <w:p>
+            <w:pPr>
+              <w:spacing w:before="0" w:after="0" w:line="240" w:lineRule="auto"/>
+              <w:jc w:val="left"/>
+            </w:pPr>
+            <w:r>
+              <w:rPr>
+                <w:sz w:val="20"/>
+                <w:szCs w:val="20"/>
+              </w:rPr>
+              <w:t xml:space="preserve">10</w:t>
+            </w:r>
+          </w:p>
+        </w:tc>
+        <w:tc>
+          <w:tcPr>
+            <w:tcW w:w="8226" w:type="dxa"/>
+            <w:vAlign w:val="top"/>
+          </w:tcPr>
+          <w:p>
+            <w:pPr>
+              <w:spacing w:before="0" w:after="0" w:line="240" w:lineRule="auto"/>
+              <w:jc w:val="left"/>
+            </w:pPr>
+            <w:r>
+              <w:rPr>
+                <w:sz w:val="20"/>
+                <w:szCs w:val="20"/>
+              </w:rPr>
+              <w:t xml:space="preserve">Assisting with maintenance work in the RTB division</w:t>
+            </w:r>
+          </w:p>
+        </w:tc>
+      </w:tr>
+      <w:tr>
+        <w:tc>
+          <w:tcPr>
+            <w:tcW w:w="800" w:type="dxa"/>
+            <w:vAlign w:val="top"/>
+          </w:tcPr>
+          <w:p>
+            <w:pPr>
+              <w:spacing w:before="0" w:after="0" w:line="240" w:lineRule="auto"/>
+              <w:jc w:val="left"/>
+            </w:pPr>
+            <w:r>
+              <w:rPr>
+                <w:sz w:val="20"/>
+                <w:szCs w:val="20"/>
+              </w:rPr>
+              <w:t xml:space="preserve">11</w:t>
+            </w:r>
+          </w:p>
+        </w:tc>
+        <w:tc>
+          <w:tcPr>
+            <w:tcW w:w="8226" w:type="dxa"/>
+            <w:vAlign w:val="top"/>
+          </w:tcPr>
+          <w:p>
+            <w:pPr>
+              <w:spacing w:before="0" w:after="0" w:line="240" w:lineRule="auto"/>
+              <w:jc w:val="left"/>
+            </w:pPr>
+            <w:r>
+              <w:rPr>
+                <w:sz w:val="20"/>
+                <w:szCs w:val="20"/>
+              </w:rPr>
+              <w:t xml:space="preserve">Editing and processing the customer pipeline recapitulation for current (giro) accounts at the Malang Regional Office</w:t>
+            </w:r>
+          </w:p>
+        </w:tc>
+      </w:tr>
+      <w:tr>
+        <w:tc>
+          <w:tcPr>
+            <w:tcW w:w="800" w:type="dxa"/>
+            <w:vAlign w:val="top"/>
+          </w:tcPr>
+          <w:p>
+            <w:pPr>
+              <w:spacing w:before="0" w:after="0" w:line="240" w:lineRule="auto"/>
+              <w:jc w:val="left"/>
+            </w:pPr>
+            <w:r>
+              <w:rPr>
+                <w:sz w:val="20"/>
+                <w:szCs w:val="20"/>
+              </w:rPr>
+              <w:t xml:space="preserve">12</w:t>
+            </w:r>
+          </w:p>
+        </w:tc>
+        <w:tc>
+          <w:tcPr>
+            <w:tcW w:w="8226" w:type="dxa"/>
+            <w:vAlign w:val="top"/>
+          </w:tcPr>
+          <w:p>
+            <w:pPr>
+              <w:spacing w:before="0" w:after="0" w:line="240" w:lineRule="auto"/>
+              <w:jc w:val="left"/>
+            </w:pPr>
+            <w:r>
+              <w:rPr>
+                <w:sz w:val="20"/>
+                <w:szCs w:val="20"/>
+              </w:rPr>
+              <w:t xml:space="preserve">Editing and processing data for the TSPM current account list report as of 30 June 2026</w:t>
+            </w:r>
+          </w:p>
+        </w:tc>
+      </w:tr>
+      <w:tr>
+        <w:tc>
+          <w:tcPr>
+            <w:tcW w:w="800" w:type="dxa"/>
+            <w:vAlign w:val="top"/>
+          </w:tcPr>
+          <w:p>
+            <w:pPr>
+              <w:spacing w:before="0" w:after="0" w:line="240" w:lineRule="auto"/>
+              <w:jc w:val="left"/>
+            </w:pPr>
+            <w:r>
+              <w:rPr>
+                <w:sz w:val="20"/>
+                <w:szCs w:val="20"/>
+              </w:rPr>
+              <w:t xml:space="preserve">13</w:t>
+            </w:r>
+          </w:p>
+        </w:tc>
+        <w:tc>
+          <w:tcPr>
+            <w:tcW w:w="8226" w:type="dxa"/>
+            <w:vAlign w:val="top"/>
+          </w:tcPr>
+          <w:p>
+            <w:pPr>
+              <w:spacing w:before="0" w:after="0" w:line="240" w:lineRule="auto"/>
+              <w:jc w:val="left"/>
+            </w:pPr>
+            <w:r>
+              <w:rPr>
+                <w:sz w:val="20"/>
+                <w:szCs w:val="20"/>
+              </w:rPr>
+              <w:t xml:space="preserve">Attending a Microsoft Teams meeting with customers on the BRIVA API and New Qlola by BRI for a ministry work unit</w:t>
+            </w:r>
+          </w:p>
+        </w:tc>
+      </w:tr>
+      <w:tr>
+        <w:tc>
+          <w:tcPr>
+            <w:tcW w:w="800" w:type="dxa"/>
+            <w:vAlign w:val="top"/>
+          </w:tcPr>
+          <w:p>
+            <w:pPr>
+              <w:spacing w:before="0" w:after="0" w:line="240" w:lineRule="auto"/>
+              <w:jc w:val="left"/>
+            </w:pPr>
+            <w:r>
+              <w:rPr>
+                <w:sz w:val="20"/>
+                <w:szCs w:val="20"/>
+              </w:rPr>
+              <w:t xml:space="preserve">14</w:t>
+            </w:r>
+          </w:p>
+        </w:tc>
+        <w:tc>
+          <w:tcPr>
+            <w:tcW w:w="8226" w:type="dxa"/>
+            <w:vAlign w:val="top"/>
+          </w:tcPr>
+          <w:p>
+            <w:pPr>
+              <w:spacing w:before="0" w:after="0" w:line="240" w:lineRule="auto"/>
+              <w:jc w:val="left"/>
+            </w:pPr>
+            <w:r>
+              <w:rPr>
+                <w:sz w:val="20"/>
+                <w:szCs w:val="20"/>
+              </w:rPr>
+              <w:t xml:space="preserve">Drafting a Digital Office (DiO) letter of approval in principle to follow up on a customer's request for reduced BRIVA fees</w:t>
+            </w:r>
+          </w:p>
+        </w:tc>
+      </w:tr>
+    </w:tbl>
+    <w:p>
+      <w:pPr>
+        <w:spacing w:before="0" w:after="60" w:line="240" w:lineRule="auto"/>
+        <w:jc w:val="both"/>
+      </w:pPr>
+    </w:p>
+    <w:p>
+      <w:pPr>
+        <w:spacing w:before="0" w:after="120" w:line="360" w:lineRule="auto"/>
+        <w:jc w:val="both"/>
+      </w:pPr>
+      <w:r>
+        <w:rPr>
+          <w:sz w:val="24"/>
+          <w:szCs w:val="24"/>
+        </w:rPr>
+        <w:t xml:space="preserve">The two largest tasks were software projects: the inventory system website for the IT division (Perangkat IT) and the Excel Workflow Processor for the RTB division, referred to in this report as the Tongkat Gaib Excel tool. Chapter 3 describes these two projects, Chapter 4 analyses them, and Chapter 5 covers their technical design.</w:t>
       </w:r>
     </w:p>
     <w:p>
@@ -9395,6 +10891,21 @@
       </w:rPr>
     </w:lvl>
   </w:abstractNum>
+  <w:abstractNum w:abstractNumId="4">
+    <w:multiLevelType w:val="singleLevel"/>
+    <w:lvl w:ilvl="0">
+      <w:start w:val="1"/>
+      <w:numFmt w:val="bullet"/>
+      <w:lvlText w:val="•"/>
+      <w:lvlJc w:val="left"/>
+      <w:pPr>
+        <w:ind w:left="720" w:hanging="360"/>
+      </w:pPr>
+      <w:rPr>
+        <w:rFonts w:ascii="Calibri" w:hAnsi="Calibri" w:cs="Calibri"/>
+      </w:rPr>
+    </w:lvl>
+  </w:abstractNum>
   <w:num w:numId="1">
     <w:abstractNumId w:val="1"/>
   </w:num>
@@ -9403,6 +10914,9 @@
   </w:num>
   <w:num w:numId="3">
     <w:abstractNumId w:val="3"/>
+  </w:num>
+  <w:num w:numId="4">
+    <w:abstractNumId w:val="4"/>
   </w:num>
 </w:numbering>
 </file>

</xml_diff>

<commit_message>
Write Chapter 1 background from the Regional Office Malang organisational structure.
Co-authored-by: Cursor <cursoragent@cursor.com>
</commit_message>
<xml_diff>
--- a/DRAFT Internship Report.docx
+++ b/DRAFT Internship Report.docx
@@ -415,7 +415,338 @@
           <w:sz w:val="24"/>
           <w:szCs w:val="24"/>
         </w:rPr>
-        <w:t xml:space="preserve">(insert Bank BRI Regional Malang Office background, including IT Division and RTB Division scope)</w:t>
+        <w:t xml:space="preserve">PT Bank Rakyat Indonesia (Persero) Tbk (BRI) manages its branch network in Indonesia through regional offices (Kantor Wilayah). Each regional office supervises, supports, and controls the bank's operations in its region. Region 13, Regional Office Malang, covers the bank's operations in Malang and the surrounding cities of East Java. It is based at Menara BRI Malang, where I carried out my internship.</w:t>
+      </w:r>
+    </w:p>
+    <w:p>
+      <w:pPr>
+        <w:spacing w:before="0" w:after="120" w:line="360" w:lineRule="auto"/>
+        <w:jc w:val="both"/>
+      </w:pPr>
+      <w:r>
+        <w:rPr>
+          <w:sz w:val="24"/>
+          <w:szCs w:val="24"/>
+        </w:rPr>
+        <w:t xml:space="preserve">Regional Office Malang is organised into 24 regional units that report to the head of the region. Table 1.1 groups them by function. Six Area offices, namely Jember, Kediri, Madiun, Malang Soekarno Hatta, Probolinggo, and Tulungagung, also report to the region. These run day-to-day banking operations in their own areas and are not part of the regional office itself.</w:t>
+      </w:r>
+    </w:p>
+    <w:p>
+      <w:pPr>
+        <w:keepNext w:val="1"/>
+        <w:spacing w:before="120" w:after="60" w:line="240" w:lineRule="auto"/>
+        <w:jc w:val="center"/>
+      </w:pPr>
+      <w:r>
+        <w:rPr>
+          <w:b w:val="1"/>
+          <w:sz w:val="20"/>
+          <w:szCs w:val="20"/>
+        </w:rPr>
+        <w:t xml:space="preserve">Table 1.1 Units of Regional Office Malang, grouped by function</w:t>
+      </w:r>
+    </w:p>
+    <w:tbl>
+      <w:tblPr>
+        <w:tblW w:w="9026" w:type="dxa"/>
+        <w:tblBorders>
+          <w:top w:val="single" w:sz="4" w:space="0" w:color="808080"/>
+          <w:left w:val="single" w:sz="4" w:space="0" w:color="808080"/>
+          <w:bottom w:val="single" w:sz="4" w:space="0" w:color="808080"/>
+          <w:right w:val="single" w:sz="4" w:space="0" w:color="808080"/>
+          <w:insideH w:val="single" w:sz="4" w:space="0" w:color="808080"/>
+          <w:insideV w:val="single" w:sz="4" w:space="0" w:color="808080"/>
+        </w:tblBorders>
+        <w:tblLayout w:type="fixed"/>
+        <w:tblCellMar>
+          <w:top w:w="40" w:type="dxa"/>
+          <w:left w:w="100" w:type="dxa"/>
+          <w:bottom w:w="40" w:type="dxa"/>
+          <w:right w:w="100" w:type="dxa"/>
+        </w:tblCellMar>
+      </w:tblPr>
+      <w:tblGrid>
+        <w:gridCol w:w="2400"/>
+        <w:gridCol w:w="6626"/>
+      </w:tblGrid>
+      <w:tr>
+        <w:trPr>
+          <w:tblHeader w:val="1"/>
+        </w:trPr>
+        <w:tc>
+          <w:tcPr>
+            <w:tcW w:w="2400" w:type="dxa"/>
+            <w:shd w:val="clear" w:color="auto" w:fill="D9D9D9"/>
+            <w:vAlign w:val="top"/>
+          </w:tcPr>
+          <w:p>
+            <w:pPr>
+              <w:spacing w:before="0" w:after="0" w:line="240" w:lineRule="auto"/>
+              <w:jc w:val="left"/>
+            </w:pPr>
+            <w:r>
+              <w:rPr>
+                <w:b w:val="1"/>
+                <w:sz w:val="20"/>
+                <w:szCs w:val="20"/>
+              </w:rPr>
+              <w:t xml:space="preserve">Function</w:t>
+            </w:r>
+          </w:p>
+        </w:tc>
+        <w:tc>
+          <w:tcPr>
+            <w:tcW w:w="6626" w:type="dxa"/>
+            <w:shd w:val="clear" w:color="auto" w:fill="D9D9D9"/>
+            <w:vAlign w:val="top"/>
+          </w:tcPr>
+          <w:p>
+            <w:pPr>
+              <w:spacing w:before="0" w:after="0" w:line="240" w:lineRule="auto"/>
+              <w:jc w:val="left"/>
+            </w:pPr>
+            <w:r>
+              <w:rPr>
+                <w:b w:val="1"/>
+                <w:sz w:val="20"/>
+                <w:szCs w:val="20"/>
+              </w:rPr>
+              <w:t xml:space="preserve">Units</w:t>
+            </w:r>
+          </w:p>
+        </w:tc>
+      </w:tr>
+      <w:tr>
+        <w:tc>
+          <w:tcPr>
+            <w:tcW w:w="2400" w:type="dxa"/>
+            <w:vAlign w:val="top"/>
+          </w:tcPr>
+          <w:p>
+            <w:pPr>
+              <w:spacing w:before="0" w:after="0" w:line="240" w:lineRule="auto"/>
+              <w:jc w:val="left"/>
+            </w:pPr>
+            <w:r>
+              <w:rPr>
+                <w:sz w:val="20"/>
+                <w:szCs w:val="20"/>
+              </w:rPr>
+              <w:t xml:space="preserve">Business and sales</w:t>
+            </w:r>
+          </w:p>
+        </w:tc>
+        <w:tc>
+          <w:tcPr>
+            <w:tcW w:w="6626" w:type="dxa"/>
+            <w:vAlign w:val="top"/>
+          </w:tcPr>
+          <w:p>
+            <w:pPr>
+              <w:spacing w:before="0" w:after="0" w:line="240" w:lineRule="auto"/>
+              <w:jc w:val="left"/>
+            </w:pPr>
+            <w:r>
+              <w:rPr>
+                <w:sz w:val="20"/>
+                <w:szCs w:val="20"/>
+              </w:rPr>
+              <w:t xml:space="preserve">Regional Micro Banking; Regional Consumer Banking; Regional SME Banking; Regional Funding &amp; Retail Transaction Banking; Regional Transaction Banking Department; Commercial Banking Center</w:t>
+            </w:r>
+          </w:p>
+        </w:tc>
+      </w:tr>
+      <w:tr>
+        <w:tc>
+          <w:tcPr>
+            <w:tcW w:w="2400" w:type="dxa"/>
+            <w:vAlign w:val="top"/>
+          </w:tcPr>
+          <w:p>
+            <w:pPr>
+              <w:spacing w:before="0" w:after="0" w:line="240" w:lineRule="auto"/>
+              <w:jc w:val="left"/>
+            </w:pPr>
+            <w:r>
+              <w:rPr>
+                <w:sz w:val="20"/>
+                <w:szCs w:val="20"/>
+              </w:rPr>
+              <w:t xml:space="preserve">Credit operations</w:t>
+            </w:r>
+          </w:p>
+        </w:tc>
+        <w:tc>
+          <w:tcPr>
+            <w:tcW w:w="6626" w:type="dxa"/>
+            <w:vAlign w:val="top"/>
+          </w:tcPr>
+          <w:p>
+            <w:pPr>
+              <w:spacing w:before="0" w:after="0" w:line="240" w:lineRule="auto"/>
+              <w:jc w:val="left"/>
+            </w:pPr>
+            <w:r>
+              <w:rPr>
+                <w:sz w:val="20"/>
+                <w:szCs w:val="20"/>
+              </w:rPr>
+              <w:t xml:space="preserve">Regional Retail Credit Operation Department; Regional Commercial Credit Operation Department; Regional Consumer Loan Factory Team</w:t>
+            </w:r>
+          </w:p>
+        </w:tc>
+      </w:tr>
+      <w:tr>
+        <w:tc>
+          <w:tcPr>
+            <w:tcW w:w="2400" w:type="dxa"/>
+            <w:vAlign w:val="top"/>
+          </w:tcPr>
+          <w:p>
+            <w:pPr>
+              <w:spacing w:before="0" w:after="0" w:line="240" w:lineRule="auto"/>
+              <w:jc w:val="left"/>
+            </w:pPr>
+            <w:r>
+              <w:rPr>
+                <w:sz w:val="20"/>
+                <w:szCs w:val="20"/>
+              </w:rPr>
+              <w:t xml:space="preserve">Risk, compliance, and legal</w:t>
+            </w:r>
+          </w:p>
+        </w:tc>
+        <w:tc>
+          <w:tcPr>
+            <w:tcW w:w="6626" w:type="dxa"/>
+            <w:vAlign w:val="top"/>
+          </w:tcPr>
+          <w:p>
+            <w:pPr>
+              <w:spacing w:before="0" w:after="0" w:line="240" w:lineRule="auto"/>
+              <w:jc w:val="left"/>
+            </w:pPr>
+            <w:r>
+              <w:rPr>
+                <w:sz w:val="20"/>
+                <w:szCs w:val="20"/>
+              </w:rPr>
+              <w:t xml:space="preserve">Regional Risk Management Department; Regional Operational Risk &amp; Compliance Team; Regional Operational Risk Team; Regional AML &amp; Compliance Team; Commercial Credit Risk; Regional Legal Team</w:t>
+            </w:r>
+          </w:p>
+        </w:tc>
+      </w:tr>
+      <w:tr>
+        <w:tc>
+          <w:tcPr>
+            <w:tcW w:w="2400" w:type="dxa"/>
+            <w:vAlign w:val="top"/>
+          </w:tcPr>
+          <w:p>
+            <w:pPr>
+              <w:spacing w:before="0" w:after="0" w:line="240" w:lineRule="auto"/>
+              <w:jc w:val="left"/>
+            </w:pPr>
+            <w:r>
+              <w:rPr>
+                <w:sz w:val="20"/>
+                <w:szCs w:val="20"/>
+              </w:rPr>
+              <w:t xml:space="preserve">Collection and recovery</w:t>
+            </w:r>
+          </w:p>
+        </w:tc>
+        <w:tc>
+          <w:tcPr>
+            <w:tcW w:w="6626" w:type="dxa"/>
+            <w:vAlign w:val="top"/>
+          </w:tcPr>
+          <w:p>
+            <w:pPr>
+              <w:spacing w:before="0" w:after="0" w:line="240" w:lineRule="auto"/>
+              <w:jc w:val="left"/>
+            </w:pPr>
+            <w:r>
+              <w:rPr>
+                <w:sz w:val="20"/>
+                <w:szCs w:val="20"/>
+              </w:rPr>
+              <w:t xml:space="preserve">Regional Retail Recovery Team; Regional Micro &amp; Consumer Collection Department; Regional SME Recovery Department; Regional Retail Collection &amp; Recovery Department</w:t>
+            </w:r>
+          </w:p>
+        </w:tc>
+      </w:tr>
+      <w:tr>
+        <w:tc>
+          <w:tcPr>
+            <w:tcW w:w="2400" w:type="dxa"/>
+            <w:vAlign w:val="top"/>
+          </w:tcPr>
+          <w:p>
+            <w:pPr>
+              <w:spacing w:before="0" w:after="0" w:line="240" w:lineRule="auto"/>
+              <w:jc w:val="left"/>
+            </w:pPr>
+            <w:r>
+              <w:rPr>
+                <w:sz w:val="20"/>
+                <w:szCs w:val="20"/>
+              </w:rPr>
+              <w:t xml:space="preserve">Support and operations</w:t>
+            </w:r>
+          </w:p>
+        </w:tc>
+        <w:tc>
+          <w:tcPr>
+            <w:tcW w:w="6626" w:type="dxa"/>
+            <w:vAlign w:val="top"/>
+          </w:tcPr>
+          <w:p>
+            <w:pPr>
+              <w:spacing w:before="0" w:after="0" w:line="240" w:lineRule="auto"/>
+              <w:jc w:val="left"/>
+            </w:pPr>
+            <w:r>
+              <w:rPr>
+                <w:sz w:val="20"/>
+                <w:szCs w:val="20"/>
+              </w:rPr>
+              <w:t xml:space="preserve">Regional Business Support; Regional Decision Support Team; Regional Strategy &amp; Finance; Operation, Service &amp; E-Channel Department; Information Technology Department</w:t>
+            </w:r>
+          </w:p>
+        </w:tc>
+      </w:tr>
+    </w:tbl>
+    <w:p>
+      <w:pPr>
+        <w:spacing w:before="0" w:after="60" w:line="240" w:lineRule="auto"/>
+        <w:jc w:val="both"/>
+      </w:pPr>
+    </w:p>
+    <w:p>
+      <w:pPr>
+        <w:spacing w:before="0" w:after="120" w:line="360" w:lineRule="auto"/>
+        <w:jc w:val="both"/>
+      </w:pPr>
+      <w:r>
+        <w:rPr>
+          <w:sz w:val="24"/>
+          <w:szCs w:val="24"/>
+        </w:rPr>
+        <w:t xml:space="preserve">My internship was split between two of these units. The first was the Information Technology Department, referred to in this report as the IT division. It looks after the regional office's IT devices, such as PCs, laptops, and printers, along with its servers, databases, and the internal applications and shared files that staff use every day. The second was the Regional Funding &amp; Retail Transaction Banking group, referred to in this report as the Retail Transaction Banking (RTB) division. It grows the region's funding and transaction banking business. Its products include Qlola, BRI's cash management platform for business customers, the BRIVA virtual account service, and current (giro) accounts and their programs, such as Giro Rewards and Edupay Growth. RTB also onboards business customers to Qlola and monitors how they use it, and prepares regular reports on these products for the region's branches.</w:t>
+      </w:r>
+    </w:p>
+    <w:p>
+      <w:pPr>
+        <w:spacing w:before="0" w:after="120" w:line="360" w:lineRule="auto"/>
+        <w:jc w:val="both"/>
+      </w:pPr>
+      <w:r>
+        <w:rPr>
+          <w:sz w:val="24"/>
+          <w:szCs w:val="24"/>
+        </w:rPr>
+        <w:t xml:space="preserve">Both divisions depend on accurate records and recurring reports. In practice, much of this work was still done by hand: device records in the IT division, and spreadsheet reports built from system extracts in the RTB division. Work like this is where an Information Systems student can contribute, and it shaped the tasks described in this report.</w:t>
       </w:r>
     </w:p>
     <w:p>
@@ -477,7 +808,7 @@
           <w:sz w:val="24"/>
           <w:szCs w:val="24"/>
         </w:rPr>
-        <w:t xml:space="preserve">To understand how a regional office of a state-owned bank works, in particular how the Information Technology (IT) division looks after the office's devices and internal systems, and how the Retail Transaction Banking (RTB) division serves business customers through products such as Qlola, current (giro) accounts, and BRIVA.</w:t>
+        <w:t xml:space="preserve">To understand how a regional office of a state-owned bank works, in particular how the IT division looks after the office's devices and internal systems, and how the RTB division serves business customers through products such as Qlola, current (giro) accounts, and BRIVA.</w:t>
       </w:r>
     </w:p>
     <w:p>
@@ -647,7 +978,7 @@
           <w:sz w:val="24"/>
           <w:szCs w:val="24"/>
         </w:rPr>
-        <w:t xml:space="preserve">The internship took place at Bank BRI Regional Office Malang, Menara BRI Malang, Jalan Laksamana Martadinata No. 80, Kelurahan Sukoharjo, Kecamatan Klojen, Kota Malang, East Java, from 5 June to 21 August 2026. It was split into two placements, one in each division, as shown in Table 1.1.</w:t>
+        <w:t xml:space="preserve">The internship took place at Bank BRI Regional Office Malang, Menara BRI Malang, Jalan Laksamana Martadinata No. 80, Kelurahan Sukoharjo, Kecamatan Klojen, Kota Malang, East Java, from 5 June to 21 August 2026. It was split into two placements, one in each division, as shown in Table 1.2.</w:t>
       </w:r>
     </w:p>
     <w:p>
@@ -662,7 +993,7 @@
           <w:sz w:val="20"/>
           <w:szCs w:val="20"/>
         </w:rPr>
-        <w:t xml:space="preserve">Table 1.1 Internship placements</w:t>
+        <w:t xml:space="preserve">Table 1.2 Internship placements</w:t>
       </w:r>
     </w:p>
     <w:tbl>
@@ -892,7 +1223,7 @@
           <w:sz w:val="24"/>
           <w:szCs w:val="24"/>
         </w:rPr>
-        <w:t xml:space="preserve">Table 1.2 lists the tasks I carried out in the IT division, as recorded on the internship completion form signed by my supervisor.</w:t>
+        <w:t xml:space="preserve">Table 1.3 lists the tasks I carried out in the IT division, as recorded on the internship completion form signed by my supervisor.</w:t>
       </w:r>
     </w:p>
     <w:p>
@@ -907,7 +1238,7 @@
           <w:sz w:val="20"/>
           <w:szCs w:val="20"/>
         </w:rPr>
-        <w:t xml:space="preserve">Table 1.2 Tasks carried out in the IT division</w:t>
+        <w:t xml:space="preserve">Table 1.3 Tasks carried out in the IT division</w:t>
       </w:r>
     </w:p>
     <w:tbl>
@@ -1237,7 +1568,7 @@
           <w:sz w:val="24"/>
           <w:szCs w:val="24"/>
         </w:rPr>
-        <w:t xml:space="preserve">Table 1.3 lists the tasks I carried out in the RTB division, as recorded on the internship completion form signed by my supervisor.</w:t>
+        <w:t xml:space="preserve">Table 1.4 lists the tasks I carried out in the RTB division, as recorded on the internship completion form signed by my supervisor.</w:t>
       </w:r>
     </w:p>
     <w:p>
@@ -1252,7 +1583,7 @@
           <w:sz w:val="20"/>
           <w:szCs w:val="20"/>
         </w:rPr>
-        <w:t xml:space="preserve">Table 1.3 Tasks carried out in the RTB division</w:t>
+        <w:t xml:space="preserve">Table 1.4 Tasks carried out in the RTB division</w:t>
       </w:r>
     </w:p>
     <w:tbl>

</xml_diff>

<commit_message>
Add other IT and RTB tasks to Chapters 3 and 4 and write the Chapter 6 conclusion.
Co-authored-by: Cursor <cursoragent@cursor.com>
</commit_message>
<xml_diff>
--- a/DRAFT Internship Report.docx
+++ b/DRAFT Internship Report.docx
@@ -2233,7 +2233,7 @@
           <w:sz w:val="24"/>
           <w:szCs w:val="24"/>
         </w:rPr>
-        <w:t xml:space="preserve">The two largest tasks were software projects: the inventory system website for the IT division (Perangkat IT) and the Excel Workflow Processor for the RTB division, referred to in this report as the Tongkat Gaib Excel tool. Chapter 3 describes these two projects, Chapter 4 analyses them, and Chapter 5 covers their technical design.</w:t>
+        <w:t xml:space="preserve">The two largest tasks were software projects: the inventory system website for the IT division (Perangkat IT) and the Excel Workflow Processor for the RTB division, referred to in this report as the Tongkat Gaib Excel tool. Chapter 3 describes all of these tasks by division, with the most detail on the two projects. Chapter 4 analyses them, and Chapter 5 covers the technical design of the two projects.</w:t>
       </w:r>
     </w:p>
     <w:p>
@@ -6159,7 +6159,7 @@
           <w:sz w:val="24"/>
           <w:szCs w:val="24"/>
         </w:rPr>
-        <w:t xml:space="preserve">My internship involved a range of tasks. This chapter covers two of them: software projects I worked on for two different divisions. They are grouped by the division each project served. Section 3.1 covers the IT asset management system built for the IT division, and Section 3.2 covers the Excel report automation tool built for the RTB division. The technical design of both systems is described in Chapter 5.</w:t>
+        <w:t>My internship involved a range of tasks in two divisions, and this chapter is organised by division. Section 3.1 covers the IT division and Section 3.2 covers the RTB division. Each section first describes the main software project I worked on for that division, the Perangkat IT asset management system and the Tongkat Gaib Excel report automation tool, and then summarises the other tasks I carried out there. The technical design of the two projects is described in Chapter 5.</w:t>
       </w:r>
     </w:p>
     <w:p>
@@ -6174,7 +6174,7 @@
           <w:sz w:val="24"/>
           <w:szCs w:val="24"/>
         </w:rPr>
-        <w:t xml:space="preserve">3.1 IT Division: Perangkat IT Asset Management System</w:t>
+        <w:t>3.1 IT Division</w:t>
       </w:r>
     </w:p>
     <w:p>
@@ -6190,7 +6190,7 @@
           <w:sz w:val="24"/>
           <w:szCs w:val="24"/>
         </w:rPr>
-        <w:t xml:space="preserve">3.1.1 Assignment Overview</w:t>
+        <w:t>3.1.1 Perangkat IT: Assignment Overview</w:t>
       </w:r>
     </w:p>
     <w:p>
@@ -6232,7 +6232,7 @@
           <w:sz w:val="24"/>
           <w:szCs w:val="24"/>
         </w:rPr>
-        <w:t xml:space="preserve">3.1.2 Activities</w:t>
+        <w:t>3.1.2 Perangkat IT: Activities</w:t>
       </w:r>
     </w:p>
     <w:p>
@@ -6260,7 +6260,7 @@
           <w:sz w:val="20"/>
           <w:szCs w:val="20"/>
         </w:rPr>
-        <w:t xml:space="preserve">Table 3.1 Activities carried out for the IT division</w:t>
+        <w:t>Table 3.1 Phases of the Perangkat IT project</w:t>
       </w:r>
     </w:p>
     <w:tbl>
@@ -6860,7 +6860,7 @@
           <w:sz w:val="24"/>
           <w:szCs w:val="24"/>
         </w:rPr>
-        <w:t xml:space="preserve">3.1.3 Tools Used</w:t>
+        <w:t>3.1.3 Perangkat IT: Tools Used</w:t>
       </w:r>
     </w:p>
     <w:p>
@@ -6874,6 +6874,140 @@
           <w:szCs w:val="24"/>
         </w:rPr>
         <w:t xml:space="preserve">React 18 and Vite for the user interface; Express 4 on Node.js for the API; PostgreSQL 18 for the database; Docker and Docker Compose for packaging; GitHub Actions for continuous integration; Vitest, Supertest, React Testing Library, and Playwright for automated testing; and Git and GitHub for version control.</w:t>
+      </w:r>
+    </w:p>
+    <w:p>
+      <w:pPr>
+        <w:keepNext w:val="1"/>
+        <w:spacing w:before="120" w:after="60" w:line="360" w:lineRule="auto"/>
+        <w:jc w:val="left"/>
+      </w:pPr>
+      <w:r>
+        <w:rPr>
+          <w:b w:val="1"/>
+          <w:i w:val="1"/>
+          <w:sz w:val="24"/>
+          <w:szCs w:val="24"/>
+        </w:rPr>
+        <w:t xml:space="preserve">3.1.4 Other Tasks</w:t>
+      </w:r>
+    </w:p>
+    <w:p>
+      <w:pPr>
+        <w:spacing w:before="0" w:after="120" w:line="360" w:lineRule="auto"/>
+        <w:jc w:val="both"/>
+      </w:pPr>
+      <w:r>
+        <w:rPr>
+          <w:sz w:val="24"/>
+          <w:szCs w:val="24"/>
+        </w:rPr>
+        <w:t xml:space="preserve">Alongside Perangkat IT, I carried out five other tasks for the IT division. They are listed in Table 1.3 and described briefly below.</w:t>
+      </w:r>
+    </w:p>
+    <w:p>
+      <w:pPr>
+        <w:spacing w:before="0" w:after="120" w:line="360" w:lineRule="auto"/>
+        <w:jc w:val="both"/>
+      </w:pPr>
+      <w:r>
+        <w:rPr>
+          <w:b w:val="1"/>
+          <w:sz w:val="24"/>
+          <w:szCs w:val="24"/>
+        </w:rPr>
+        <w:t xml:space="preserve">Organising document access in a spreadsheet. </w:t>
+      </w:r>
+      <w:r>
+        <w:rPr>
+          <w:sz w:val="24"/>
+          <w:szCs w:val="24"/>
+        </w:rPr>
+        <w:t xml:space="preserve">I organised a spreadsheet that the division uses to keep track of its documents, setting out which documents are available and who is allowed to access them. This gave staff one place to check whether a document exists and who can open it.</w:t>
+      </w:r>
+    </w:p>
+    <w:p>
+      <w:pPr>
+        <w:spacing w:before="0" w:after="120" w:line="360" w:lineRule="auto"/>
+        <w:jc w:val="both"/>
+      </w:pPr>
+      <w:r>
+        <w:rPr>
+          <w:b w:val="1"/>
+          <w:sz w:val="24"/>
+          <w:szCs w:val="24"/>
+        </w:rPr>
+        <w:t xml:space="preserve">Installing Ubuntu Server to deploy Perangkat IT. </w:t>
+      </w:r>
+      <w:r>
+        <w:rPr>
+          <w:sz w:val="24"/>
+          <w:szCs w:val="24"/>
+        </w:rPr>
+        <w:t xml:space="preserve">I installed Ubuntu Server and deployed the finished inventory system on it, using the Docker packaging prepared during the project, so the division could run Perangkat IT on its own server for internal use.</w:t>
+      </w:r>
+    </w:p>
+    <w:p>
+      <w:pPr>
+        <w:spacing w:before="0" w:after="120" w:line="360" w:lineRule="auto"/>
+        <w:jc w:val="both"/>
+      </w:pPr>
+      <w:r>
+        <w:rPr>
+          <w:b w:val="1"/>
+          <w:sz w:val="24"/>
+          <w:szCs w:val="24"/>
+        </w:rPr>
+        <w:t xml:space="preserve">Installing and managing phpMyAdmin. </w:t>
+      </w:r>
+      <w:r>
+        <w:rPr>
+          <w:sz w:val="24"/>
+          <w:szCs w:val="24"/>
+        </w:rPr>
+        <w:t xml:space="preserve">I installed phpMyAdmin, a web-based tool for administering MySQL and MariaDB databases, and used it to manage the division's database servers. It lets staff create and inspect databases, tables, and user accounts from a browser instead of the command line.</w:t>
+      </w:r>
+    </w:p>
+    <w:p>
+      <w:pPr>
+        <w:spacing w:before="0" w:after="120" w:line="360" w:lineRule="auto"/>
+        <w:jc w:val="both"/>
+      </w:pPr>
+      <w:r>
+        <w:rPr>
+          <w:b w:val="1"/>
+          <w:sz w:val="24"/>
+          <w:szCs w:val="24"/>
+        </w:rPr>
+        <w:t xml:space="preserve">Setting up the OpenClaw AI agent with Ollama. </w:t>
+      </w:r>
+      <w:r>
+        <w:rPr>
+          <w:sz w:val="24"/>
+          <w:szCs w:val="24"/>
+        </w:rPr>
+        <w:t xml:space="preserve">I installed OpenClaw, an open-source AI agent, and connected it to language models served locally through Ollama. Because the models run on the office's own machine, spreadsheet data does not have to be sent to an outside AI service.</w:t>
+      </w:r>
+    </w:p>
+    <w:p>
+      <w:pPr>
+        <w:spacing w:before="0" w:after="120" w:line="360" w:lineRule="auto"/>
+        <w:jc w:val="both"/>
+      </w:pPr>
+      <w:r>
+        <w:rPr>
+          <w:b w:val="1"/>
+          <w:sz w:val="24"/>
+          <w:szCs w:val="24"/>
+        </w:rPr>
+        <w:t xml:space="preserve">Processing spreadsheet data with OpenClaw. </w:t>
+      </w:r>
+      <w:r>
+        <w:rPr>
+          <w:sz w:val="24"/>
+          <w:szCs w:val="24"/>
+        </w:rPr>
+        <w:t xml:space="preserve">Once the agent was running, I used it to edit and process spreadsheet data by giving it instructions in plain language, and reviewed the results before they were used.</w:t>
       </w:r>
     </w:p>
     <w:p>
@@ -6888,7 +7022,7 @@
           <w:sz w:val="24"/>
           <w:szCs w:val="24"/>
         </w:rPr>
-        <w:t xml:space="preserve">3.2 RTB Division: Tongkat Gaib Excel Report Automation Tool</w:t>
+        <w:t>3.2 RTB Division</w:t>
       </w:r>
     </w:p>
     <w:p>
@@ -6904,7 +7038,7 @@
           <w:sz w:val="24"/>
           <w:szCs w:val="24"/>
         </w:rPr>
-        <w:t xml:space="preserve">3.2.1 Assignment Overview</w:t>
+        <w:t>3.2.1 Tongkat Gaib Excel: Assignment Overview</w:t>
       </w:r>
     </w:p>
     <w:p>
@@ -6946,7 +7080,7 @@
           <w:sz w:val="24"/>
           <w:szCs w:val="24"/>
         </w:rPr>
-        <w:t xml:space="preserve">3.2.2 Activities</w:t>
+        <w:t>3.2.2 Tongkat Gaib Excel: Activities</w:t>
       </w:r>
     </w:p>
     <w:p>
@@ -6974,7 +7108,7 @@
           <w:sz w:val="20"/>
           <w:szCs w:val="20"/>
         </w:rPr>
-        <w:t xml:space="preserve">Table 3.2 Activities carried out for the RTB division</w:t>
+        <w:t>Table 3.2 Milestones of the Tongkat Gaib Excel tool</w:t>
       </w:r>
     </w:p>
     <w:tbl>
@@ -7387,7 +7521,7 @@
           <w:sz w:val="24"/>
           <w:szCs w:val="24"/>
         </w:rPr>
-        <w:t xml:space="preserve">3.2.3 Tools Used</w:t>
+        <w:t>3.2.3 Tongkat Gaib Excel: Tools Used</w:t>
       </w:r>
     </w:p>
     <w:p>
@@ -7401,6 +7535,182 @@
           <w:szCs w:val="24"/>
         </w:rPr>
         <w:t xml:space="preserve">Python with pandas for data processing; openpyxl and xlrd for reading and writing Excel files; Tkinter for the desktop window; Typer for the command-line mode; Pydantic for configuration checks; pytest for automated testing; PyInstaller to build the standalone Windows program; and Git and GitHub for version control.</w:t>
+      </w:r>
+    </w:p>
+    <w:p>
+      <w:pPr>
+        <w:keepNext w:val="1"/>
+        <w:spacing w:before="120" w:after="60" w:line="360" w:lineRule="auto"/>
+        <w:jc w:val="left"/>
+      </w:pPr>
+      <w:r>
+        <w:rPr>
+          <w:b w:val="1"/>
+          <w:i w:val="1"/>
+          <w:sz w:val="24"/>
+          <w:szCs w:val="24"/>
+        </w:rPr>
+        <w:t xml:space="preserve">3.2.4 Other Tasks</w:t>
+      </w:r>
+    </w:p>
+    <w:p>
+      <w:pPr>
+        <w:spacing w:before="0" w:after="120" w:line="360" w:lineRule="auto"/>
+        <w:jc w:val="both"/>
+      </w:pPr>
+      <w:r>
+        <w:rPr>
+          <w:sz w:val="24"/>
+          <w:szCs w:val="24"/>
+        </w:rPr>
+        <w:t xml:space="preserve">Besides building the tool, I carried out the RTB division's day-to-day tasks listed in Table 1.4. They are grouped by type below.</w:t>
+      </w:r>
+    </w:p>
+    <w:p>
+      <w:pPr>
+        <w:spacing w:before="0" w:after="120" w:line="360" w:lineRule="auto"/>
+        <w:jc w:val="both"/>
+      </w:pPr>
+      <w:r>
+        <w:rPr>
+          <w:b w:val="1"/>
+          <w:sz w:val="24"/>
+          <w:szCs w:val="24"/>
+        </w:rPr>
+        <w:t xml:space="preserve">Producing the Qlola reports. </w:t>
+      </w:r>
+      <w:r>
+        <w:rPr>
+          <w:sz w:val="24"/>
+          <w:szCs w:val="24"/>
+        </w:rPr>
+        <w:t xml:space="preserve">I prepared the division's Qlola reports (Static Data Report, Accumulated Summary Report, Monthly Summary Report, BG Portal Details, and TF Volume Details) using Excel and, once it was ready, the Tongkat Gaib Excel tool.</w:t>
+      </w:r>
+    </w:p>
+    <w:p>
+      <w:pPr>
+        <w:spacing w:before="0" w:after="120" w:line="360" w:lineRule="auto"/>
+        <w:jc w:val="both"/>
+      </w:pPr>
+      <w:r>
+        <w:rPr>
+          <w:b w:val="1"/>
+          <w:sz w:val="24"/>
+          <w:szCs w:val="24"/>
+        </w:rPr>
+        <w:t xml:space="preserve">Mapping Qlola users. </w:t>
+      </w:r>
+      <w:r>
+        <w:rPr>
+          <w:sz w:val="24"/>
+          <w:szCs w:val="24"/>
+        </w:rPr>
+        <w:t xml:space="preserve">I mapped the customers currently registered in Qlola and the transaction frequency and volume of active users as of June 2026, by branch. An active user is one with at least five transactions in the period. The same count later became the Time Series Active User Qlola report in the Tongkat Gaib Excel tool.</w:t>
+      </w:r>
+    </w:p>
+    <w:p>
+      <w:pPr>
+        <w:spacing w:before="0" w:after="120" w:line="360" w:lineRule="auto"/>
+        <w:jc w:val="both"/>
+      </w:pPr>
+      <w:r>
+        <w:rPr>
+          <w:b w:val="1"/>
+          <w:sz w:val="24"/>
+          <w:szCs w:val="24"/>
+        </w:rPr>
+        <w:t xml:space="preserve">Customer and current account data. </w:t>
+      </w:r>
+      <w:r>
+        <w:rPr>
+          <w:sz w:val="24"/>
+          <w:szCs w:val="24"/>
+        </w:rPr>
+        <w:t xml:space="preserve">I classified Malang Regional Office customers into standard group categories in the Excel file used for BRI's nationwide customer list, so they can be compared with customers from other regions. I also updated the customer pipeline recapitulation for current (giro) accounts in the regional office, and the TSPM current account list report as of 30 June 2026. Updating the TSPM list meant looking up each account's balance by hand with Ctrl+F, which later led to the Report Giro feature of the Tongkat Gaib Excel tool.</w:t>
+      </w:r>
+    </w:p>
+    <w:p>
+      <w:pPr>
+        <w:spacing w:before="0" w:after="120" w:line="360" w:lineRule="auto"/>
+        <w:jc w:val="both"/>
+      </w:pPr>
+      <w:r>
+        <w:rPr>
+          <w:b w:val="1"/>
+          <w:sz w:val="24"/>
+          <w:szCs w:val="24"/>
+        </w:rPr>
+        <w:t xml:space="preserve">Qlola onboarding and the new Qlola version. </w:t>
+      </w:r>
+      <w:r>
+        <w:rPr>
+          <w:sz w:val="24"/>
+          <w:szCs w:val="24"/>
+        </w:rPr>
+        <w:t xml:space="preserve">I registered a new business in Qlola together with its Admin and SysAdmin users. I also attended a company-wide Microsoft Teams meeting on the Qlola Token app update and the move to a new Qlola login URL, and studied the New Qlola by BRI guide and the Online Update Administrator guide to learn how the new version works.</w:t>
+      </w:r>
+    </w:p>
+    <w:p>
+      <w:pPr>
+        <w:spacing w:before="0" w:after="120" w:line="360" w:lineRule="auto"/>
+        <w:jc w:val="both"/>
+      </w:pPr>
+      <w:r>
+        <w:rPr>
+          <w:b w:val="1"/>
+          <w:sz w:val="24"/>
+          <w:szCs w:val="24"/>
+        </w:rPr>
+        <w:t xml:space="preserve">Customer meetings and correspondence. </w:t>
+      </w:r>
+      <w:r>
+        <w:rPr>
+          <w:sz w:val="24"/>
+          <w:szCs w:val="24"/>
+        </w:rPr>
+        <w:t xml:space="preserve">I attended a Microsoft Teams meeting with a customer, a ministry work unit, about the BRIVA API and New Qlola by BRI. I also drafted a letter of approval in principle in BRI's Digital Office (DiO) system to follow up on a customer's request for lower BRIVA fees.</w:t>
+      </w:r>
+    </w:p>
+    <w:p>
+      <w:pPr>
+        <w:spacing w:before="0" w:after="120" w:line="360" w:lineRule="auto"/>
+        <w:jc w:val="both"/>
+      </w:pPr>
+      <w:r>
+        <w:rPr>
+          <w:b w:val="1"/>
+          <w:sz w:val="24"/>
+          <w:szCs w:val="24"/>
+        </w:rPr>
+        <w:t xml:space="preserve">Marketing materials. </w:t>
+      </w:r>
+      <w:r>
+        <w:rPr>
+          <w:sz w:val="24"/>
+          <w:szCs w:val="24"/>
+        </w:rPr>
+        <w:t xml:space="preserve">I created digital infographics for customers and the marketing team that explain how the Giro Rewards Program and the Edupay Growth Program work and what customers gain from them.</w:t>
+      </w:r>
+    </w:p>
+    <w:p>
+      <w:pPr>
+        <w:spacing w:before="0" w:after="120" w:line="360" w:lineRule="auto"/>
+        <w:jc w:val="both"/>
+      </w:pPr>
+      <w:r>
+        <w:rPr>
+          <w:b w:val="1"/>
+          <w:sz w:val="24"/>
+          <w:szCs w:val="24"/>
+        </w:rPr>
+        <w:t xml:space="preserve">Maintenance support. </w:t>
+      </w:r>
+      <w:r>
+        <w:rPr>
+          <w:sz w:val="24"/>
+          <w:szCs w:val="24"/>
+        </w:rPr>
+        <w:t xml:space="preserve">I printed maintenance reports for the regional office and helped with other maintenance work in the division.</w:t>
       </w:r>
     </w:p>
     <w:p>
@@ -7445,7 +7755,7 @@
           <w:sz w:val="24"/>
           <w:szCs w:val="24"/>
         </w:rPr>
-        <w:t xml:space="preserve">This chapter reviews the two projects described in Chapter 3. Section 4.1 sets out what I learned from each one, along with its benefits, advantages, disadvantages, and recommendations. Section 4.2 compares the work with theory from lectures, and Section 4.3 gives suggestions for improvement.</w:t>
+        <w:t>This chapter reviews the activities described in Chapter 3. Section 4.1 sets out what I learned from each one, along with its benefits, advantages, disadvantages, and recommendations, covering both the two software projects and the other tasks in each division. Section 4.2 compares the work with theory from lectures, and Section 4.3 gives suggestions for improvement.</w:t>
       </w:r>
     </w:p>
     <w:p>
@@ -7597,7 +7907,7 @@
           <w:sz w:val="24"/>
           <w:szCs w:val="24"/>
         </w:rPr>
-        <w:t xml:space="preserve">4.1.2 RTB Division: Tongkat Gaib Excel Report Automation Tool</w:t>
+        <w:t xml:space="preserve">4.1.2 IT Division: Other Tasks</w:t>
       </w:r>
     </w:p>
     <w:p>
@@ -7618,6 +7928,127 @@
           <w:sz w:val="24"/>
           <w:szCs w:val="24"/>
         </w:rPr>
+        <w:t xml:space="preserve">Building an application is only part of the job; it also has to run somewhere. Installing Ubuntu Server and phpMyAdmin taught me the operations side: setting up a server, managing database services, and keeping administrator tools under control. Setting up OpenClaw showed me that a locally hosted AI agent can take over repetitive spreadsheet edits, but that a person still has to check its output. Organising document access reminded me that access control applies to shared files as much as to applications.</w:t>
+      </w:r>
+    </w:p>
+    <w:p>
+      <w:pPr>
+        <w:spacing w:before="0" w:after="120" w:line="360" w:lineRule="auto"/>
+        <w:jc w:val="both"/>
+      </w:pPr>
+      <w:r>
+        <w:rPr>
+          <w:b w:val="1"/>
+          <w:sz w:val="24"/>
+          <w:szCs w:val="24"/>
+        </w:rPr>
+        <w:t xml:space="preserve">Benefits. </w:t>
+      </w:r>
+      <w:r>
+        <w:rPr>
+          <w:sz w:val="24"/>
+          <w:szCs w:val="24"/>
+        </w:rPr>
+        <w:t xml:space="preserve">Perangkat IT runs on the division's own server, the database servers can be managed from a browser, and the division has a working local AI agent it can use for spreadsheet work without sending data outside the office.</w:t>
+      </w:r>
+    </w:p>
+    <w:p>
+      <w:pPr>
+        <w:spacing w:before="0" w:after="120" w:line="360" w:lineRule="auto"/>
+        <w:jc w:val="both"/>
+      </w:pPr>
+      <w:r>
+        <w:rPr>
+          <w:b w:val="1"/>
+          <w:sz w:val="24"/>
+          <w:szCs w:val="24"/>
+        </w:rPr>
+        <w:t xml:space="preserve">Advantages. </w:t>
+      </w:r>
+      <w:r>
+        <w:rPr>
+          <w:sz w:val="24"/>
+          <w:szCs w:val="24"/>
+        </w:rPr>
+        <w:t xml:space="preserve">All of the tools used are free and open source, so there are no licence costs. Running the AI models locally keeps the data in-house.</w:t>
+      </w:r>
+    </w:p>
+    <w:p>
+      <w:pPr>
+        <w:spacing w:before="0" w:after="120" w:line="360" w:lineRule="auto"/>
+        <w:jc w:val="both"/>
+      </w:pPr>
+      <w:r>
+        <w:rPr>
+          <w:b w:val="1"/>
+          <w:sz w:val="24"/>
+          <w:szCs w:val="24"/>
+        </w:rPr>
+        <w:t xml:space="preserve">Disadvantages. </w:t>
+      </w:r>
+      <w:r>
+        <w:rPr>
+          <w:sz w:val="24"/>
+          <w:szCs w:val="24"/>
+        </w:rPr>
+        <w:t xml:space="preserve">Language models running on ordinary office hardware are slower and less accurate than large cloud models, so the agent can misread instructions or data. phpMyAdmin is a common target for attacks if it can be reached from outside, and the server needs regular updates that someone has to own.</w:t>
+      </w:r>
+    </w:p>
+    <w:p>
+      <w:pPr>
+        <w:spacing w:before="0" w:after="120" w:line="360" w:lineRule="auto"/>
+        <w:jc w:val="both"/>
+      </w:pPr>
+      <w:r>
+        <w:rPr>
+          <w:b w:val="1"/>
+          <w:sz w:val="24"/>
+          <w:szCs w:val="24"/>
+        </w:rPr>
+        <w:t xml:space="preserve">Recommendations. </w:t>
+      </w:r>
+      <w:r>
+        <w:rPr>
+          <w:sz w:val="24"/>
+          <w:szCs w:val="24"/>
+        </w:rPr>
+        <w:t xml:space="preserve">Limit phpMyAdmin to the internal network with strong passwords, update the server on a schedule, use the AI agent for drafts that a person reviews, and review document access in the spreadsheet whenever staff join or leave.</w:t>
+      </w:r>
+    </w:p>
+    <w:p>
+      <w:pPr>
+        <w:keepNext w:val="1"/>
+        <w:spacing w:before="120" w:after="60" w:line="360" w:lineRule="auto"/>
+        <w:jc w:val="left"/>
+      </w:pPr>
+      <w:r>
+        <w:rPr>
+          <w:b w:val="1"/>
+          <w:i w:val="1"/>
+          <w:sz w:val="24"/>
+          <w:szCs w:val="24"/>
+        </w:rPr>
+        <w:t>4.1.3 RTB Division: Tongkat Gaib Excel Report Automation Tool</w:t>
+      </w:r>
+    </w:p>
+    <w:p>
+      <w:pPr>
+        <w:spacing w:before="0" w:after="120" w:line="360" w:lineRule="auto"/>
+        <w:jc w:val="both"/>
+      </w:pPr>
+      <w:r>
+        <w:rPr>
+          <w:b w:val="1"/>
+          <w:sz w:val="24"/>
+          <w:szCs w:val="24"/>
+        </w:rPr>
+        <w:t xml:space="preserve">Understanding and insight gained. </w:t>
+      </w:r>
+      <w:r>
+        <w:rPr>
+          <w:sz w:val="24"/>
+          <w:szCs w:val="24"/>
+        </w:rPr>
         <w:t xml:space="preserve">To automate a business process, you first have to understand it exactly. The real requirements were not written down anywhere; they lived in the clicks staff made in Excel. Details such as which segment is unticked in a pivot, which rounding the dashboard expects, or which branch comes first only came out by watching staff work and comparing my output to theirs. I also learned that the people who use a tool decide whether it succeeds. A correct report is not enough if the filters are confusing or an error message cannot be understood.</w:t>
       </w:r>
     </w:p>
@@ -7703,6 +8134,127 @@
           <w:szCs w:val="24"/>
         </w:rPr>
         <w:t xml:space="preserve">Move the branch order and filter values into an editable configuration file, keep a folder of sample extracts to re-test the tool whenever the source format changes, and hand the source code and documentation over to a named person in the division.</w:t>
+      </w:r>
+    </w:p>
+    <w:p>
+      <w:pPr>
+        <w:keepNext w:val="1"/>
+        <w:spacing w:before="120" w:after="60" w:line="360" w:lineRule="auto"/>
+        <w:jc w:val="left"/>
+      </w:pPr>
+      <w:r>
+        <w:rPr>
+          <w:b w:val="1"/>
+          <w:i w:val="1"/>
+          <w:sz w:val="24"/>
+          <w:szCs w:val="24"/>
+        </w:rPr>
+        <w:t xml:space="preserve">4.1.4 RTB Division: Other Tasks</w:t>
+      </w:r>
+    </w:p>
+    <w:p>
+      <w:pPr>
+        <w:spacing w:before="0" w:after="120" w:line="360" w:lineRule="auto"/>
+        <w:jc w:val="both"/>
+      </w:pPr>
+      <w:r>
+        <w:rPr>
+          <w:b w:val="1"/>
+          <w:sz w:val="24"/>
+          <w:szCs w:val="24"/>
+        </w:rPr>
+        <w:t xml:space="preserve">Understanding and insight gained. </w:t>
+      </w:r>
+      <w:r>
+        <w:rPr>
+          <w:sz w:val="24"/>
+          <w:szCs w:val="24"/>
+        </w:rPr>
+        <w:t xml:space="preserve">These tasks showed me how the RTB division's products fit together: Qlola for business customers' cash management, BRIVA for collecting payments, and current accounts with their promotional programs. I also saw that banking work runs on formal processes, such as approval letters through DiO and structured onboarding of customer administrators, and that much of the division's data work is still done by hand in spreadsheets.</w:t>
+      </w:r>
+    </w:p>
+    <w:p>
+      <w:pPr>
+        <w:spacing w:before="0" w:after="120" w:line="360" w:lineRule="auto"/>
+        <w:jc w:val="both"/>
+      </w:pPr>
+      <w:r>
+        <w:rPr>
+          <w:b w:val="1"/>
+          <w:sz w:val="24"/>
+          <w:szCs w:val="24"/>
+        </w:rPr>
+        <w:t xml:space="preserve">Benefits. </w:t>
+      </w:r>
+      <w:r>
+        <w:rPr>
+          <w:sz w:val="24"/>
+          <w:szCs w:val="24"/>
+        </w:rPr>
+        <w:t xml:space="preserve">The division got its regular Qlola reports and current account updates, standardised group categories for Malang customers in the nationwide customer list, and infographics the marketing team can share with customers.</w:t>
+      </w:r>
+    </w:p>
+    <w:p>
+      <w:pPr>
+        <w:spacing w:before="0" w:after="120" w:line="360" w:lineRule="auto"/>
+        <w:jc w:val="both"/>
+      </w:pPr>
+      <w:r>
+        <w:rPr>
+          <w:b w:val="1"/>
+          <w:sz w:val="24"/>
+          <w:szCs w:val="24"/>
+        </w:rPr>
+        <w:t xml:space="preserve">Advantages. </w:t>
+      </w:r>
+      <w:r>
+        <w:rPr>
+          <w:sz w:val="24"/>
+          <w:szCs w:val="24"/>
+        </w:rPr>
+        <w:t xml:space="preserve">Doing the manual work myself showed exactly which tasks were worth automating. The TSPM balance lookup and the active user mapping both became reports in the Tongkat Gaib Excel tool.</w:t>
+      </w:r>
+    </w:p>
+    <w:p>
+      <w:pPr>
+        <w:spacing w:before="0" w:after="120" w:line="360" w:lineRule="auto"/>
+        <w:jc w:val="both"/>
+      </w:pPr>
+      <w:r>
+        <w:rPr>
+          <w:b w:val="1"/>
+          <w:sz w:val="24"/>
+          <w:szCs w:val="24"/>
+        </w:rPr>
+        <w:t xml:space="preserve">Disadvantages. </w:t>
+      </w:r>
+      <w:r>
+        <w:rPr>
+          <w:sz w:val="24"/>
+          <w:szCs w:val="24"/>
+        </w:rPr>
+        <w:t xml:space="preserve">Much of the work depends on manual spreadsheet steps, which are slow and easy to get wrong. Knowledge about the new Qlola version is spread across PDF guides and meetings, which makes it harder for new staff to learn.</w:t>
+      </w:r>
+    </w:p>
+    <w:p>
+      <w:pPr>
+        <w:spacing w:before="0" w:after="120" w:line="360" w:lineRule="auto"/>
+        <w:jc w:val="both"/>
+      </w:pPr>
+      <w:r>
+        <w:rPr>
+          <w:b w:val="1"/>
+          <w:sz w:val="24"/>
+          <w:szCs w:val="24"/>
+        </w:rPr>
+        <w:t xml:space="preserve">Recommendations. </w:t>
+      </w:r>
+      <w:r>
+        <w:rPr>
+          <w:sz w:val="24"/>
+          <w:szCs w:val="24"/>
+        </w:rPr>
+        <w:t xml:space="preserve">Keep one reference list of standard customer group categories, automate other recurring reports in the same way as the giro and active user reports, and prepare a short internal guide to the new Qlola for staff who help customers.</w:t>
       </w:r>
     </w:p>
     <w:p>
@@ -7844,6 +8396,69 @@
           <w:szCs w:val="24"/>
         </w:rPr>
         <w:t xml:space="preserve">Usability heuristics such as "help users recognise, diagnose, and recover from errors", "visibility of system status", and "recognition rather than recall" shaped the later releases of the Excel tool. Error popups now say what happened and what to do next, every report states which filters were applied, and each filter box lists the values it accepts instead of expecting staff to remember them.</w:t>
+      </w:r>
+    </w:p>
+    <w:p>
+      <w:pPr>
+        <w:spacing w:before="0" w:after="120" w:line="360" w:lineRule="auto"/>
+        <w:jc w:val="both"/>
+      </w:pPr>
+      <w:r>
+        <w:rPr>
+          <w:b w:val="1"/>
+          <w:sz w:val="24"/>
+          <w:szCs w:val="24"/>
+        </w:rPr>
+        <w:t xml:space="preserve">Data management. </w:t>
+      </w:r>
+      <w:r>
+        <w:rPr>
+          <w:sz w:val="24"/>
+          <w:szCs w:val="24"/>
+        </w:rPr>
+        <w:t xml:space="preserve">Lectures on data management stress data quality and consistent master data. Classifying Malang customers into standard group categories applied this directly: until every region uses the same categories, a nationwide customer list cannot be compared or summarised reliably. Mapping Qlola active users was a small exercise in descriptive analytics, turning raw transaction counts into a picture of how customers use the product.</w:t>
+      </w:r>
+    </w:p>
+    <w:p>
+      <w:pPr>
+        <w:spacing w:before="0" w:after="120" w:line="360" w:lineRule="auto"/>
+        <w:jc w:val="both"/>
+      </w:pPr>
+      <w:r>
+        <w:rPr>
+          <w:b w:val="1"/>
+          <w:sz w:val="24"/>
+          <w:szCs w:val="24"/>
+        </w:rPr>
+        <w:t xml:space="preserve">IT infrastructure and administration. </w:t>
+      </w:r>
+      <w:r>
+        <w:rPr>
+          <w:sz w:val="24"/>
+          <w:szCs w:val="24"/>
+        </w:rPr>
+        <w:t xml:space="preserve">Installing Ubuntu Server, deploying Perangkat IT, and managing database servers through phpMyAdmin put operating systems and database administration coursework into practice, including user permissions, service configuration, and keeping administrator tools away from unauthorised users.</w:t>
+      </w:r>
+    </w:p>
+    <w:p>
+      <w:pPr>
+        <w:spacing w:before="0" w:after="120" w:line="360" w:lineRule="auto"/>
+        <w:jc w:val="both"/>
+      </w:pPr>
+      <w:r>
+        <w:rPr>
+          <w:b w:val="1"/>
+          <w:sz w:val="24"/>
+          <w:szCs w:val="24"/>
+        </w:rPr>
+        <w:t xml:space="preserve">Business process improvement. </w:t>
+      </w:r>
+      <w:r>
+        <w:rPr>
+          <w:sz w:val="24"/>
+          <w:szCs w:val="24"/>
+        </w:rPr>
+        <w:t xml:space="preserve">Business process courses teach that a process should be understood before it is automated. Doing the TSPM balance updates and the active user mapping by hand first is what made it possible to automate them correctly later.</w:t>
       </w:r>
     </w:p>
     <w:p>
@@ -7948,6 +8563,40 @@
     </w:p>
     <w:p>
       <w:pPr>
+        <w:numPr>
+          <w:ilvl w:val="0"/>
+          <w:numId w:val="5"/>
+        </w:numPr>
+        <w:spacing w:before="0" w:after="60" w:line="360" w:lineRule="auto"/>
+        <w:jc w:val="both"/>
+      </w:pPr>
+      <w:r>
+        <w:rPr>
+          <w:sz w:val="24"/>
+          <w:szCs w:val="24"/>
+        </w:rPr>
+        <w:t xml:space="preserve">Restrict phpMyAdmin to the internal network and keep the Ubuntu server on a regular update schedule.</w:t>
+      </w:r>
+    </w:p>
+    <w:p>
+      <w:pPr>
+        <w:numPr>
+          <w:ilvl w:val="0"/>
+          <w:numId w:val="5"/>
+        </w:numPr>
+        <w:spacing w:before="0" w:after="60" w:line="360" w:lineRule="auto"/>
+        <w:jc w:val="both"/>
+      </w:pPr>
+      <w:r>
+        <w:rPr>
+          <w:sz w:val="24"/>
+          <w:szCs w:val="24"/>
+        </w:rPr>
+        <w:t xml:space="preserve">Use the OpenClaw agent for first drafts of spreadsheet work, and have staff check its output before it is used.</w:t>
+      </w:r>
+    </w:p>
+    <w:p>
+      <w:pPr>
         <w:spacing w:before="0" w:after="120" w:line="360" w:lineRule="auto"/>
         <w:jc w:val="both"/>
       </w:pPr>
@@ -8008,6 +8657,40 @@
           <w:szCs w:val="24"/>
         </w:rPr>
         <w:t xml:space="preserve">Assign a maintainer and keep the sample extracts and automated tests with the tool, so future changes can be checked against known results.</w:t>
+      </w:r>
+    </w:p>
+    <w:p>
+      <w:pPr>
+        <w:numPr>
+          <w:ilvl w:val="0"/>
+          <w:numId w:val="5"/>
+        </w:numPr>
+        <w:spacing w:before="0" w:after="60" w:line="360" w:lineRule="auto"/>
+        <w:jc w:val="both"/>
+      </w:pPr>
+      <w:r>
+        <w:rPr>
+          <w:sz w:val="24"/>
+          <w:szCs w:val="24"/>
+        </w:rPr>
+        <w:t xml:space="preserve">Keep a single reference list of customer group categories so the nationwide customer list stays consistent.</w:t>
+      </w:r>
+    </w:p>
+    <w:p>
+      <w:pPr>
+        <w:numPr>
+          <w:ilvl w:val="0"/>
+          <w:numId w:val="5"/>
+        </w:numPr>
+        <w:spacing w:before="0" w:after="60" w:line="360" w:lineRule="auto"/>
+        <w:jc w:val="both"/>
+      </w:pPr>
+      <w:r>
+        <w:rPr>
+          <w:sz w:val="24"/>
+          <w:szCs w:val="24"/>
+        </w:rPr>
+        <w:t xml:space="preserve">Prepare a short internal guide to the new Qlola version for staff who onboard and support business customers.</w:t>
       </w:r>
     </w:p>
     <w:p>
@@ -11071,6 +11754,84 @@
         </w:rPr>
       </w:r>
     </w:p>
+    <w:p>
+      <w:pPr>
+        <w:spacing w:before="0" w:after="120" w:line="360" w:lineRule="auto"/>
+        <w:jc w:val="both"/>
+      </w:pPr>
+      <w:r>
+        <w:rPr>
+          <w:sz w:val="24"/>
+          <w:szCs w:val="24"/>
+        </w:rPr>
+        <w:t xml:space="preserve">I carried out my internship at Bank BRI Regional Office Malang from 5 June to 21 August 2026, first in the IT division (5 June to 7 July) and then in the RTB division (8 July to 21 August). Over this period I completed six tasks for the IT division and fourteen for the RTB division, including one major software project in each.</w:t>
+      </w:r>
+    </w:p>
+    <w:p>
+      <w:pPr>
+        <w:spacing w:before="0" w:after="120" w:line="360" w:lineRule="auto"/>
+        <w:jc w:val="both"/>
+      </w:pPr>
+      <w:r>
+        <w:rPr>
+          <w:sz w:val="24"/>
+          <w:szCs w:val="24"/>
+        </w:rPr>
+        <w:t xml:space="preserve">In the IT division, I made the Perangkat IT asset management system secure and dependable enough for internal use. Login, data access, and document downloads are now protected, ordinary employees see only their own devices, about 180 automated tests check every change, and administrators can back up the data from within the application. I then deployed the system on an Ubuntu server, set up phpMyAdmin for the division's database servers, and set up a locally hosted AI agent (OpenClaw with Ollama) for spreadsheet work.</w:t>
+      </w:r>
+    </w:p>
+    <w:p>
+      <w:pPr>
+        <w:spacing w:before="0" w:after="120" w:line="360" w:lineRule="auto"/>
+        <w:jc w:val="both"/>
+      </w:pPr>
+      <w:r>
+        <w:rPr>
+          <w:sz w:val="24"/>
+          <w:szCs w:val="24"/>
+        </w:rPr>
+        <w:t xml:space="preserve">In the RTB division, I built the Tongkat Gaib Excel tool, which produces seven recurring reports from the original system extracts in a single run each, with results that match the manual method. Alongside it I prepared Qlola reports, mapped Qlola active users, standardised customer group categories, updated current account data, registered a new business in Qlola, drafted a DiO letter, and created infographics for the marketing team.</w:t>
+      </w:r>
+    </w:p>
+    <w:p>
+      <w:pPr>
+        <w:spacing w:before="0" w:after="120" w:line="360" w:lineRule="auto"/>
+        <w:jc w:val="both"/>
+      </w:pPr>
+      <w:r>
+        <w:rPr>
+          <w:sz w:val="24"/>
+          <w:szCs w:val="24"/>
+        </w:rPr>
+        <w:t xml:space="preserve">The internship met the objectives set out in Section 1.2. I applied systems analysis, web development, database, and data processing skills to real problems, learned how a regional office and its IT and RTB divisions work, delivered two working software systems, and practised working with supervisors, staff, and customers. Both supervisors confirmed on the internship completion forms that the tasks were completed, noting that I adapted well to the company's workflows, solved most problems on my own, and finished work quickly and accurately, often before the deadline.</w:t>
+      </w:r>
+    </w:p>
+    <w:p>
+      <w:pPr>
+        <w:spacing w:before="0" w:after="120" w:line="360" w:lineRule="auto"/>
+        <w:jc w:val="both"/>
+      </w:pPr>
+      <w:r>
+        <w:rPr>
+          <w:sz w:val="24"/>
+          <w:szCs w:val="24"/>
+        </w:rPr>
+        <w:t xml:space="preserve">The main lesson I take from the internship is that useful software starts with understanding how people actually work. Both projects succeeded because I first learned the existing process, from the manual Excel steps in the RTB division to the security gaps in the IT division's application, and then improved it step by step with feedback from the people who use it.</w:t>
+      </w:r>
+    </w:p>
+    <w:p>
+      <w:pPr>
+        <w:spacing w:before="0" w:after="120" w:line="360" w:lineRule="auto"/>
+        <w:jc w:val="both"/>
+      </w:pPr>
+      <w:r>
+        <w:rPr>
+          <w:sz w:val="24"/>
+          <w:szCs w:val="24"/>
+        </w:rPr>
+        <w:t xml:space="preserve">For both systems to stay useful after my internship, each division should name a maintainer, keep the documentation and automated tests with the code, and complete the remaining steps described in Section 4.3.</w:t>
+      </w:r>
+    </w:p>
     <w:sectPr>
       <w:type w:val="nextPage"/>
       <w:pgSz w:h="16838" w:w="11906" w:orient="portrait"/>
@@ -11237,6 +11998,21 @@
       </w:rPr>
     </w:lvl>
   </w:abstractNum>
+  <w:abstractNum w:abstractNumId="5">
+    <w:multiLevelType w:val="singleLevel"/>
+    <w:lvl w:ilvl="0">
+      <w:start w:val="1"/>
+      <w:numFmt w:val="bullet"/>
+      <w:lvlText w:val="•"/>
+      <w:lvlJc w:val="left"/>
+      <w:pPr>
+        <w:ind w:left="720" w:hanging="360"/>
+      </w:pPr>
+      <w:rPr>
+        <w:rFonts w:ascii="Calibri" w:hAnsi="Calibri" w:cs="Calibri"/>
+      </w:rPr>
+    </w:lvl>
+  </w:abstractNum>
   <w:num w:numId="1">
     <w:abstractNumId w:val="1"/>
   </w:num>
@@ -11248,6 +12024,9 @@
   </w:num>
   <w:num w:numId="4">
     <w:abstractNumId w:val="4"/>
+  </w:num>
+  <w:num w:numId="5">
+    <w:abstractNumId w:val="5"/>
   </w:num>
 </w:numbering>
 </file>

</xml_diff>